<commit_message>
dist: rebuild thesis references APA7 docx (v2.9 — 5 WB working papers)
04_references_apa7.docx was 47 commits stale. Source thesis/04_references_apa7.md
updated in b7fec9f (v2.9: Section T with 5 WB working papers: WPS11352,
WPS11354, WPS7460, WPS11279, WPS11350; Mahler disambiguation note).

https://claude.ai/code/session_01GMFmEtt6FYiJ4MKzBNCLqb
</commit_message>
<xml_diff>
--- a/dist/luan_an/04_references_apa7.docx
+++ b/dist/luan_an/04_references_apa7.docx
@@ -2,7 +2,7 @@
 <file path=word/document.xml><?xml version="1.0" encoding="utf-8"?>
 <w:document xmlns:w="http://schemas.openxmlformats.org/wordprocessingml/2006/main" xmlns:m="http://schemas.openxmlformats.org/officeDocument/2006/math" xmlns:r="http://schemas.openxmlformats.org/officeDocument/2006/relationships" xmlns:o="urn:schemas-microsoft-com:office:office" xmlns:v="urn:schemas-microsoft-com:vml" xmlns:w10="urn:schemas-microsoft-com:office:word" xmlns:a="http://schemas.openxmlformats.org/drawingml/2006/main" xmlns:pic="http://schemas.openxmlformats.org/drawingml/2006/picture" xmlns:wp="http://schemas.openxmlformats.org/drawingml/2006/wordprocessingDrawing">
   <w:body>
-    <w:bookmarkStart w:id="224" w:name="tài-liệu-tham-khảo--apa-7th"/>
+    <w:bookmarkStart w:id="226" w:name="tài-liệu-tham-khảo--apa-7th"/>
     <w:p>
       <w:pPr>
         <w:pStyle w:val="Heading1"/>
@@ -207,6 +207,80 @@
       </w:r>
       <w:r>
         <w:t xml:space="preserve">(5 entries) phục vụ cập nhật §1.1 và §5.1 của P4 Singapore: (i) Enterprise Singapore (2025) SWITCH 2025; (ii) GovTech Singapore (2024) Digital Government Rankings; (iii) IMDA (2025) ATxSG 2025; (iv) StartupBlink (2025) Global Startup Ecosystem Index; (v) StartupBlink (2026) Innovators Business Environment Index.</w:t>
+      </w:r>
+    </w:p>
+    <w:p>
+      <w:pPr>
+        <w:pStyle w:val="BlockText"/>
+      </w:pPr>
+      <w:r>
+        <w:rPr>
+          <w:bCs/>
+          <w:b/>
+        </w:rPr>
+        <w:t xml:space="preserve">Phiên bản 2.8 (16/05/2026 — Data360 Global Progress Atlas + P8 in-text citations)</w:t>
+      </w:r>
+      <w:r>
+        <w:t xml:space="preserve">: Bổ sung (i) Pirlea et al. (2026) "Global Progress" chapter-level entry với URL</w:t>
+      </w:r>
+      <w:r>
+        <w:t xml:space="preserve"> </w:t>
+      </w:r>
+      <w:r>
+        <w:rPr>
+          <w:rStyle w:val="VerbatimChar"/>
+        </w:rPr>
+        <w:t xml:space="preserve">/global-progress</w:t>
+      </w:r>
+      <w:r>
+        <w:t xml:space="preserve"> </w:t>
+      </w:r>
+      <w:r>
+        <w:t xml:space="preserve">(Section P); (ii) in-text citations trong P8 §1 (SIDS development lag) và §3.2 (DAI null context — Mahler et al. 2026). Khatua et al. (2024) APA7 format corrected to advance online publication.</w:t>
+      </w:r>
+    </w:p>
+    <w:p>
+      <w:pPr>
+        <w:pStyle w:val="BlockText"/>
+      </w:pPr>
+      <w:r>
+        <w:rPr>
+          <w:bCs/>
+          <w:b/>
+        </w:rPr>
+        <w:t xml:space="preserve">Phiên bản 2.9 (16/05/2026 — WB Working Papers từ upload 11 PDFs)</w:t>
+      </w:r>
+      <w:r>
+        <w:t xml:space="preserve">: Bổ sung</w:t>
+      </w:r>
+      <w:r>
+        <w:t xml:space="preserve"> </w:t>
+      </w:r>
+      <w:r>
+        <w:rPr>
+          <w:bCs/>
+          <w:b/>
+        </w:rPr>
+        <w:t xml:space="preserve">Section T mới</w:t>
+      </w:r>
+      <w:r>
+        <w:t xml:space="preserve"> </w:t>
+      </w:r>
+      <w:r>
+        <w:t xml:space="preserve">(5 entries) từ đánh giá 11 PDFs upload ngày 16/05/2026: (i) Agarwal, Barattieri &amp; Mattoo (2026) WPS11352 — Vietnam firm LP tăng theo export demand shock; (ii) Barattieri, Mattoo &amp; Signoret (2026) WPS11354 — Vietnam trade liberalization → +2.9%/yr productivity; (iii) Geginat &amp; Ramalho (2015) WPS7460 — electricity quality &amp; firm performance 183 countries (P8/CD1); (iv) Kim, Kumar, Ramalho &amp; Russell (2026) WPS11279 — institutional capacity framework for ICRV (CD2/thesis); (v) Mahler, Serajuddin, Wadhwa &amp; Yonzan (2026) WPS11350 — world slowest development pace 75 yrs, SIDS ≥100 yrs from standards (P8).</w:t>
+      </w:r>
+      <w:r>
+        <w:t xml:space="preserve"> </w:t>
+      </w:r>
+      <w:r>
+        <w:rPr>
+          <w:bCs/>
+          <w:b/>
+        </w:rPr>
+        <w:t xml:space="preserve">Disambiguation</w:t>
+      </w:r>
+      <w:r>
+        <w:t xml:space="preserve">: "Mahler, Serajuddin, Wadhwa &amp; Yonzan (2026)" = WPS11350 ≠ "Mahler, Wang &amp; Weber (2026)" = Atlas chapter (Section P). In-text citations added: P3 §5 (Agarwal + Barattieri), P8 §1 (Mahler et al. 2026b), CD2 §3.3 Tầng 3 (Kim et al. 2026).</w:t>
       </w:r>
     </w:p>
     <w:p>
@@ -3283,7 +3357,7 @@
       </w:r>
     </w:p>
     <w:bookmarkEnd w:id="53"/>
-    <w:bookmarkStart w:id="58" w:name="Xfdcfd95794eb92b06b0485f73971c5fa620ac84"/>
+    <w:bookmarkStart w:id="59" w:name="Xfdcfd95794eb92b06b0485f73971c5fa620ac84"/>
     <w:p>
       <w:pPr>
         <w:pStyle w:val="Heading2"/>
@@ -3489,14 +3563,56 @@
       </w:r>
     </w:p>
     <w:p>
+      <w:pPr>
+        <w:pStyle w:val="BodyText"/>
+      </w:pPr>
+      <w:r>
+        <w:t xml:space="preserve">Pirlea, A. F., Wadhwa, D., Mahler, D., Serajuddin, U., Welch, M., Thudt, A., &amp; Lambrechts, M. (2026, May). Global progress. In</w:t>
+      </w:r>
+      <w:r>
+        <w:t xml:space="preserve"> </w:t>
+      </w:r>
+      <w:r>
+        <w:rPr>
+          <w:iCs/>
+          <w:i/>
+        </w:rPr>
+        <w:t xml:space="preserve">Atlas of Global Development 2026</w:t>
+      </w:r>
+      <w:r>
+        <w:t xml:space="preserve">. World Bank Data360. World Bank Group.</w:t>
+      </w:r>
+      <w:r>
+        <w:t xml:space="preserve"> </w:t>
+      </w:r>
+      <w:hyperlink r:id="rId58">
+        <w:r>
+          <w:rPr>
+            <w:rStyle w:val="Hyperlink"/>
+          </w:rPr>
+          <w:t xml:space="preserve">https://data360.worldbank.org/en/int/atlas/global-progress</w:t>
+        </w:r>
+      </w:hyperlink>
+      <w:r>
+        <w:t xml:space="preserve"> </w:t>
+      </w:r>
+      <w:r>
+        <w:rPr>
+          <w:iCs/>
+          <w:i/>
+        </w:rPr>
+        <w:t xml:space="preserve">(Mới v2.7 — progress slowest on record in 15 of 26 tracked development indicators; SIDS and Sub-Saharan Africa most affected; 75 years of development data: 121,249 data points · 107 datasets; per-capita income growth in LICs 2020–2025 below historical average; poorest quintile lost most ground since COVID-19 disruption.)</w:t>
+      </w:r>
+    </w:p>
+    <w:p>
       <w:r>
         <w:pict>
           <v:rect style="width:0;height:1.5pt" o:hralign="center" o:hrstd="t" o:hr="t"/>
         </w:pict>
       </w:r>
     </w:p>
-    <w:bookmarkEnd w:id="58"/>
-    <w:bookmarkStart w:id="106" w:name="X036c8c3a317685afaa0f5ecef76da1f245e4cfe"/>
+    <w:bookmarkEnd w:id="59"/>
+    <w:bookmarkStart w:id="107" w:name="X036c8c3a317685afaa0f5ecef76da1f245e4cfe"/>
     <w:p>
       <w:pPr>
         <w:pStyle w:val="Heading2"/>
@@ -3571,7 +3687,7 @@
       <w:r>
         <w:t xml:space="preserve"> </w:t>
       </w:r>
-      <w:hyperlink r:id="rId59">
+      <w:hyperlink r:id="rId60">
         <w:r>
           <w:rPr>
             <w:rStyle w:val="Hyperlink"/>
@@ -3603,7 +3719,7 @@
       <w:r>
         <w:t xml:space="preserve"> </w:t>
       </w:r>
-      <w:hyperlink r:id="rId60">
+      <w:hyperlink r:id="rId61">
         <w:r>
           <w:rPr>
             <w:rStyle w:val="Hyperlink"/>
@@ -3635,7 +3751,7 @@
       <w:r>
         <w:t xml:space="preserve"> </w:t>
       </w:r>
-      <w:hyperlink r:id="rId61">
+      <w:hyperlink r:id="rId62">
         <w:r>
           <w:rPr>
             <w:rStyle w:val="Hyperlink"/>
@@ -3667,7 +3783,7 @@
       <w:r>
         <w:t xml:space="preserve"> </w:t>
       </w:r>
-      <w:hyperlink r:id="rId62">
+      <w:hyperlink r:id="rId63">
         <w:r>
           <w:rPr>
             <w:rStyle w:val="Hyperlink"/>
@@ -3699,7 +3815,7 @@
       <w:r>
         <w:t xml:space="preserve"> </w:t>
       </w:r>
-      <w:hyperlink r:id="rId63">
+      <w:hyperlink r:id="rId64">
         <w:r>
           <w:rPr>
             <w:rStyle w:val="Hyperlink"/>
@@ -3752,7 +3868,7 @@
       <w:r>
         <w:t xml:space="preserve"> </w:t>
       </w:r>
-      <w:hyperlink r:id="rId64">
+      <w:hyperlink r:id="rId65">
         <w:r>
           <w:rPr>
             <w:rStyle w:val="Hyperlink"/>
@@ -3784,7 +3900,7 @@
       <w:r>
         <w:t xml:space="preserve"> </w:t>
       </w:r>
-      <w:hyperlink r:id="rId65">
+      <w:hyperlink r:id="rId66">
         <w:r>
           <w:rPr>
             <w:rStyle w:val="Hyperlink"/>
@@ -3816,7 +3932,7 @@
       <w:r>
         <w:t xml:space="preserve"> </w:t>
       </w:r>
-      <w:hyperlink r:id="rId66">
+      <w:hyperlink r:id="rId67">
         <w:r>
           <w:rPr>
             <w:rStyle w:val="Hyperlink"/>
@@ -3848,7 +3964,7 @@
       <w:r>
         <w:t xml:space="preserve"> </w:t>
       </w:r>
-      <w:hyperlink r:id="rId67">
+      <w:hyperlink r:id="rId68">
         <w:r>
           <w:rPr>
             <w:rStyle w:val="Hyperlink"/>
@@ -3880,7 +3996,7 @@
       <w:r>
         <w:t xml:space="preserve"> </w:t>
       </w:r>
-      <w:hyperlink r:id="rId68">
+      <w:hyperlink r:id="rId69">
         <w:r>
           <w:rPr>
             <w:rStyle w:val="Hyperlink"/>
@@ -3912,7 +4028,7 @@
       <w:r>
         <w:t xml:space="preserve"> </w:t>
       </w:r>
-      <w:hyperlink r:id="rId69">
+      <w:hyperlink r:id="rId70">
         <w:r>
           <w:rPr>
             <w:rStyle w:val="Hyperlink"/>
@@ -3944,7 +4060,7 @@
       <w:r>
         <w:t xml:space="preserve"> </w:t>
       </w:r>
-      <w:hyperlink r:id="rId70">
+      <w:hyperlink r:id="rId71">
         <w:r>
           <w:rPr>
             <w:rStyle w:val="Hyperlink"/>
@@ -3976,7 +4092,7 @@
       <w:r>
         <w:t xml:space="preserve"> </w:t>
       </w:r>
-      <w:hyperlink r:id="rId71">
+      <w:hyperlink r:id="rId72">
         <w:r>
           <w:rPr>
             <w:rStyle w:val="Hyperlink"/>
@@ -4008,7 +4124,7 @@
       <w:r>
         <w:t xml:space="preserve"> </w:t>
       </w:r>
-      <w:hyperlink r:id="rId72">
+      <w:hyperlink r:id="rId73">
         <w:r>
           <w:rPr>
             <w:rStyle w:val="Hyperlink"/>
@@ -4040,7 +4156,7 @@
       <w:r>
         <w:t xml:space="preserve"> </w:t>
       </w:r>
-      <w:hyperlink r:id="rId73">
+      <w:hyperlink r:id="rId74">
         <w:r>
           <w:rPr>
             <w:rStyle w:val="Hyperlink"/>
@@ -4072,7 +4188,7 @@
       <w:r>
         <w:t xml:space="preserve"> </w:t>
       </w:r>
-      <w:hyperlink r:id="rId74">
+      <w:hyperlink r:id="rId75">
         <w:r>
           <w:rPr>
             <w:rStyle w:val="Hyperlink"/>
@@ -4104,7 +4220,7 @@
       <w:r>
         <w:t xml:space="preserve"> </w:t>
       </w:r>
-      <w:hyperlink r:id="rId75">
+      <w:hyperlink r:id="rId76">
         <w:r>
           <w:rPr>
             <w:rStyle w:val="Hyperlink"/>
@@ -4136,7 +4252,7 @@
       <w:r>
         <w:t xml:space="preserve"> </w:t>
       </w:r>
-      <w:hyperlink r:id="rId76">
+      <w:hyperlink r:id="rId77">
         <w:r>
           <w:rPr>
             <w:rStyle w:val="Hyperlink"/>
@@ -4168,7 +4284,7 @@
       <w:r>
         <w:t xml:space="preserve"> </w:t>
       </w:r>
-      <w:hyperlink r:id="rId77">
+      <w:hyperlink r:id="rId78">
         <w:r>
           <w:rPr>
             <w:rStyle w:val="Hyperlink"/>
@@ -4200,7 +4316,7 @@
       <w:r>
         <w:t xml:space="preserve"> </w:t>
       </w:r>
-      <w:hyperlink r:id="rId78">
+      <w:hyperlink r:id="rId79">
         <w:r>
           <w:rPr>
             <w:rStyle w:val="Hyperlink"/>
@@ -4232,7 +4348,7 @@
       <w:r>
         <w:t xml:space="preserve"> </w:t>
       </w:r>
-      <w:hyperlink r:id="rId79">
+      <w:hyperlink r:id="rId80">
         <w:r>
           <w:rPr>
             <w:rStyle w:val="Hyperlink"/>
@@ -4264,7 +4380,7 @@
       <w:r>
         <w:t xml:space="preserve"> </w:t>
       </w:r>
-      <w:hyperlink r:id="rId80">
+      <w:hyperlink r:id="rId81">
         <w:r>
           <w:rPr>
             <w:rStyle w:val="Hyperlink"/>
@@ -4296,7 +4412,7 @@
       <w:r>
         <w:t xml:space="preserve"> </w:t>
       </w:r>
-      <w:hyperlink r:id="rId81">
+      <w:hyperlink r:id="rId82">
         <w:r>
           <w:rPr>
             <w:rStyle w:val="Hyperlink"/>
@@ -4349,7 +4465,7 @@
       <w:r>
         <w:t xml:space="preserve"> </w:t>
       </w:r>
-      <w:hyperlink r:id="rId82">
+      <w:hyperlink r:id="rId83">
         <w:r>
           <w:rPr>
             <w:rStyle w:val="Hyperlink"/>
@@ -4381,7 +4497,7 @@
       <w:r>
         <w:t xml:space="preserve"> </w:t>
       </w:r>
-      <w:hyperlink r:id="rId83">
+      <w:hyperlink r:id="rId84">
         <w:r>
           <w:rPr>
             <w:rStyle w:val="Hyperlink"/>
@@ -4413,7 +4529,7 @@
       <w:r>
         <w:t xml:space="preserve"> </w:t>
       </w:r>
-      <w:hyperlink r:id="rId84">
+      <w:hyperlink r:id="rId85">
         <w:r>
           <w:rPr>
             <w:rStyle w:val="Hyperlink"/>
@@ -4445,7 +4561,7 @@
       <w:r>
         <w:t xml:space="preserve"> </w:t>
       </w:r>
-      <w:hyperlink r:id="rId85">
+      <w:hyperlink r:id="rId86">
         <w:r>
           <w:rPr>
             <w:rStyle w:val="Hyperlink"/>
@@ -4477,7 +4593,7 @@
       <w:r>
         <w:t xml:space="preserve"> </w:t>
       </w:r>
-      <w:hyperlink r:id="rId86">
+      <w:hyperlink r:id="rId87">
         <w:r>
           <w:rPr>
             <w:rStyle w:val="Hyperlink"/>
@@ -4509,7 +4625,7 @@
       <w:r>
         <w:t xml:space="preserve"> </w:t>
       </w:r>
-      <w:hyperlink r:id="rId87">
+      <w:hyperlink r:id="rId88">
         <w:r>
           <w:rPr>
             <w:rStyle w:val="Hyperlink"/>
@@ -4541,7 +4657,7 @@
       <w:r>
         <w:t xml:space="preserve"> </w:t>
       </w:r>
-      <w:hyperlink r:id="rId88">
+      <w:hyperlink r:id="rId89">
         <w:r>
           <w:rPr>
             <w:rStyle w:val="Hyperlink"/>
@@ -4573,7 +4689,7 @@
       <w:r>
         <w:t xml:space="preserve"> </w:t>
       </w:r>
-      <w:hyperlink r:id="rId89">
+      <w:hyperlink r:id="rId90">
         <w:r>
           <w:rPr>
             <w:rStyle w:val="Hyperlink"/>
@@ -4605,7 +4721,7 @@
       <w:r>
         <w:t xml:space="preserve"> </w:t>
       </w:r>
-      <w:hyperlink r:id="rId90">
+      <w:hyperlink r:id="rId91">
         <w:r>
           <w:rPr>
             <w:rStyle w:val="Hyperlink"/>
@@ -4674,7 +4790,7 @@
       <w:r>
         <w:t xml:space="preserve"> </w:t>
       </w:r>
-      <w:hyperlink r:id="rId91">
+      <w:hyperlink r:id="rId92">
         <w:r>
           <w:rPr>
             <w:rStyle w:val="Hyperlink"/>
@@ -4738,7 +4854,7 @@
       <w:r>
         <w:t xml:space="preserve"> </w:t>
       </w:r>
-      <w:hyperlink r:id="rId92">
+      <w:hyperlink r:id="rId93">
         <w:r>
           <w:rPr>
             <w:rStyle w:val="Hyperlink"/>
@@ -4770,7 +4886,7 @@
       <w:r>
         <w:t xml:space="preserve"> </w:t>
       </w:r>
-      <w:hyperlink r:id="rId93">
+      <w:hyperlink r:id="rId94">
         <w:r>
           <w:rPr>
             <w:rStyle w:val="Hyperlink"/>
@@ -4802,7 +4918,7 @@
       <w:r>
         <w:t xml:space="preserve"> </w:t>
       </w:r>
-      <w:hyperlink r:id="rId94">
+      <w:hyperlink r:id="rId95">
         <w:r>
           <w:rPr>
             <w:rStyle w:val="Hyperlink"/>
@@ -4834,7 +4950,7 @@
       <w:r>
         <w:t xml:space="preserve"> </w:t>
       </w:r>
-      <w:hyperlink r:id="rId95">
+      <w:hyperlink r:id="rId96">
         <w:r>
           <w:rPr>
             <w:rStyle w:val="Hyperlink"/>
@@ -4866,7 +4982,7 @@
       <w:r>
         <w:t xml:space="preserve"> </w:t>
       </w:r>
-      <w:hyperlink r:id="rId96">
+      <w:hyperlink r:id="rId97">
         <w:r>
           <w:rPr>
             <w:rStyle w:val="Hyperlink"/>
@@ -4898,7 +5014,7 @@
       <w:r>
         <w:t xml:space="preserve"> </w:t>
       </w:r>
-      <w:hyperlink r:id="rId97">
+      <w:hyperlink r:id="rId98">
         <w:r>
           <w:rPr>
             <w:rStyle w:val="Hyperlink"/>
@@ -4930,7 +5046,7 @@
       <w:r>
         <w:t xml:space="preserve"> </w:t>
       </w:r>
-      <w:hyperlink r:id="rId98">
+      <w:hyperlink r:id="rId99">
         <w:r>
           <w:rPr>
             <w:rStyle w:val="Hyperlink"/>
@@ -4962,7 +5078,7 @@
       <w:r>
         <w:t xml:space="preserve"> </w:t>
       </w:r>
-      <w:hyperlink r:id="rId99">
+      <w:hyperlink r:id="rId100">
         <w:r>
           <w:rPr>
             <w:rStyle w:val="Hyperlink"/>
@@ -4994,7 +5110,7 @@
       <w:r>
         <w:t xml:space="preserve"> </w:t>
       </w:r>
-      <w:hyperlink r:id="rId100">
+      <w:hyperlink r:id="rId101">
         <w:r>
           <w:rPr>
             <w:rStyle w:val="Hyperlink"/>
@@ -5026,7 +5142,7 @@
       <w:r>
         <w:t xml:space="preserve"> </w:t>
       </w:r>
-      <w:hyperlink r:id="rId101">
+      <w:hyperlink r:id="rId102">
         <w:r>
           <w:rPr>
             <w:rStyle w:val="Hyperlink"/>
@@ -5058,7 +5174,7 @@
       <w:r>
         <w:t xml:space="preserve"> </w:t>
       </w:r>
-      <w:hyperlink r:id="rId102">
+      <w:hyperlink r:id="rId103">
         <w:r>
           <w:rPr>
             <w:rStyle w:val="Hyperlink"/>
@@ -5090,7 +5206,7 @@
       <w:r>
         <w:t xml:space="preserve"> </w:t>
       </w:r>
-      <w:hyperlink r:id="rId103">
+      <w:hyperlink r:id="rId104">
         <w:r>
           <w:rPr>
             <w:rStyle w:val="Hyperlink"/>
@@ -5157,7 +5273,7 @@
       <w:r>
         <w:t xml:space="preserve"> </w:t>
       </w:r>
-      <w:hyperlink r:id="rId104">
+      <w:hyperlink r:id="rId105">
         <w:r>
           <w:rPr>
             <w:rStyle w:val="Hyperlink"/>
@@ -5192,7 +5308,7 @@
       <w:r>
         <w:t xml:space="preserve"> </w:t>
       </w:r>
-      <w:hyperlink r:id="rId105">
+      <w:hyperlink r:id="rId106">
         <w:r>
           <w:rPr>
             <w:rStyle w:val="Hyperlink"/>
@@ -5218,8 +5334,8 @@
         </w:pict>
       </w:r>
     </w:p>
-    <w:bookmarkEnd w:id="106"/>
-    <w:bookmarkStart w:id="112" w:name="X960578797b83f6ed17603db1897217bb15499be"/>
+    <w:bookmarkEnd w:id="107"/>
+    <w:bookmarkStart w:id="113" w:name="X960578797b83f6ed17603db1897217bb15499be"/>
     <w:p>
       <w:pPr>
         <w:pStyle w:val="Heading2"/>
@@ -5254,7 +5370,7 @@
       <w:r>
         <w:t xml:space="preserve"> </w:t>
       </w:r>
-      <w:hyperlink r:id="rId107">
+      <w:hyperlink r:id="rId108">
         <w:r>
           <w:rPr>
             <w:rStyle w:val="Hyperlink"/>
@@ -5296,7 +5412,7 @@
       <w:r>
         <w:t xml:space="preserve"> </w:t>
       </w:r>
-      <w:hyperlink r:id="rId108">
+      <w:hyperlink r:id="rId109">
         <w:r>
           <w:rPr>
             <w:rStyle w:val="Hyperlink"/>
@@ -5341,7 +5457,7 @@
       <w:r>
         <w:t xml:space="preserve"> </w:t>
       </w:r>
-      <w:hyperlink r:id="rId109">
+      <w:hyperlink r:id="rId110">
         <w:r>
           <w:rPr>
             <w:rStyle w:val="Hyperlink"/>
@@ -5383,7 +5499,7 @@
       <w:r>
         <w:t xml:space="preserve"> </w:t>
       </w:r>
-      <w:hyperlink r:id="rId110">
+      <w:hyperlink r:id="rId111">
         <w:r>
           <w:rPr>
             <w:rStyle w:val="Hyperlink"/>
@@ -5425,7 +5541,7 @@
       <w:r>
         <w:t xml:space="preserve"> </w:t>
       </w:r>
-      <w:hyperlink r:id="rId111">
+      <w:hyperlink r:id="rId112">
         <w:r>
           <w:rPr>
             <w:rStyle w:val="Hyperlink"/>
@@ -5451,8 +5567,8 @@
         </w:pict>
       </w:r>
     </w:p>
-    <w:bookmarkEnd w:id="112"/>
-    <w:bookmarkStart w:id="117" w:name="Xa754a011936178a69cc055e2e5927ea93f8c9af"/>
+    <w:bookmarkEnd w:id="113"/>
+    <w:bookmarkStart w:id="118" w:name="Xa754a011936178a69cc055e2e5927ea93f8c9af"/>
     <w:p>
       <w:pPr>
         <w:pStyle w:val="Heading2"/>
@@ -5530,7 +5646,7 @@
       <w:r>
         <w:t xml:space="preserve"> </w:t>
       </w:r>
-      <w:hyperlink r:id="rId113">
+      <w:hyperlink r:id="rId114">
         <w:r>
           <w:rPr>
             <w:rStyle w:val="Hyperlink"/>
@@ -5562,7 +5678,7 @@
       <w:r>
         <w:t xml:space="preserve"> </w:t>
       </w:r>
-      <w:hyperlink r:id="rId114">
+      <w:hyperlink r:id="rId115">
         <w:r>
           <w:rPr>
             <w:rStyle w:val="Hyperlink"/>
@@ -5594,7 +5710,7 @@
       <w:r>
         <w:t xml:space="preserve"> </w:t>
       </w:r>
-      <w:hyperlink r:id="rId115">
+      <w:hyperlink r:id="rId116">
         <w:r>
           <w:rPr>
             <w:rStyle w:val="Hyperlink"/>
@@ -5626,7 +5742,7 @@
       <w:r>
         <w:t xml:space="preserve"> </w:t>
       </w:r>
-      <w:hyperlink r:id="rId116">
+      <w:hyperlink r:id="rId117">
         <w:r>
           <w:rPr>
             <w:rStyle w:val="Hyperlink"/>
@@ -5663,17 +5779,248 @@
         </w:pict>
       </w:r>
     </w:p>
-    <w:bookmarkEnd w:id="117"/>
-    <w:bookmarkStart w:id="121" w:name="hướng-dẫn-sử-dụng-cập-nhật-v25"/>
+    <w:bookmarkEnd w:id="118"/>
+    <w:bookmarkStart w:id="119" w:name="X5f09a039404ac10ef75f065c6bff2ae92d0d751"/>
     <w:p>
       <w:pPr>
         <w:pStyle w:val="Heading2"/>
       </w:pPr>
       <w:r>
+        <w:t xml:space="preserve">T. World Bank Policy Research Working Papers — Bổ sung v2.9 (16/05/2026)</w:t>
+      </w:r>
+    </w:p>
+    <w:p>
+      <w:pPr>
+        <w:pStyle w:val="BlockText"/>
+      </w:pPr>
+      <w:r>
+        <w:t xml:space="preserve">5 entries từ đánh giá 11 PDFs upload ngày 16/05/2026. Xếp theo thứ tự APA7 (tác giả đầu tiên).</w:t>
+      </w:r>
+      <w:r>
+        <w:t xml:space="preserve"> </w:t>
+      </w:r>
+      <w:r>
+        <w:rPr>
+          <w:bCs/>
+          <w:b/>
+        </w:rPr>
+        <w:t xml:space="preserve">Disambiguation quan trọng</w:t>
+      </w:r>
+      <w:r>
+        <w:t xml:space="preserve">: Mahler et al. (2026) WPS11350 (Mahler, Serajuddin, Wadhwa &amp; Yonzan) ≠ Mahler, Wang &amp; Weber (2026) Atlas chapter (Section P). Dùng hậu tố "a/b" trong in-text nếu trích dẫn cả hai trong cùng văn bản.</w:t>
+      </w:r>
+    </w:p>
+    <w:p>
+      <w:pPr>
+        <w:pStyle w:val="FirstParagraph"/>
+      </w:pPr>
+      <w:r>
+        <w:t xml:space="preserve">Agarwal, A., Barattieri, A., &amp; Mattoo, A. (2026, April).</w:t>
+      </w:r>
+      <w:r>
+        <w:t xml:space="preserve"> </w:t>
+      </w:r>
+      <w:r>
+        <w:rPr>
+          <w:iCs/>
+          <w:i/>
+        </w:rPr>
+        <w:t xml:space="preserve">Foreign demand shocks and domestic value added: Firm-level evidence from Viet Nam</w:t>
+      </w:r>
+      <w:r>
+        <w:t xml:space="preserve"> </w:t>
+      </w:r>
+      <w:r>
+        <w:t xml:space="preserve">(Policy Research Working Paper No. 11352). World Bank Group.</w:t>
+      </w:r>
+      <w:r>
+        <w:t xml:space="preserve"> </w:t>
+      </w:r>
+      <w:r>
+        <w:rPr>
+          <w:iCs/>
+          <w:i/>
+        </w:rPr>
+        <w:t xml:space="preserve">(Mới v2.9 — Vietnam DVAR tăng mạnh từ 2018: US demand shock 8,76% → DVAR +2,49 pp trong 2018–2020, giải thích 68,5% tổng tăng DVAR; firms phản ứng bằng cách xuất khẩu nhiều hơn sang cả US và non-US markets và ghi nhận tăng năng suất lao động; non-Chinese-owned firms là động lực chính; cơ chế: implicit rules of origin + FDI vào intermediates. Sử dụng matched firm-level + customs data 2016–2020. Cited P3 §5 Discussion — corroboration cho ascending-limb mechanism.)</w:t>
+      </w:r>
+    </w:p>
+    <w:p>
+      <w:pPr>
+        <w:pStyle w:val="BodyText"/>
+      </w:pPr>
+      <w:r>
+        <w:t xml:space="preserve">Barattieri, A., Mattoo, A., &amp; Signoret, J. (2026, April).</w:t>
+      </w:r>
+      <w:r>
+        <w:t xml:space="preserve"> </w:t>
+      </w:r>
+      <w:r>
+        <w:rPr>
+          <w:iCs/>
+          <w:i/>
+        </w:rPr>
+        <w:t xml:space="preserve">Foreign tariffs as catalysts for reform? The potential development dividend</w:t>
+      </w:r>
+      <w:r>
+        <w:t xml:space="preserve"> </w:t>
+      </w:r>
+      <w:r>
+        <w:t xml:space="preserve">(Policy Research Working Paper No. 11354). World Bank Group.</w:t>
+      </w:r>
+      <w:r>
+        <w:t xml:space="preserve"> </w:t>
+      </w:r>
+      <w:r>
+        <w:rPr>
+          <w:iCs/>
+          <w:i/>
+        </w:rPr>
+        <w:t xml:space="preserve">(Mới v2.9 — Vietnam: liberalization dịch vụ thương mại 2008–2016 → +2,9% năng suất hàng năm trong dịch vụ, +3,1% trong sản xuất; "China-plus-one" strategy lợi ích hạn chế cho phần lớn đang phát triển; US Supreme Court Feb 20 2026 tuyên bố IEEPA tariffs unconstitutional. Cited P3 §5.5 Policy implications — macro-level corroboration cho tác động của mở cửa thương mại lên năng suất Việt Nam.)</w:t>
+      </w:r>
+    </w:p>
+    <w:p>
+      <w:pPr>
+        <w:pStyle w:val="BodyText"/>
+      </w:pPr>
+      <w:r>
+        <w:t xml:space="preserve">Geginat, C., &amp; Ramalho, R. (2015).</w:t>
+      </w:r>
+      <w:r>
+        <w:t xml:space="preserve"> </w:t>
+      </w:r>
+      <w:r>
+        <w:rPr>
+          <w:iCs/>
+          <w:i/>
+        </w:rPr>
+        <w:t xml:space="preserve">Electricity connections and firm performance in 183 countries</w:t>
+      </w:r>
+      <w:r>
+        <w:t xml:space="preserve"> </w:t>
+      </w:r>
+      <w:r>
+        <w:t xml:space="preserve">(Policy Research Working Paper No. 7460). World Bank Group.</w:t>
+      </w:r>
+      <w:r>
+        <w:t xml:space="preserve"> </w:t>
+      </w:r>
+      <w:r>
+        <w:rPr>
+          <w:iCs/>
+          <w:i/>
+        </w:rPr>
+        <w:t xml:space="preserve">(Mới v2.9 — WBES-based; LICs mất gấp 2 lần thời gian và trả gấp 70 lần chi phí kết nối điện so với HICs; chất lượng điện → firm performance; phân tích 183 quốc gia. Cited P8 / CD1 — infrastructure quality như institutional void context cho SIDS.)</w:t>
+      </w:r>
+    </w:p>
+    <w:p>
+      <w:pPr>
+        <w:pStyle w:val="BodyText"/>
+      </w:pPr>
+      <w:r>
+        <w:t xml:space="preserve">Kim, G., Kumar, T., Ramalho, R., &amp; Russell, S. (2026, January).</w:t>
+      </w:r>
+      <w:r>
+        <w:t xml:space="preserve"> </w:t>
+      </w:r>
+      <w:r>
+        <w:rPr>
+          <w:iCs/>
+          <w:i/>
+        </w:rPr>
+        <w:t xml:space="preserve">Institutional capacity for policy implementation: An analytical framework</w:t>
+      </w:r>
+      <w:r>
+        <w:t xml:space="preserve"> </w:t>
+      </w:r>
+      <w:r>
+        <w:t xml:space="preserve">(Policy Research Working Paper No. 11279). World Bank Group.</w:t>
+      </w:r>
+      <w:r>
+        <w:t xml:space="preserve"> </w:t>
+      </w:r>
+      <w:r>
+        <w:rPr>
+          <w:iCs/>
+          <w:i/>
+        </w:rPr>
+        <w:t xml:space="preserve">(Mới v2.9 — Định nghĩa "năng lực thể chế" = khả năng thực thi chính sách của các tổ chức công; hai chiều: Tổ chức (nhân sự, tài chính, hệ thống thông tin, quản lý) và Quản trị (minh bạch, độc lập, trách nhiệm giải trình); xây dựng trên North (1990); phân tích "islands of excellence" trong môi trường năng lực thấp; tương quan dương vững giữa năng lực thể chế và phát triển kinh tế. Cited CD2 §3.3 Tầng 3 Institutional Theory — cung cấp định nghĩa và framework chính thức cho ICRV 6-regime classification.)</w:t>
+      </w:r>
+    </w:p>
+    <w:p>
+      <w:pPr>
+        <w:pStyle w:val="BodyText"/>
+      </w:pPr>
+      <w:r>
+        <w:t xml:space="preserve">Mahler, D. G., Serajuddin, U., Wadhwa, D., &amp; Yonzan, N. (2026, April).</w:t>
+      </w:r>
+      <w:r>
+        <w:t xml:space="preserve"> </w:t>
+      </w:r>
+      <w:r>
+        <w:rPr>
+          <w:iCs/>
+          <w:i/>
+        </w:rPr>
+        <w:t xml:space="preserve">The world is developing at its slowest pace in 75 years</w:t>
+      </w:r>
+      <w:r>
+        <w:t xml:space="preserve"> </w:t>
+      </w:r>
+      <w:r>
+        <w:t xml:space="preserve">(Policy Research Working Paper No. 11350). World Bank Group.</w:t>
+      </w:r>
+      <w:r>
+        <w:t xml:space="preserve"> </w:t>
+      </w:r>
+      <w:r>
+        <w:rPr>
+          <w:iCs/>
+          <w:i/>
+        </w:rPr>
+        <w:t xml:space="preserve">(Mới v2.9 — Phương pháp mới đo tiến bộ xã hội qua 6 chỉ số: nghèo đói, tuổi thọ, giáo dục, bình đẳng giới, khí hậu, điện; phát triển chậm nhất kể từ 1950 (75 năm); 54 quốc gia ≥100 năm để đạt chuẩn developed; không có chậm lại, 150 triệu ít nghèo hơn; SIDS đại diện không cân xứng trong nhóm "stuck countries".</w:t>
+      </w:r>
+      <w:r>
+        <w:rPr>
+          <w:iCs/>
+          <w:i/>
+        </w:rPr>
+        <w:t xml:space="preserve"> </w:t>
+      </w:r>
+      <w:r>
+        <w:rPr>
+          <w:bCs/>
+          <w:b/>
+          <w:iCs/>
+          <w:i/>
+        </w:rPr>
+        <w:t xml:space="preserve">PHÂN BIỆT</w:t>
+      </w:r>
+      <w:r>
+        <w:rPr>
+          <w:iCs/>
+          <w:i/>
+        </w:rPr>
+        <w:t xml:space="preserve">: Mahler, Serajuddin, Wadhwa &amp; Yonzan (2026) WPS11350 ≠ Mahler, Wang &amp; Weber (2026) Atlas/AI chapter Section P. Dùng "Mahler et al. (2026b)" nếu trích dẫn cả hai. Cited P8 §1 Introduction — structural developmental constraints cho Pacific SIDS FIP mechanism.)</w:t>
+      </w:r>
+    </w:p>
+    <w:p>
+      <w:r>
+        <w:pict>
+          <v:rect style="width:0;height:1.5pt" o:hralign="center" o:hrstd="t" o:hr="t"/>
+        </w:pict>
+      </w:r>
+    </w:p>
+    <w:bookmarkEnd w:id="119"/>
+    <w:bookmarkStart w:id="123" w:name="hướng-dẫn-sử-dụng-cập-nhật-v25"/>
+    <w:p>
+      <w:pPr>
+        <w:pStyle w:val="Heading2"/>
+      </w:pPr>
+      <w:r>
         <w:t xml:space="preserve">Hướng dẫn sử dụng (cập nhật v2.5)</w:t>
       </w:r>
     </w:p>
-    <w:bookmarkStart w:id="118" w:name="trong-bản-thảo-luận-án"/>
+    <w:bookmarkStart w:id="120" w:name="trong-bản-thảo-luận-án"/>
     <w:p>
       <w:pPr>
         <w:pStyle w:val="Heading3"/>
@@ -6025,99 +6372,210 @@
         <w:t xml:space="preserve">Startup ecosystem rank: "StartupBlink (2025)" or "StartupBlink (2026)" (specify year for disambiguation)</w:t>
       </w:r>
     </w:p>
-    <w:bookmarkEnd w:id="118"/>
-    <w:bookmarkStart w:id="119" w:name="khi-nộp-bản-cuối"/>
-    <w:p>
-      <w:pPr>
-        <w:pStyle w:val="Heading3"/>
-      </w:pPr>
-      <w:r>
-        <w:t xml:space="preserve">Khi nộp bản cuối</w:t>
-      </w:r>
-    </w:p>
     <w:p>
       <w:pPr>
         <w:numPr>
           <w:ilvl w:val="0"/>
+          <w:numId w:val="1001"/>
+        </w:numPr>
+        <w:pStyle w:val="Compact"/>
+      </w:pPr>
+      <w:r>
+        <w:rPr>
+          <w:bCs/>
+          <w:b/>
+        </w:rPr>
+        <w:t xml:space="preserve">Trích dẫn Section T — WB Working Papers 2015/2026 (v2.9)</w:t>
+      </w:r>
+      <w:r>
+        <w:t xml:space="preserve">:</w:t>
+      </w:r>
+    </w:p>
+    <w:p>
+      <w:pPr>
+        <w:numPr>
+          <w:ilvl w:val="1"/>
           <w:numId w:val="1004"/>
         </w:numPr>
         <w:pStyle w:val="Compact"/>
       </w:pPr>
       <w:r>
-        <w:t xml:space="preserve">Xác minh DOI trên Crossref hoặc trang publisher cho các entry không quen thuộc.</w:t>
+        <w:t xml:space="preserve">Vietnam firm LP + export demand: "Agarwal, Barattieri, &amp; Mattoo (2026)" [WPS11352]</w:t>
       </w:r>
     </w:p>
     <w:p>
       <w:pPr>
         <w:numPr>
-          <w:ilvl w:val="0"/>
+          <w:ilvl w:val="1"/>
           <w:numId w:val="1004"/>
         </w:numPr>
         <w:pStyle w:val="Compact"/>
       </w:pPr>
       <w:r>
-        <w:t xml:space="preserve">Kiểm tra nhất quán italic và punctuation theo APA 7th.</w:t>
+        <w:t xml:space="preserve">Vietnam trade liberalization → productivity: "Barattieri, Mattoo, &amp; Signoret (2026)" [WPS11354]</w:t>
       </w:r>
     </w:p>
     <w:p>
       <w:pPr>
         <w:numPr>
-          <w:ilvl w:val="0"/>
+          <w:ilvl w:val="1"/>
           <w:numId w:val="1004"/>
         </w:numPr>
         <w:pStyle w:val="Compact"/>
       </w:pPr>
       <w:r>
-        <w:t xml:space="preserve">Yang et al. (2025) JBR: hiện chưa verify được volume/pages — cần kiểm tra Crossref hoặc loại bỏ.</w:t>
+        <w:t xml:space="preserve">Electricity &amp; firm performance 183 countries: "Geginat &amp; Ramalho (2015)" [WPS7460]</w:t>
       </w:r>
     </w:p>
     <w:p>
       <w:pPr>
         <w:numPr>
-          <w:ilvl w:val="0"/>
+          <w:ilvl w:val="1"/>
           <w:numId w:val="1004"/>
         </w:numPr>
         <w:pStyle w:val="Compact"/>
       </w:pPr>
       <w:r>
-        <w:rPr>
-          <w:bCs/>
-          <w:b/>
-        </w:rPr>
-        <w:t xml:space="preserve">Verified DOIs (v2.3)</w:t>
-      </w:r>
-      <w:r>
-        <w:t xml:space="preserve">: Xu (2024) GSJ DOI 10.1002/gsj.1510; Kafouros et al. (2023) GSJ DOI 10.1002/gsj.1479; Mardones-Ibáñez (2025) SAGE Open DOI 10.1177/21582440251335079; Al-Najjar et al. (2025) IJHRM DOI 10.1080/09585192.2025.2550765.</w:t>
+        <w:t xml:space="preserve">Institutional capacity framework: "Kim, Kumar, Ramalho, &amp; Russell (2026)" [WPS11279]</w:t>
       </w:r>
     </w:p>
     <w:p>
       <w:pPr>
         <w:numPr>
-          <w:ilvl w:val="0"/>
+          <w:ilvl w:val="1"/>
           <w:numId w:val="1004"/>
         </w:numPr>
         <w:pStyle w:val="Compact"/>
       </w:pPr>
       <w:r>
-        <w:rPr>
-          <w:bCs/>
-          <w:b/>
-        </w:rPr>
-        <w:t xml:space="preserve">Verified DOIs (v2.4)</w:t>
-      </w:r>
-      <w:r>
-        <w:t xml:space="preserve">: Bello &amp; Kostova (2012) JIBS DOI 10.1057/jibs.2012.14; Meyer et al. (2017) JIBS DOI 10.1057/s41267-017-0078-8; Dunning (1988) JIBS DOI 10.1057/palgrave.jibs.8490372; Williamson (2000) JEL DOI 10.1257/jel.38.3.595; Aguinis, Hill &amp; Bailey (2019) ORM DOI 10.1177/1094428119836485; Malerba &amp; Orsenigo (1995) Cambridge JoE DOI 10.1093/oxfordjournals.cje.a035301.</w:t>
+        <w:t xml:space="preserve">World slowest development 75 years:</w:t>
+      </w:r>
+      <w:r>
+        <w:t xml:space="preserve"> </w:t>
+      </w:r>
+      <w:r>
+        <w:rPr>
+          <w:bCs/>
+          <w:b/>
+        </w:rPr>
+        <w:t xml:space="preserve">"Mahler et al. (2026b)"</w:t>
+      </w:r>
+      <w:r>
+        <w:t xml:space="preserve"> </w:t>
+      </w:r>
+      <w:r>
+        <w:t xml:space="preserve">[WPS11350] —</w:t>
+      </w:r>
+      <w:r>
+        <w:t xml:space="preserve"> </w:t>
+      </w:r>
+      <w:r>
+        <w:rPr>
+          <w:bCs/>
+          <w:b/>
+        </w:rPr>
+        <w:t xml:space="preserve">b suffix</w:t>
+      </w:r>
+      <w:r>
+        <w:t xml:space="preserve"> </w:t>
+      </w:r>
+      <w:r>
+        <w:t xml:space="preserve">phân biệt với "Mahler, Wang &amp; Weber (2026)" [Atlas chapter, Section P]</w:t>
+      </w:r>
+    </w:p>
+    <w:bookmarkEnd w:id="120"/>
+    <w:bookmarkStart w:id="121" w:name="khi-nộp-bản-cuối"/>
+    <w:p>
+      <w:pPr>
+        <w:pStyle w:val="Heading3"/>
+      </w:pPr>
+      <w:r>
+        <w:t xml:space="preserve">Khi nộp bản cuối</w:t>
       </w:r>
     </w:p>
     <w:p>
       <w:pPr>
         <w:numPr>
           <w:ilvl w:val="0"/>
-          <w:numId w:val="1004"/>
+          <w:numId w:val="1005"/>
         </w:numPr>
         <w:pStyle w:val="Compact"/>
       </w:pPr>
       <w:r>
+        <w:t xml:space="preserve">Xác minh DOI trên Crossref hoặc trang publisher cho các entry không quen thuộc.</w:t>
+      </w:r>
+    </w:p>
+    <w:p>
+      <w:pPr>
+        <w:numPr>
+          <w:ilvl w:val="0"/>
+          <w:numId w:val="1005"/>
+        </w:numPr>
+        <w:pStyle w:val="Compact"/>
+      </w:pPr>
+      <w:r>
+        <w:t xml:space="preserve">Kiểm tra nhất quán italic và punctuation theo APA 7th.</w:t>
+      </w:r>
+    </w:p>
+    <w:p>
+      <w:pPr>
+        <w:numPr>
+          <w:ilvl w:val="0"/>
+          <w:numId w:val="1005"/>
+        </w:numPr>
+        <w:pStyle w:val="Compact"/>
+      </w:pPr>
+      <w:r>
+        <w:t xml:space="preserve">Yang et al. (2025) JBR: hiện chưa verify được volume/pages — cần kiểm tra Crossref hoặc loại bỏ.</w:t>
+      </w:r>
+    </w:p>
+    <w:p>
+      <w:pPr>
+        <w:numPr>
+          <w:ilvl w:val="0"/>
+          <w:numId w:val="1005"/>
+        </w:numPr>
+        <w:pStyle w:val="Compact"/>
+      </w:pPr>
+      <w:r>
+        <w:rPr>
+          <w:bCs/>
+          <w:b/>
+        </w:rPr>
+        <w:t xml:space="preserve">Verified DOIs (v2.3)</w:t>
+      </w:r>
+      <w:r>
+        <w:t xml:space="preserve">: Xu (2024) GSJ DOI 10.1002/gsj.1510; Kafouros et al. (2023) GSJ DOI 10.1002/gsj.1479; Mardones-Ibáñez (2025) SAGE Open DOI 10.1177/21582440251335079; Al-Najjar et al. (2025) IJHRM DOI 10.1080/09585192.2025.2550765.</w:t>
+      </w:r>
+    </w:p>
+    <w:p>
+      <w:pPr>
+        <w:numPr>
+          <w:ilvl w:val="0"/>
+          <w:numId w:val="1005"/>
+        </w:numPr>
+        <w:pStyle w:val="Compact"/>
+      </w:pPr>
+      <w:r>
+        <w:rPr>
+          <w:bCs/>
+          <w:b/>
+        </w:rPr>
+        <w:t xml:space="preserve">Verified DOIs (v2.4)</w:t>
+      </w:r>
+      <w:r>
+        <w:t xml:space="preserve">: Bello &amp; Kostova (2012) JIBS DOI 10.1057/jibs.2012.14; Meyer et al. (2017) JIBS DOI 10.1057/s41267-017-0078-8; Dunning (1988) JIBS DOI 10.1057/palgrave.jibs.8490372; Williamson (2000) JEL DOI 10.1257/jel.38.3.595; Aguinis, Hill &amp; Bailey (2019) ORM DOI 10.1177/1094428119836485; Malerba &amp; Orsenigo (1995) Cambridge JoE DOI 10.1093/oxfordjournals.cje.a035301.</w:t>
+      </w:r>
+    </w:p>
+    <w:p>
+      <w:pPr>
+        <w:numPr>
+          <w:ilvl w:val="0"/>
+          <w:numId w:val="1005"/>
+        </w:numPr>
+        <w:pStyle w:val="Compact"/>
+      </w:pPr>
+      <w:r>
         <w:rPr>
           <w:bCs/>
           <w:b/>
@@ -6192,8 +6650,8 @@
         <w:t xml:space="preserve">— số đầy đủ + ngày publication trên datatopics.worldbank.org.</w:t>
       </w:r>
     </w:p>
-    <w:bookmarkEnd w:id="119"/>
-    <w:bookmarkStart w:id="120" w:name="audit-warnings-status-cập-nhật-v25"/>
+    <w:bookmarkEnd w:id="121"/>
+    <w:bookmarkStart w:id="122" w:name="audit-warnings-status-cập-nhật-v25"/>
     <w:p>
       <w:pPr>
         <w:pStyle w:val="Heading3"/>
@@ -6318,9 +6776,9 @@
         </w:pict>
       </w:r>
     </w:p>
-    <w:bookmarkEnd w:id="120"/>
-    <w:bookmarkEnd w:id="121"/>
-    <w:bookmarkStart w:id="179" w:name="X0cd7ce921ef889aa4b7b0017ef0bc0e135f6e1c"/>
+    <w:bookmarkEnd w:id="122"/>
+    <w:bookmarkEnd w:id="123"/>
+    <w:bookmarkStart w:id="181" w:name="X0cd7ce921ef889aa4b7b0017ef0bc0e135f6e1c"/>
     <w:p>
       <w:pPr>
         <w:pStyle w:val="Heading2"/>
@@ -6396,7 +6854,7 @@
       <w:r>
         <w:t xml:space="preserve"> </w:t>
       </w:r>
-      <w:hyperlink r:id="rId122">
+      <w:hyperlink r:id="rId124">
         <w:r>
           <w:rPr>
             <w:rStyle w:val="Hyperlink"/>
@@ -6428,7 +6886,7 @@
       <w:r>
         <w:t xml:space="preserve"> </w:t>
       </w:r>
-      <w:hyperlink r:id="rId123">
+      <w:hyperlink r:id="rId125">
         <w:r>
           <w:rPr>
             <w:rStyle w:val="Hyperlink"/>
@@ -6460,7 +6918,7 @@
       <w:r>
         <w:t xml:space="preserve"> </w:t>
       </w:r>
-      <w:hyperlink r:id="rId124">
+      <w:hyperlink r:id="rId126">
         <w:r>
           <w:rPr>
             <w:rStyle w:val="Hyperlink"/>
@@ -6513,7 +6971,7 @@
       <w:r>
         <w:t xml:space="preserve"> </w:t>
       </w:r>
-      <w:hyperlink r:id="rId125">
+      <w:hyperlink r:id="rId127">
         <w:r>
           <w:rPr>
             <w:rStyle w:val="Hyperlink"/>
@@ -6545,7 +7003,7 @@
       <w:r>
         <w:t xml:space="preserve"> </w:t>
       </w:r>
-      <w:hyperlink r:id="rId126">
+      <w:hyperlink r:id="rId128">
         <w:r>
           <w:rPr>
             <w:rStyle w:val="Hyperlink"/>
@@ -6577,7 +7035,7 @@
       <w:r>
         <w:t xml:space="preserve"> </w:t>
       </w:r>
-      <w:hyperlink r:id="rId127">
+      <w:hyperlink r:id="rId129">
         <w:r>
           <w:rPr>
             <w:rStyle w:val="Hyperlink"/>
@@ -6609,7 +7067,7 @@
       <w:r>
         <w:t xml:space="preserve"> </w:t>
       </w:r>
-      <w:hyperlink r:id="rId128">
+      <w:hyperlink r:id="rId130">
         <w:r>
           <w:rPr>
             <w:rStyle w:val="Hyperlink"/>
@@ -6641,7 +7099,7 @@
       <w:r>
         <w:t xml:space="preserve"> </w:t>
       </w:r>
-      <w:hyperlink r:id="rId129">
+      <w:hyperlink r:id="rId131">
         <w:r>
           <w:rPr>
             <w:rStyle w:val="Hyperlink"/>
@@ -6673,7 +7131,7 @@
       <w:r>
         <w:t xml:space="preserve"> </w:t>
       </w:r>
-      <w:hyperlink r:id="rId130">
+      <w:hyperlink r:id="rId132">
         <w:r>
           <w:rPr>
             <w:rStyle w:val="Hyperlink"/>
@@ -6705,7 +7163,7 @@
       <w:r>
         <w:t xml:space="preserve"> </w:t>
       </w:r>
-      <w:hyperlink r:id="rId131">
+      <w:hyperlink r:id="rId133">
         <w:r>
           <w:rPr>
             <w:rStyle w:val="Hyperlink"/>
@@ -6737,7 +7195,7 @@
       <w:r>
         <w:t xml:space="preserve"> </w:t>
       </w:r>
-      <w:hyperlink r:id="rId132">
+      <w:hyperlink r:id="rId134">
         <w:r>
           <w:rPr>
             <w:rStyle w:val="Hyperlink"/>
@@ -6769,7 +7227,7 @@
       <w:r>
         <w:t xml:space="preserve"> </w:t>
       </w:r>
-      <w:hyperlink r:id="rId133">
+      <w:hyperlink r:id="rId135">
         <w:r>
           <w:rPr>
             <w:rStyle w:val="Hyperlink"/>
@@ -6801,7 +7259,7 @@
       <w:r>
         <w:t xml:space="preserve"> </w:t>
       </w:r>
-      <w:hyperlink r:id="rId134">
+      <w:hyperlink r:id="rId136">
         <w:r>
           <w:rPr>
             <w:rStyle w:val="Hyperlink"/>
@@ -6833,7 +7291,7 @@
       <w:r>
         <w:t xml:space="preserve"> </w:t>
       </w:r>
-      <w:hyperlink r:id="rId135">
+      <w:hyperlink r:id="rId137">
         <w:r>
           <w:rPr>
             <w:rStyle w:val="Hyperlink"/>
@@ -6865,7 +7323,7 @@
       <w:r>
         <w:t xml:space="preserve"> </w:t>
       </w:r>
-      <w:hyperlink r:id="rId136">
+      <w:hyperlink r:id="rId138">
         <w:r>
           <w:rPr>
             <w:rStyle w:val="Hyperlink"/>
@@ -6897,7 +7355,7 @@
       <w:r>
         <w:t xml:space="preserve"> </w:t>
       </w:r>
-      <w:hyperlink r:id="rId137">
+      <w:hyperlink r:id="rId139">
         <w:r>
           <w:rPr>
             <w:rStyle w:val="Hyperlink"/>
@@ -6929,7 +7387,7 @@
       <w:r>
         <w:t xml:space="preserve"> </w:t>
       </w:r>
-      <w:hyperlink r:id="rId138">
+      <w:hyperlink r:id="rId140">
         <w:r>
           <w:rPr>
             <w:rStyle w:val="Hyperlink"/>
@@ -6961,7 +7419,7 @@
       <w:r>
         <w:t xml:space="preserve"> </w:t>
       </w:r>
-      <w:hyperlink r:id="rId139">
+      <w:hyperlink r:id="rId141">
         <w:r>
           <w:rPr>
             <w:rStyle w:val="Hyperlink"/>
@@ -6993,7 +7451,7 @@
       <w:r>
         <w:t xml:space="preserve"> </w:t>
       </w:r>
-      <w:hyperlink r:id="rId140">
+      <w:hyperlink r:id="rId142">
         <w:r>
           <w:rPr>
             <w:rStyle w:val="Hyperlink"/>
@@ -7025,7 +7483,7 @@
       <w:r>
         <w:t xml:space="preserve"> </w:t>
       </w:r>
-      <w:hyperlink r:id="rId141">
+      <w:hyperlink r:id="rId143">
         <w:r>
           <w:rPr>
             <w:rStyle w:val="Hyperlink"/>
@@ -7057,7 +7515,7 @@
       <w:r>
         <w:t xml:space="preserve"> </w:t>
       </w:r>
-      <w:hyperlink r:id="rId142">
+      <w:hyperlink r:id="rId144">
         <w:r>
           <w:rPr>
             <w:rStyle w:val="Hyperlink"/>
@@ -7089,7 +7547,7 @@
       <w:r>
         <w:t xml:space="preserve"> </w:t>
       </w:r>
-      <w:hyperlink r:id="rId143">
+      <w:hyperlink r:id="rId145">
         <w:r>
           <w:rPr>
             <w:rStyle w:val="Hyperlink"/>
@@ -7121,7 +7579,7 @@
       <w:r>
         <w:t xml:space="preserve"> </w:t>
       </w:r>
-      <w:hyperlink r:id="rId144">
+      <w:hyperlink r:id="rId146">
         <w:r>
           <w:rPr>
             <w:rStyle w:val="Hyperlink"/>
@@ -7153,7 +7611,7 @@
       <w:r>
         <w:t xml:space="preserve"> </w:t>
       </w:r>
-      <w:hyperlink r:id="rId145">
+      <w:hyperlink r:id="rId147">
         <w:r>
           <w:rPr>
             <w:rStyle w:val="Hyperlink"/>
@@ -7185,7 +7643,7 @@
       <w:r>
         <w:t xml:space="preserve"> </w:t>
       </w:r>
-      <w:hyperlink r:id="rId146">
+      <w:hyperlink r:id="rId148">
         <w:r>
           <w:rPr>
             <w:rStyle w:val="Hyperlink"/>
@@ -7217,7 +7675,7 @@
       <w:r>
         <w:t xml:space="preserve"> </w:t>
       </w:r>
-      <w:hyperlink r:id="rId147">
+      <w:hyperlink r:id="rId149">
         <w:r>
           <w:rPr>
             <w:rStyle w:val="Hyperlink"/>
@@ -7249,7 +7707,7 @@
       <w:r>
         <w:t xml:space="preserve"> </w:t>
       </w:r>
-      <w:hyperlink r:id="rId148">
+      <w:hyperlink r:id="rId150">
         <w:r>
           <w:rPr>
             <w:rStyle w:val="Hyperlink"/>
@@ -7281,7 +7739,7 @@
       <w:r>
         <w:t xml:space="preserve"> </w:t>
       </w:r>
-      <w:hyperlink r:id="rId149">
+      <w:hyperlink r:id="rId151">
         <w:r>
           <w:rPr>
             <w:rStyle w:val="Hyperlink"/>
@@ -7313,7 +7771,7 @@
       <w:r>
         <w:t xml:space="preserve"> </w:t>
       </w:r>
-      <w:hyperlink r:id="rId150">
+      <w:hyperlink r:id="rId152">
         <w:r>
           <w:rPr>
             <w:rStyle w:val="Hyperlink"/>
@@ -7345,7 +7803,7 @@
       <w:r>
         <w:t xml:space="preserve"> </w:t>
       </w:r>
-      <w:hyperlink r:id="rId151">
+      <w:hyperlink r:id="rId153">
         <w:r>
           <w:rPr>
             <w:rStyle w:val="Hyperlink"/>
@@ -7377,7 +7835,7 @@
       <w:r>
         <w:t xml:space="preserve"> </w:t>
       </w:r>
-      <w:hyperlink r:id="rId152">
+      <w:hyperlink r:id="rId154">
         <w:r>
           <w:rPr>
             <w:rStyle w:val="Hyperlink"/>
@@ -7493,7 +7951,7 @@
       <w:r>
         <w:t xml:space="preserve"> </w:t>
       </w:r>
-      <w:hyperlink r:id="rId153">
+      <w:hyperlink r:id="rId155">
         <w:r>
           <w:rPr>
             <w:rStyle w:val="Hyperlink"/>
@@ -7525,7 +7983,7 @@
       <w:r>
         <w:t xml:space="preserve"> </w:t>
       </w:r>
-      <w:hyperlink r:id="rId154">
+      <w:hyperlink r:id="rId156">
         <w:r>
           <w:rPr>
             <w:rStyle w:val="Hyperlink"/>
@@ -7557,7 +8015,7 @@
       <w:r>
         <w:t xml:space="preserve"> </w:t>
       </w:r>
-      <w:hyperlink r:id="rId155">
+      <w:hyperlink r:id="rId157">
         <w:r>
           <w:rPr>
             <w:rStyle w:val="Hyperlink"/>
@@ -7589,7 +8047,7 @@
       <w:r>
         <w:t xml:space="preserve"> </w:t>
       </w:r>
-      <w:hyperlink r:id="rId156">
+      <w:hyperlink r:id="rId158">
         <w:r>
           <w:rPr>
             <w:rStyle w:val="Hyperlink"/>
@@ -7621,7 +8079,7 @@
       <w:r>
         <w:t xml:space="preserve"> </w:t>
       </w:r>
-      <w:hyperlink r:id="rId157">
+      <w:hyperlink r:id="rId159">
         <w:r>
           <w:rPr>
             <w:rStyle w:val="Hyperlink"/>
@@ -7653,7 +8111,7 @@
       <w:r>
         <w:t xml:space="preserve"> </w:t>
       </w:r>
-      <w:hyperlink r:id="rId158">
+      <w:hyperlink r:id="rId160">
         <w:r>
           <w:rPr>
             <w:rStyle w:val="Hyperlink"/>
@@ -7685,7 +8143,7 @@
       <w:r>
         <w:t xml:space="preserve"> </w:t>
       </w:r>
-      <w:hyperlink r:id="rId159">
+      <w:hyperlink r:id="rId161">
         <w:r>
           <w:rPr>
             <w:rStyle w:val="Hyperlink"/>
@@ -7717,7 +8175,7 @@
       <w:r>
         <w:t xml:space="preserve"> </w:t>
       </w:r>
-      <w:hyperlink r:id="rId160">
+      <w:hyperlink r:id="rId162">
         <w:r>
           <w:rPr>
             <w:rStyle w:val="Hyperlink"/>
@@ -7749,7 +8207,7 @@
       <w:r>
         <w:t xml:space="preserve"> </w:t>
       </w:r>
-      <w:hyperlink r:id="rId161">
+      <w:hyperlink r:id="rId163">
         <w:r>
           <w:rPr>
             <w:rStyle w:val="Hyperlink"/>
@@ -7781,7 +8239,7 @@
       <w:r>
         <w:t xml:space="preserve"> </w:t>
       </w:r>
-      <w:hyperlink r:id="rId162">
+      <w:hyperlink r:id="rId164">
         <w:r>
           <w:rPr>
             <w:rStyle w:val="Hyperlink"/>
@@ -7813,7 +8271,7 @@
       <w:r>
         <w:t xml:space="preserve"> </w:t>
       </w:r>
-      <w:hyperlink r:id="rId163">
+      <w:hyperlink r:id="rId165">
         <w:r>
           <w:rPr>
             <w:rStyle w:val="Hyperlink"/>
@@ -7845,7 +8303,7 @@
       <w:r>
         <w:t xml:space="preserve"> </w:t>
       </w:r>
-      <w:hyperlink r:id="rId164">
+      <w:hyperlink r:id="rId166">
         <w:r>
           <w:rPr>
             <w:rStyle w:val="Hyperlink"/>
@@ -7877,7 +8335,7 @@
       <w:r>
         <w:t xml:space="preserve"> </w:t>
       </w:r>
-      <w:hyperlink r:id="rId165">
+      <w:hyperlink r:id="rId167">
         <w:r>
           <w:rPr>
             <w:rStyle w:val="Hyperlink"/>
@@ -7909,7 +8367,7 @@
       <w:r>
         <w:t xml:space="preserve"> </w:t>
       </w:r>
-      <w:hyperlink r:id="rId166">
+      <w:hyperlink r:id="rId168">
         <w:r>
           <w:rPr>
             <w:rStyle w:val="Hyperlink"/>
@@ -7941,7 +8399,7 @@
       <w:r>
         <w:t xml:space="preserve"> </w:t>
       </w:r>
-      <w:hyperlink r:id="rId167">
+      <w:hyperlink r:id="rId169">
         <w:r>
           <w:rPr>
             <w:rStyle w:val="Hyperlink"/>
@@ -7973,7 +8431,7 @@
       <w:r>
         <w:t xml:space="preserve"> </w:t>
       </w:r>
-      <w:hyperlink r:id="rId168">
+      <w:hyperlink r:id="rId170">
         <w:r>
           <w:rPr>
             <w:rStyle w:val="Hyperlink"/>
@@ -8005,7 +8463,7 @@
       <w:r>
         <w:t xml:space="preserve"> </w:t>
       </w:r>
-      <w:hyperlink r:id="rId169">
+      <w:hyperlink r:id="rId171">
         <w:r>
           <w:rPr>
             <w:rStyle w:val="Hyperlink"/>
@@ -8058,7 +8516,7 @@
       <w:r>
         <w:t xml:space="preserve"> </w:t>
       </w:r>
-      <w:hyperlink r:id="rId170">
+      <w:hyperlink r:id="rId172">
         <w:r>
           <w:rPr>
             <w:rStyle w:val="Hyperlink"/>
@@ -8090,7 +8548,7 @@
       <w:r>
         <w:t xml:space="preserve"> </w:t>
       </w:r>
-      <w:hyperlink r:id="rId171">
+      <w:hyperlink r:id="rId173">
         <w:r>
           <w:rPr>
             <w:rStyle w:val="Hyperlink"/>
@@ -8122,7 +8580,7 @@
       <w:r>
         <w:t xml:space="preserve"> </w:t>
       </w:r>
-      <w:hyperlink r:id="rId172">
+      <w:hyperlink r:id="rId174">
         <w:r>
           <w:rPr>
             <w:rStyle w:val="Hyperlink"/>
@@ -8154,7 +8612,7 @@
       <w:r>
         <w:t xml:space="preserve"> </w:t>
       </w:r>
-      <w:hyperlink r:id="rId173">
+      <w:hyperlink r:id="rId175">
         <w:r>
           <w:rPr>
             <w:rStyle w:val="Hyperlink"/>
@@ -8186,7 +8644,7 @@
       <w:r>
         <w:t xml:space="preserve"> </w:t>
       </w:r>
-      <w:hyperlink r:id="rId174">
+      <w:hyperlink r:id="rId176">
         <w:r>
           <w:rPr>
             <w:rStyle w:val="Hyperlink"/>
@@ -8218,7 +8676,7 @@
       <w:r>
         <w:t xml:space="preserve"> </w:t>
       </w:r>
-      <w:hyperlink r:id="rId175">
+      <w:hyperlink r:id="rId177">
         <w:r>
           <w:rPr>
             <w:rStyle w:val="Hyperlink"/>
@@ -8250,7 +8708,7 @@
       <w:r>
         <w:t xml:space="preserve"> </w:t>
       </w:r>
-      <w:hyperlink r:id="rId176">
+      <w:hyperlink r:id="rId178">
         <w:r>
           <w:rPr>
             <w:rStyle w:val="Hyperlink"/>
@@ -8282,7 +8740,7 @@
       <w:r>
         <w:t xml:space="preserve"> </w:t>
       </w:r>
-      <w:hyperlink r:id="rId177">
+      <w:hyperlink r:id="rId179">
         <w:r>
           <w:rPr>
             <w:rStyle w:val="Hyperlink"/>
@@ -8335,7 +8793,7 @@
       <w:r>
         <w:t xml:space="preserve"> </w:t>
       </w:r>
-      <w:hyperlink r:id="rId178">
+      <w:hyperlink r:id="rId180">
         <w:r>
           <w:rPr>
             <w:rStyle w:val="Hyperlink"/>
@@ -8344,8 +8802,8 @@
         </w:r>
       </w:hyperlink>
     </w:p>
-    <w:bookmarkEnd w:id="179"/>
-    <w:bookmarkStart w:id="220" w:name="X44d40bf00da22ae7964042ce405e689f990f923"/>
+    <w:bookmarkEnd w:id="181"/>
+    <w:bookmarkStart w:id="222" w:name="X44d40bf00da22ae7964042ce405e689f990f923"/>
     <w:p>
       <w:pPr>
         <w:pStyle w:val="Heading2"/>
@@ -8377,7 +8835,7 @@
       <w:r>
         <w:t xml:space="preserve"> </w:t>
       </w:r>
-      <w:hyperlink r:id="rId180">
+      <w:hyperlink r:id="rId182">
         <w:r>
           <w:rPr>
             <w:rStyle w:val="Hyperlink"/>
@@ -8409,7 +8867,7 @@
       <w:r>
         <w:t xml:space="preserve"> </w:t>
       </w:r>
-      <w:hyperlink r:id="rId181">
+      <w:hyperlink r:id="rId183">
         <w:r>
           <w:rPr>
             <w:rStyle w:val="Hyperlink"/>
@@ -8441,7 +8899,7 @@
       <w:r>
         <w:t xml:space="preserve"> </w:t>
       </w:r>
-      <w:hyperlink r:id="rId182">
+      <w:hyperlink r:id="rId184">
         <w:r>
           <w:rPr>
             <w:rStyle w:val="Hyperlink"/>
@@ -8473,7 +8931,7 @@
       <w:r>
         <w:t xml:space="preserve"> </w:t>
       </w:r>
-      <w:hyperlink r:id="rId183">
+      <w:hyperlink r:id="rId185">
         <w:r>
           <w:rPr>
             <w:rStyle w:val="Hyperlink"/>
@@ -8505,7 +8963,7 @@
       <w:r>
         <w:t xml:space="preserve"> </w:t>
       </w:r>
-      <w:hyperlink r:id="rId184">
+      <w:hyperlink r:id="rId186">
         <w:r>
           <w:rPr>
             <w:rStyle w:val="Hyperlink"/>
@@ -8537,7 +8995,7 @@
       <w:r>
         <w:t xml:space="preserve"> </w:t>
       </w:r>
-      <w:hyperlink r:id="rId185">
+      <w:hyperlink r:id="rId187">
         <w:r>
           <w:rPr>
             <w:rStyle w:val="Hyperlink"/>
@@ -8569,7 +9027,7 @@
       <w:r>
         <w:t xml:space="preserve"> </w:t>
       </w:r>
-      <w:hyperlink r:id="rId186">
+      <w:hyperlink r:id="rId188">
         <w:r>
           <w:rPr>
             <w:rStyle w:val="Hyperlink"/>
@@ -8601,7 +9059,7 @@
       <w:r>
         <w:t xml:space="preserve"> </w:t>
       </w:r>
-      <w:hyperlink r:id="rId187">
+      <w:hyperlink r:id="rId189">
         <w:r>
           <w:rPr>
             <w:rStyle w:val="Hyperlink"/>
@@ -8633,7 +9091,7 @@
       <w:r>
         <w:t xml:space="preserve"> </w:t>
       </w:r>
-      <w:hyperlink r:id="rId188">
+      <w:hyperlink r:id="rId190">
         <w:r>
           <w:rPr>
             <w:rStyle w:val="Hyperlink"/>
@@ -8665,7 +9123,7 @@
       <w:r>
         <w:t xml:space="preserve"> </w:t>
       </w:r>
-      <w:hyperlink r:id="rId189">
+      <w:hyperlink r:id="rId191">
         <w:r>
           <w:rPr>
             <w:rStyle w:val="Hyperlink"/>
@@ -8697,7 +9155,7 @@
       <w:r>
         <w:t xml:space="preserve"> </w:t>
       </w:r>
-      <w:hyperlink r:id="rId190">
+      <w:hyperlink r:id="rId192">
         <w:r>
           <w:rPr>
             <w:rStyle w:val="Hyperlink"/>
@@ -8729,7 +9187,7 @@
       <w:r>
         <w:t xml:space="preserve"> </w:t>
       </w:r>
-      <w:hyperlink r:id="rId191">
+      <w:hyperlink r:id="rId193">
         <w:r>
           <w:rPr>
             <w:rStyle w:val="Hyperlink"/>
@@ -8761,7 +9219,7 @@
       <w:r>
         <w:t xml:space="preserve"> </w:t>
       </w:r>
-      <w:hyperlink r:id="rId192">
+      <w:hyperlink r:id="rId194">
         <w:r>
           <w:rPr>
             <w:rStyle w:val="Hyperlink"/>
@@ -8793,7 +9251,7 @@
       <w:r>
         <w:t xml:space="preserve"> </w:t>
       </w:r>
-      <w:hyperlink r:id="rId193">
+      <w:hyperlink r:id="rId195">
         <w:r>
           <w:rPr>
             <w:rStyle w:val="Hyperlink"/>
@@ -8825,7 +9283,7 @@
       <w:r>
         <w:t xml:space="preserve"> </w:t>
       </w:r>
-      <w:hyperlink r:id="rId194">
+      <w:hyperlink r:id="rId196">
         <w:r>
           <w:rPr>
             <w:rStyle w:val="Hyperlink"/>
@@ -8857,7 +9315,7 @@
       <w:r>
         <w:t xml:space="preserve"> </w:t>
       </w:r>
-      <w:hyperlink r:id="rId195">
+      <w:hyperlink r:id="rId197">
         <w:r>
           <w:rPr>
             <w:rStyle w:val="Hyperlink"/>
@@ -8889,7 +9347,7 @@
       <w:r>
         <w:t xml:space="preserve"> </w:t>
       </w:r>
-      <w:hyperlink r:id="rId196">
+      <w:hyperlink r:id="rId198">
         <w:r>
           <w:rPr>
             <w:rStyle w:val="Hyperlink"/>
@@ -8921,7 +9379,7 @@
       <w:r>
         <w:t xml:space="preserve"> </w:t>
       </w:r>
-      <w:hyperlink r:id="rId197">
+      <w:hyperlink r:id="rId199">
         <w:r>
           <w:rPr>
             <w:rStyle w:val="Hyperlink"/>
@@ -8948,12 +9406,12 @@
         <w:t xml:space="preserve">Journal of International Entrepreneurship</w:t>
       </w:r>
       <w:r>
-        <w:t xml:space="preserve">, 1–27.</w:t>
-      </w:r>
-      <w:r>
-        <w:t xml:space="preserve"> </w:t>
-      </w:r>
-      <w:hyperlink r:id="rId198">
+        <w:t xml:space="preserve">. Advance online publication.</w:t>
+      </w:r>
+      <w:r>
+        <w:t xml:space="preserve"> </w:t>
+      </w:r>
+      <w:hyperlink r:id="rId200">
         <w:r>
           <w:rPr>
             <w:rStyle w:val="Hyperlink"/>
@@ -8985,7 +9443,7 @@
       <w:r>
         <w:t xml:space="preserve"> </w:t>
       </w:r>
-      <w:hyperlink r:id="rId199">
+      <w:hyperlink r:id="rId201">
         <w:r>
           <w:rPr>
             <w:rStyle w:val="Hyperlink"/>
@@ -9017,7 +9475,7 @@
       <w:r>
         <w:t xml:space="preserve"> </w:t>
       </w:r>
-      <w:hyperlink r:id="rId200">
+      <w:hyperlink r:id="rId202">
         <w:r>
           <w:rPr>
             <w:rStyle w:val="Hyperlink"/>
@@ -9049,7 +9507,7 @@
       <w:r>
         <w:t xml:space="preserve"> </w:t>
       </w:r>
-      <w:hyperlink r:id="rId201">
+      <w:hyperlink r:id="rId203">
         <w:r>
           <w:rPr>
             <w:rStyle w:val="Hyperlink"/>
@@ -9081,7 +9539,7 @@
       <w:r>
         <w:t xml:space="preserve"> </w:t>
       </w:r>
-      <w:hyperlink r:id="rId202">
+      <w:hyperlink r:id="rId204">
         <w:r>
           <w:rPr>
             <w:rStyle w:val="Hyperlink"/>
@@ -9113,7 +9571,7 @@
       <w:r>
         <w:t xml:space="preserve"> </w:t>
       </w:r>
-      <w:hyperlink r:id="rId203">
+      <w:hyperlink r:id="rId205">
         <w:r>
           <w:rPr>
             <w:rStyle w:val="Hyperlink"/>
@@ -9145,7 +9603,7 @@
       <w:r>
         <w:t xml:space="preserve"> </w:t>
       </w:r>
-      <w:hyperlink r:id="rId204">
+      <w:hyperlink r:id="rId206">
         <w:r>
           <w:rPr>
             <w:rStyle w:val="Hyperlink"/>
@@ -9177,7 +9635,7 @@
       <w:r>
         <w:t xml:space="preserve"> </w:t>
       </w:r>
-      <w:hyperlink r:id="rId205">
+      <w:hyperlink r:id="rId207">
         <w:r>
           <w:rPr>
             <w:rStyle w:val="Hyperlink"/>
@@ -9209,7 +9667,7 @@
       <w:r>
         <w:t xml:space="preserve"> </w:t>
       </w:r>
-      <w:hyperlink r:id="rId206">
+      <w:hyperlink r:id="rId208">
         <w:r>
           <w:rPr>
             <w:rStyle w:val="Hyperlink"/>
@@ -9241,7 +9699,7 @@
       <w:r>
         <w:t xml:space="preserve"> </w:t>
       </w:r>
-      <w:hyperlink r:id="rId207">
+      <w:hyperlink r:id="rId209">
         <w:r>
           <w:rPr>
             <w:rStyle w:val="Hyperlink"/>
@@ -9273,7 +9731,7 @@
       <w:r>
         <w:t xml:space="preserve"> </w:t>
       </w:r>
-      <w:hyperlink r:id="rId208">
+      <w:hyperlink r:id="rId210">
         <w:r>
           <w:rPr>
             <w:rStyle w:val="Hyperlink"/>
@@ -9305,7 +9763,7 @@
       <w:r>
         <w:t xml:space="preserve"> </w:t>
       </w:r>
-      <w:hyperlink r:id="rId209">
+      <w:hyperlink r:id="rId211">
         <w:r>
           <w:rPr>
             <w:rStyle w:val="Hyperlink"/>
@@ -9337,7 +9795,7 @@
       <w:r>
         <w:t xml:space="preserve"> </w:t>
       </w:r>
-      <w:hyperlink r:id="rId210">
+      <w:hyperlink r:id="rId212">
         <w:r>
           <w:rPr>
             <w:rStyle w:val="Hyperlink"/>
@@ -9369,7 +9827,7 @@
       <w:r>
         <w:t xml:space="preserve"> </w:t>
       </w:r>
-      <w:hyperlink r:id="rId211">
+      <w:hyperlink r:id="rId213">
         <w:r>
           <w:rPr>
             <w:rStyle w:val="Hyperlink"/>
@@ -9401,7 +9859,7 @@
       <w:r>
         <w:t xml:space="preserve"> </w:t>
       </w:r>
-      <w:hyperlink r:id="rId212">
+      <w:hyperlink r:id="rId214">
         <w:r>
           <w:rPr>
             <w:rStyle w:val="Hyperlink"/>
@@ -9433,7 +9891,7 @@
       <w:r>
         <w:t xml:space="preserve"> </w:t>
       </w:r>
-      <w:hyperlink r:id="rId213">
+      <w:hyperlink r:id="rId215">
         <w:r>
           <w:rPr>
             <w:rStyle w:val="Hyperlink"/>
@@ -9465,7 +9923,7 @@
       <w:r>
         <w:t xml:space="preserve"> </w:t>
       </w:r>
-      <w:hyperlink r:id="rId214">
+      <w:hyperlink r:id="rId216">
         <w:r>
           <w:rPr>
             <w:rStyle w:val="Hyperlink"/>
@@ -9497,7 +9955,7 @@
       <w:r>
         <w:t xml:space="preserve"> </w:t>
       </w:r>
-      <w:hyperlink r:id="rId215">
+      <w:hyperlink r:id="rId217">
         <w:r>
           <w:rPr>
             <w:rStyle w:val="Hyperlink"/>
@@ -9529,7 +9987,7 @@
       <w:r>
         <w:t xml:space="preserve"> </w:t>
       </w:r>
-      <w:hyperlink r:id="rId216">
+      <w:hyperlink r:id="rId218">
         <w:r>
           <w:rPr>
             <w:rStyle w:val="Hyperlink"/>
@@ -9561,7 +10019,7 @@
       <w:r>
         <w:t xml:space="preserve"> </w:t>
       </w:r>
-      <w:hyperlink r:id="rId217">
+      <w:hyperlink r:id="rId219">
         <w:r>
           <w:rPr>
             <w:rStyle w:val="Hyperlink"/>
@@ -9593,7 +10051,7 @@
       <w:r>
         <w:t xml:space="preserve"> </w:t>
       </w:r>
-      <w:hyperlink r:id="rId218">
+      <w:hyperlink r:id="rId220">
         <w:r>
           <w:rPr>
             <w:rStyle w:val="Hyperlink"/>
@@ -9646,7 +10104,7 @@
       <w:r>
         <w:t xml:space="preserve"> </w:t>
       </w:r>
-      <w:hyperlink r:id="rId219">
+      <w:hyperlink r:id="rId221">
         <w:r>
           <w:rPr>
             <w:rStyle w:val="Hyperlink"/>
@@ -9655,8 +10113,8 @@
         </w:r>
       </w:hyperlink>
     </w:p>
-    <w:bookmarkEnd w:id="220"/>
-    <w:bookmarkStart w:id="223" w:name="X13ca3423c1f2d995bab900015dad5abfa63892f"/>
+    <w:bookmarkEnd w:id="222"/>
+    <w:bookmarkStart w:id="225" w:name="X13ca3423c1f2d995bab900015dad5abfa63892f"/>
     <w:p>
       <w:pPr>
         <w:pStyle w:val="Heading2"/>
@@ -9711,7 +10169,7 @@
       <w:r>
         <w:t xml:space="preserve"> </w:t>
       </w:r>
-      <w:hyperlink r:id="rId221">
+      <w:hyperlink r:id="rId223">
         <w:r>
           <w:rPr>
             <w:rStyle w:val="Hyperlink"/>
@@ -9743,7 +10201,7 @@
       <w:r>
         <w:t xml:space="preserve"> </w:t>
       </w:r>
-      <w:hyperlink r:id="rId222">
+      <w:hyperlink r:id="rId224">
         <w:r>
           <w:rPr>
             <w:rStyle w:val="Hyperlink"/>
@@ -9752,11 +10210,11 @@
         </w:r>
       </w:hyperlink>
     </w:p>
-    <w:bookmarkEnd w:id="223"/>
-    <w:bookmarkEnd w:id="224"/>
+    <w:bookmarkEnd w:id="225"/>
+    <w:bookmarkEnd w:id="226"/>
     <w:sectPr>
       <w:pgSz w:h="16838" w:w="11906"/>
-      <w:pgMar w:bottom="1134" w:left="1701" w:right="1134" w:top="1134"/>
+      <w:pgMar w:bottom="1417" w:left="1417" w:right="1417" w:top="1417"/>
     </w:sectPr>
   </w:body>
 </w:document>
@@ -9954,6 +10412,9 @@
   <w:num w:numId="1004">
     <w:abstractNumId w:val="991"/>
   </w:num>
+  <w:num w:numId="1005">
+    <w:abstractNumId w:val="991"/>
+  </w:num>
 </w:numbering>
 </file>
 
@@ -9979,13 +10440,13 @@
     <w:name w:val="Normal"/>
     <w:qFormat/>
     <w:pPr>
-      <w:spacing w:line="360" w:lineRule="auto"/>
+      <w:spacing w:line="276" w:lineRule="auto"/>
       <w:jc w:val="both"/>
     </w:pPr>
     <w:rPr>
       <w:rFonts w:ascii="Times New Roman" w:eastAsia="Times New Roman" w:hAnsi="Times New Roman"/>
       <w:color w:val="000000"/>
-      <w:sz w:val="26"/>
+      <w:sz w:val="24"/>
     </w:rPr>
   </w:style>
   <w:style w:styleId="BodyText" w:type="paragraph">
@@ -9993,14 +10454,14 @@
     <w:basedOn w:val="Normal"/>
     <w:link w:val="BodyTextChar"/>
     <w:pPr>
-      <w:spacing w:after="180" w:before="180" w:line="360" w:lineRule="auto"/>
+      <w:spacing w:after="180" w:before="180" w:line="276" w:lineRule="auto"/>
       <w:jc w:val="both"/>
     </w:pPr>
     <w:qFormat/>
     <w:rPr>
       <w:rFonts w:ascii="Times New Roman" w:eastAsia="Times New Roman" w:hAnsi="Times New Roman"/>
       <w:color w:val="000000"/>
-      <w:sz w:val="26"/>
+      <w:sz w:val="24"/>
     </w:rPr>
   </w:style>
   <w:style w:customStyle="1" w:styleId="FirstParagraph" w:type="paragraph">
@@ -10009,13 +10470,13 @@
     <w:next w:val="BodyText"/>
     <w:qFormat/>
     <w:pPr>
-      <w:spacing w:line="360" w:lineRule="auto"/>
+      <w:spacing w:line="276" w:lineRule="auto"/>
       <w:jc w:val="both"/>
     </w:pPr>
     <w:rPr>
       <w:rFonts w:ascii="Times New Roman" w:eastAsia="Times New Roman" w:hAnsi="Times New Roman"/>
       <w:color w:val="000000"/>
-      <w:sz w:val="26"/>
+      <w:sz w:val="24"/>
     </w:rPr>
   </w:style>
   <w:style w:customStyle="1" w:styleId="Compact" w:type="paragraph">
@@ -10023,13 +10484,13 @@
     <w:basedOn w:val="BodyText"/>
     <w:qFormat/>
     <w:pPr>
-      <w:spacing w:after="36" w:before="36" w:line="360" w:lineRule="auto"/>
+      <w:spacing w:after="36" w:before="36" w:line="276" w:lineRule="auto"/>
       <w:jc w:val="both"/>
     </w:pPr>
     <w:rPr>
       <w:rFonts w:ascii="Times New Roman" w:eastAsia="Times New Roman" w:hAnsi="Times New Roman"/>
       <w:color w:val="000000"/>
-      <w:sz w:val="26"/>
+      <w:sz w:val="24"/>
     </w:rPr>
   </w:style>
   <w:style w:styleId="Title" w:type="paragraph">
@@ -10040,7 +10501,7 @@
     <w:pPr>
       <w:keepNext/>
       <w:keepLines/>
-      <w:spacing w:after="240" w:before="480" w:line="360" w:lineRule="auto"/>
+      <w:spacing w:after="240" w:before="480" w:line="276" w:lineRule="auto"/>
       <w:jc w:val="both"/>
     </w:pPr>
     <w:rPr>
@@ -10048,7 +10509,7 @@
       <w:b/>
       <w:bCs/>
       <w:color w:val="000000"/>
-      <w:sz w:val="26"/>
+      <w:sz w:val="24"/>
       <w:szCs w:val="36"/>
     </w:rPr>
   </w:style>
@@ -10060,13 +10521,13 @@
     <w:pPr>
       <w:keepNext/>
       <w:keepLines/>
-      <w:spacing w:after="240" w:before="240" w:line="360" w:lineRule="auto"/>
+      <w:spacing w:after="240" w:before="240" w:line="276" w:lineRule="auto"/>
       <w:jc w:val="both"/>
     </w:pPr>
     <w:rPr>
       <w:rFonts w:ascii="Times New Roman" w:eastAsia="Times New Roman" w:hAnsi="Times New Roman"/>
       <w:color w:val="000000"/>
-      <w:sz w:val="26"/>
+      <w:sz w:val="24"/>
       <w:szCs w:val="30"/>
     </w:rPr>
   </w:style>
@@ -10077,13 +10538,13 @@
     <w:pPr>
       <w:keepNext/>
       <w:keepLines/>
-      <w:spacing w:line="360" w:lineRule="auto"/>
+      <w:spacing w:line="276" w:lineRule="auto"/>
       <w:jc w:val="both"/>
     </w:pPr>
     <w:rPr>
       <w:rFonts w:ascii="Times New Roman" w:eastAsia="Times New Roman" w:hAnsi="Times New Roman"/>
       <w:color w:val="000000"/>
-      <w:sz w:val="26"/>
+      <w:sz w:val="24"/>
     </w:rPr>
   </w:style>
   <w:style w:styleId="Date" w:type="paragraph">
@@ -10093,13 +10554,13 @@
     <w:pPr>
       <w:keepNext/>
       <w:keepLines/>
-      <w:spacing w:line="360" w:lineRule="auto"/>
+      <w:spacing w:line="276" w:lineRule="auto"/>
       <w:jc w:val="both"/>
     </w:pPr>
     <w:rPr>
       <w:rFonts w:ascii="Times New Roman" w:eastAsia="Times New Roman" w:hAnsi="Times New Roman"/>
       <w:color w:val="000000"/>
-      <w:sz w:val="26"/>
+      <w:sz w:val="24"/>
     </w:rPr>
   </w:style>
   <w:style w:customStyle="1" w:styleId="AbstractTitle" w:type="paragraph">
@@ -10111,11 +10572,11 @@
       <w:keepNext/>
       <w:keepLines/>
       <w:jc w:val="both"/>
-      <w:spacing w:after="0" w:before="300" w:line="360" w:lineRule="auto"/>
+      <w:spacing w:after="0" w:before="300" w:line="276" w:lineRule="auto"/>
     </w:pPr>
     <w:rPr>
       <w:color w:val="000000"/>
-      <w:sz w:val="26"/>
+      <w:sz w:val="24"/>
       <w:szCs w:val="20"/>
       <w:rFonts w:ascii="Times New Roman" w:eastAsia="Times New Roman" w:hAnsi="Times New Roman"/>
       <w:b/>
@@ -10129,13 +10590,13 @@
     <w:pPr>
       <w:keepNext/>
       <w:keepLines/>
-      <w:spacing w:after="300" w:before="100" w:line="360" w:lineRule="auto"/>
+      <w:spacing w:after="300" w:before="100" w:line="276" w:lineRule="auto"/>
       <w:jc w:val="both"/>
     </w:pPr>
     <w:rPr>
       <w:rFonts w:ascii="Times New Roman" w:eastAsia="Times New Roman" w:hAnsi="Times New Roman"/>
       <w:color w:val="000000"/>
-      <w:sz w:val="26"/>
+      <w:sz w:val="24"/>
       <w:szCs w:val="20"/>
     </w:rPr>
   </w:style>
@@ -10145,13 +10606,13 @@
     <w:next w:val="Bibliography"/>
     <w:qFormat/>
     <w:pPr>
-      <w:spacing w:line="360" w:lineRule="auto"/>
+      <w:spacing w:line="276" w:lineRule="auto"/>
       <w:jc w:val="both"/>
     </w:pPr>
     <w:rPr>
       <w:rFonts w:ascii="Times New Roman" w:eastAsia="Times New Roman" w:hAnsi="Times New Roman"/>
       <w:color w:val="000000"/>
-      <w:sz w:val="26"/>
+      <w:sz w:val="24"/>
     </w:rPr>
   </w:style>
   <w:style w:styleId="Heading1" w:type="paragraph">
@@ -10163,7 +10624,7 @@
     <w:pPr>
       <w:keepNext/>
       <w:keepLines/>
-      <w:spacing w:after="0" w:before="480" w:line="360" w:lineRule="auto"/>
+      <w:spacing w:after="0" w:before="480" w:line="276" w:lineRule="auto"/>
       <w:jc w:val="both"/>
       <w:outlineLvl w:val="0"/>
     </w:pPr>
@@ -10172,7 +10633,7 @@
       <w:b/>
       <w:bCs/>
       <w:color w:val="000000"/>
-      <w:sz w:val="26"/>
+      <w:sz w:val="24"/>
       <w:szCs w:val="32"/>
     </w:rPr>
   </w:style>
@@ -10186,7 +10647,7 @@
     <w:pPr>
       <w:keepNext/>
       <w:keepLines/>
-      <w:spacing w:after="0" w:before="200" w:line="360" w:lineRule="auto"/>
+      <w:spacing w:after="0" w:before="200" w:line="276" w:lineRule="auto"/>
       <w:jc w:val="both"/>
       <w:outlineLvl w:val="1"/>
     </w:pPr>
@@ -10195,7 +10656,7 @@
       <w:b/>
       <w:bCs/>
       <w:color w:val="000000"/>
-      <w:sz w:val="26"/>
+      <w:sz w:val="24"/>
       <w:szCs w:val="28"/>
     </w:rPr>
   </w:style>
@@ -10209,7 +10670,7 @@
     <w:pPr>
       <w:keepNext/>
       <w:keepLines/>
-      <w:spacing w:after="0" w:before="200" w:line="360" w:lineRule="auto"/>
+      <w:spacing w:after="0" w:before="200" w:line="276" w:lineRule="auto"/>
       <w:jc w:val="both"/>
       <w:outlineLvl w:val="2"/>
     </w:pPr>
@@ -10218,7 +10679,7 @@
       <w:b/>
       <w:bCs/>
       <w:color w:val="000000"/>
-      <w:sz w:val="26"/>
+      <w:sz w:val="24"/>
       <w:szCs w:val="24"/>
     </w:rPr>
   </w:style>
@@ -10232,7 +10693,7 @@
     <w:pPr>
       <w:keepNext/>
       <w:keepLines/>
-      <w:spacing w:after="0" w:before="200" w:line="360" w:lineRule="auto"/>
+      <w:spacing w:after="0" w:before="200" w:line="276" w:lineRule="auto"/>
       <w:jc w:val="both"/>
       <w:outlineLvl w:val="3"/>
     </w:pPr>
@@ -10241,7 +10702,7 @@
       <w:i/>
       <w:bCs/>
       <w:color w:val="000000"/>
-      <w:sz w:val="26"/>
+      <w:sz w:val="24"/>
       <w:szCs w:val="24"/>
     </w:rPr>
   </w:style>
@@ -10255,7 +10716,7 @@
     <w:pPr>
       <w:keepNext/>
       <w:keepLines/>
-      <w:spacing w:after="0" w:before="200" w:line="360" w:lineRule="auto"/>
+      <w:spacing w:after="0" w:before="200" w:line="276" w:lineRule="auto"/>
       <w:jc w:val="both"/>
       <w:outlineLvl w:val="4"/>
     </w:pPr>
@@ -10263,7 +10724,7 @@
       <w:rFonts w:ascii="Times New Roman" w:asciiTheme="majorHAnsi" w:cstheme="majorBidi" w:eastAsia="Times New Roman" w:eastAsiaTheme="majorEastAsia" w:hAnsi="Times New Roman" w:hAnsiTheme="majorHAnsi"/>
       <w:iCs/>
       <w:color w:val="000000"/>
-      <w:sz w:val="26"/>
+      <w:sz w:val="24"/>
       <w:szCs w:val="24"/>
     </w:rPr>
   </w:style>
@@ -10277,14 +10738,14 @@
     <w:pPr>
       <w:keepNext/>
       <w:keepLines/>
-      <w:spacing w:after="0" w:before="200" w:line="360" w:lineRule="auto"/>
+      <w:spacing w:after="0" w:before="200" w:line="276" w:lineRule="auto"/>
       <w:jc w:val="both"/>
       <w:outlineLvl w:val="5"/>
     </w:pPr>
     <w:rPr>
       <w:rFonts w:ascii="Times New Roman" w:asciiTheme="majorHAnsi" w:cstheme="majorBidi" w:eastAsia="Times New Roman" w:eastAsiaTheme="majorEastAsia" w:hAnsi="Times New Roman" w:hAnsiTheme="majorHAnsi"/>
       <w:color w:val="000000"/>
-      <w:sz w:val="26"/>
+      <w:sz w:val="24"/>
       <w:szCs w:val="24"/>
     </w:rPr>
   </w:style>
@@ -10298,14 +10759,14 @@
     <w:pPr>
       <w:keepNext/>
       <w:keepLines/>
-      <w:spacing w:after="0" w:before="200" w:line="360" w:lineRule="auto"/>
+      <w:spacing w:after="0" w:before="200" w:line="276" w:lineRule="auto"/>
       <w:jc w:val="both"/>
       <w:outlineLvl w:val="6"/>
     </w:pPr>
     <w:rPr>
       <w:rFonts w:ascii="Times New Roman" w:asciiTheme="majorHAnsi" w:cstheme="majorBidi" w:eastAsia="Times New Roman" w:eastAsiaTheme="majorEastAsia" w:hAnsi="Times New Roman" w:hAnsiTheme="majorHAnsi"/>
       <w:color w:val="000000"/>
-      <w:sz w:val="26"/>
+      <w:sz w:val="24"/>
       <w:szCs w:val="24"/>
     </w:rPr>
   </w:style>
@@ -10319,14 +10780,14 @@
     <w:pPr>
       <w:keepNext/>
       <w:keepLines/>
-      <w:spacing w:after="0" w:before="200" w:line="360" w:lineRule="auto"/>
+      <w:spacing w:after="0" w:before="200" w:line="276" w:lineRule="auto"/>
       <w:jc w:val="both"/>
       <w:outlineLvl w:val="7"/>
     </w:pPr>
     <w:rPr>
       <w:rFonts w:ascii="Times New Roman" w:asciiTheme="majorHAnsi" w:cstheme="majorBidi" w:eastAsia="Times New Roman" w:eastAsiaTheme="majorEastAsia" w:hAnsi="Times New Roman" w:hAnsiTheme="majorHAnsi"/>
       <w:color w:val="000000"/>
-      <w:sz w:val="26"/>
+      <w:sz w:val="24"/>
       <w:szCs w:val="24"/>
     </w:rPr>
   </w:style>
@@ -10340,14 +10801,14 @@
     <w:pPr>
       <w:keepNext/>
       <w:keepLines/>
-      <w:spacing w:after="0" w:before="200" w:line="360" w:lineRule="auto"/>
+      <w:spacing w:after="0" w:before="200" w:line="276" w:lineRule="auto"/>
       <w:jc w:val="both"/>
       <w:outlineLvl w:val="8"/>
     </w:pPr>
     <w:rPr>
       <w:rFonts w:ascii="Times New Roman" w:asciiTheme="majorHAnsi" w:cstheme="majorBidi" w:eastAsia="Times New Roman" w:eastAsiaTheme="majorEastAsia" w:hAnsi="Times New Roman" w:hAnsiTheme="majorHAnsi"/>
       <w:color w:val="000000"/>
-      <w:sz w:val="26"/>
+      <w:sz w:val="24"/>
       <w:szCs w:val="24"/>
     </w:rPr>
   </w:style>
@@ -10359,14 +10820,14 @@
     <w:unhideWhenUsed/>
     <w:qFormat/>
     <w:pPr>
-      <w:spacing w:after="100" w:before="100" w:line="360" w:lineRule="auto"/>
+      <w:spacing w:after="100" w:before="100" w:line="276" w:lineRule="auto"/>
       <w:ind w:firstLine="0" w:left="480" w:right="480"/>
       <w:jc w:val="both"/>
     </w:pPr>
     <w:rPr>
       <w:rFonts w:ascii="Times New Roman" w:eastAsia="Times New Roman" w:hAnsi="Times New Roman"/>
       <w:color w:val="000000"/>
-      <w:sz w:val="26"/>
+      <w:sz w:val="24"/>
     </w:rPr>
   </w:style>
   <w:style w:styleId="FootnoteText" w:type="paragraph">
@@ -10377,13 +10838,13 @@
     <w:unhideWhenUsed/>
     <w:qFormat/>
     <w:pPr>
-      <w:spacing w:line="360" w:lineRule="auto"/>
+      <w:spacing w:line="276" w:lineRule="auto"/>
       <w:jc w:val="both"/>
     </w:pPr>
     <w:rPr>
       <w:rFonts w:ascii="Times New Roman" w:eastAsia="Times New Roman" w:hAnsi="Times New Roman"/>
       <w:color w:val="000000"/>
-      <w:sz w:val="26"/>
+      <w:sz w:val="24"/>
     </w:rPr>
   </w:style>
   <w:style w:default="1" w:styleId="DefaultParagraphFont" w:type="character">
@@ -10393,7 +10854,7 @@
     <w:rPr>
       <w:rFonts w:ascii="Times New Roman" w:eastAsia="Times New Roman" w:hAnsi="Times New Roman"/>
       <w:color w:val="000000"/>
-      <w:sz w:val="26"/>
+      <w:sz w:val="24"/>
     </w:rPr>
   </w:style>
   <w:style w:default="1" w:styleId="Table" w:type="table">
@@ -10403,13 +10864,13 @@
     <w:unhideWhenUsed/>
     <w:qFormat/>
     <w:pPr>
-      <w:spacing w:line="360" w:lineRule="auto"/>
+      <w:spacing w:line="276" w:lineRule="auto"/>
       <w:jc w:val="both"/>
     </w:pPr>
     <w:rPr>
       <w:rFonts w:ascii="Times New Roman" w:eastAsia="Times New Roman" w:hAnsi="Times New Roman"/>
       <w:color w:val="000000"/>
-      <w:sz w:val="26"/>
+      <w:sz w:val="24"/>
     </w:rPr>
     <w:tblPr>
       <w:tblInd w:type="dxa" w:w="0"/>
@@ -10443,27 +10904,27 @@
     <w:pPr>
       <w:keepNext/>
       <w:keepLines/>
-      <w:spacing w:after="0" w:line="360" w:lineRule="auto"/>
+      <w:spacing w:after="0" w:line="276" w:lineRule="auto"/>
       <w:jc w:val="both"/>
     </w:pPr>
     <w:rPr>
       <w:rFonts w:ascii="Times New Roman" w:eastAsia="Times New Roman" w:hAnsi="Times New Roman"/>
       <w:b/>
       <w:color w:val="000000"/>
-      <w:sz w:val="26"/>
+      <w:sz w:val="24"/>
     </w:rPr>
   </w:style>
   <w:style w:customStyle="1" w:styleId="Definition" w:type="paragraph">
     <w:name w:val="Definition"/>
     <w:basedOn w:val="Normal"/>
     <w:pPr>
-      <w:spacing w:line="360" w:lineRule="auto"/>
+      <w:spacing w:line="276" w:lineRule="auto"/>
       <w:jc w:val="both"/>
     </w:pPr>
     <w:rPr>
       <w:rFonts w:ascii="Times New Roman" w:eastAsia="Times New Roman" w:hAnsi="Times New Roman"/>
       <w:color w:val="000000"/>
-      <w:sz w:val="26"/>
+      <w:sz w:val="24"/>
     </w:rPr>
   </w:style>
   <w:style w:styleId="Caption" w:type="paragraph">
@@ -10471,14 +10932,14 @@
     <w:basedOn w:val="Normal"/>
     <w:link w:val="BodyTextChar"/>
     <w:pPr>
-      <w:spacing w:after="120" w:before="0" w:line="360" w:lineRule="auto"/>
+      <w:spacing w:after="120" w:before="0" w:line="276" w:lineRule="auto"/>
       <w:jc w:val="both"/>
     </w:pPr>
     <w:rPr>
       <w:rFonts w:ascii="Times New Roman" w:eastAsia="Times New Roman" w:hAnsi="Times New Roman"/>
       <w:i/>
       <w:color w:val="000000"/>
-      <w:sz w:val="26"/>
+      <w:sz w:val="24"/>
     </w:rPr>
   </w:style>
   <w:style w:customStyle="1" w:styleId="TableCaption" w:type="paragraph">
@@ -10486,39 +10947,39 @@
     <w:basedOn w:val="Caption"/>
     <w:pPr>
       <w:keepNext/>
-      <w:spacing w:line="360" w:lineRule="auto"/>
+      <w:spacing w:line="276" w:lineRule="auto"/>
       <w:jc w:val="both"/>
     </w:pPr>
     <w:rPr>
       <w:rFonts w:ascii="Times New Roman" w:eastAsia="Times New Roman" w:hAnsi="Times New Roman"/>
       <w:color w:val="000000"/>
-      <w:sz w:val="26"/>
+      <w:sz w:val="24"/>
     </w:rPr>
   </w:style>
   <w:style w:customStyle="1" w:styleId="ImageCaption" w:type="paragraph">
     <w:name w:val="Image Caption"/>
     <w:basedOn w:val="Caption"/>
     <w:pPr>
-      <w:spacing w:line="360" w:lineRule="auto"/>
+      <w:spacing w:line="276" w:lineRule="auto"/>
       <w:jc w:val="both"/>
     </w:pPr>
     <w:rPr>
       <w:rFonts w:ascii="Times New Roman" w:eastAsia="Times New Roman" w:hAnsi="Times New Roman"/>
       <w:color w:val="000000"/>
-      <w:sz w:val="26"/>
+      <w:sz w:val="24"/>
     </w:rPr>
   </w:style>
   <w:style w:customStyle="1" w:styleId="Figure" w:type="paragraph">
     <w:name w:val="Figure"/>
     <w:basedOn w:val="Normal"/>
     <w:pPr>
-      <w:spacing w:line="360" w:lineRule="auto"/>
+      <w:spacing w:line="276" w:lineRule="auto"/>
       <w:jc w:val="both"/>
     </w:pPr>
     <w:rPr>
       <w:rFonts w:ascii="Times New Roman" w:eastAsia="Times New Roman" w:hAnsi="Times New Roman"/>
       <w:color w:val="000000"/>
-      <w:sz w:val="26"/>
+      <w:sz w:val="24"/>
     </w:rPr>
   </w:style>
   <w:style w:customStyle="1" w:styleId="CaptionedFigure" w:type="paragraph">
@@ -10526,13 +10987,13 @@
     <w:basedOn w:val="Figure"/>
     <w:pPr>
       <w:keepNext/>
-      <w:spacing w:line="360" w:lineRule="auto"/>
+      <w:spacing w:line="276" w:lineRule="auto"/>
       <w:jc w:val="both"/>
     </w:pPr>
     <w:rPr>
       <w:rFonts w:ascii="Times New Roman" w:eastAsia="Times New Roman" w:hAnsi="Times New Roman"/>
       <w:color w:val="000000"/>
-      <w:sz w:val="26"/>
+      <w:sz w:val="24"/>
     </w:rPr>
   </w:style>
   <w:style w:customStyle="1" w:styleId="BodyTextChar" w:type="character">
@@ -10542,7 +11003,7 @@
     <w:rPr>
       <w:rFonts w:ascii="Times New Roman" w:eastAsia="Times New Roman" w:hAnsi="Times New Roman"/>
       <w:color w:val="000000"/>
-      <w:sz w:val="26"/>
+      <w:sz w:val="24"/>
     </w:rPr>
   </w:style>
   <w:style w:customStyle="1" w:styleId="VerbatimChar" w:type="character">
@@ -10551,7 +11012,7 @@
     <w:rPr>
       <w:rFonts w:ascii="Times New Roman" w:eastAsia="Times New Roman" w:hAnsi="Times New Roman"/>
       <w:color w:val="000000"/>
-      <w:sz w:val="26"/>
+      <w:sz w:val="24"/>
     </w:rPr>
   </w:style>
   <w:style w:customStyle="1" w:styleId="SectionNumber" w:type="character">
@@ -10560,7 +11021,7 @@
     <w:rPr>
       <w:rFonts w:ascii="Times New Roman" w:eastAsia="Times New Roman" w:hAnsi="Times New Roman"/>
       <w:color w:val="000000"/>
-      <w:sz w:val="26"/>
+      <w:sz w:val="24"/>
     </w:rPr>
   </w:style>
   <w:style w:styleId="FootnoteReference" w:type="character">
@@ -10569,7 +11030,7 @@
     <w:rPr>
       <w:rFonts w:ascii="Times New Roman" w:eastAsia="Times New Roman" w:hAnsi="Times New Roman"/>
       <w:color w:val="000000"/>
-      <w:sz w:val="26"/>
+      <w:sz w:val="24"/>
       <w:vertAlign w:val="superscript"/>
     </w:rPr>
   </w:style>
@@ -10579,7 +11040,7 @@
     <w:rPr>
       <w:rFonts w:ascii="Times New Roman" w:eastAsia="Times New Roman" w:hAnsi="Times New Roman"/>
       <w:color w:val="000000"/>
-      <w:sz w:val="26"/>
+      <w:sz w:val="24"/>
     </w:rPr>
   </w:style>
   <w:style w:styleId="TOCHeading" w:type="paragraph">
@@ -10590,7 +11051,7 @@
     <w:unhideWhenUsed/>
     <w:qFormat/>
     <w:pPr>
-      <w:spacing w:before="240" w:line="360" w:lineRule="auto"/>
+      <w:spacing w:before="240" w:line="276" w:lineRule="auto"/>
       <w:jc w:val="both"/>
       <w:outlineLvl w:val="9"/>
     </w:pPr>
@@ -10599,7 +11060,7 @@
       <w:b w:val="0"/>
       <w:bCs w:val="0"/>
       <w:color w:val="000000"/>
-      <w:sz w:val="26"/>
+      <w:sz w:val="24"/>
     </w:rPr>
   </w:style>
   <w:style w:type="paragraph" w:customStyle="1" w:styleId="SourceCode">

</xml_diff>

<commit_message>
fix(references): complete Poland paper author list from verified title page (drop et al.)
</commit_message>
<xml_diff>
--- a/dist/luan_an/04_references_apa7.docx
+++ b/dist/luan_an/04_references_apa7.docx
@@ -2,7 +2,7 @@
 <file path=word/document.xml><?xml version="1.0" encoding="utf-8"?>
 <w:document xmlns:w="http://schemas.openxmlformats.org/wordprocessingml/2006/main" xmlns:m="http://schemas.openxmlformats.org/officeDocument/2006/math" xmlns:r="http://schemas.openxmlformats.org/officeDocument/2006/relationships" xmlns:o="urn:schemas-microsoft-com:office:office" xmlns:v="urn:schemas-microsoft-com:vml" xmlns:w10="urn:schemas-microsoft-com:office:word" xmlns:a="http://schemas.openxmlformats.org/drawingml/2006/main" xmlns:pic="http://schemas.openxmlformats.org/drawingml/2006/picture" xmlns:wp="http://schemas.openxmlformats.org/drawingml/2006/wordprocessingDrawing">
   <w:body>
-    <w:bookmarkStart w:id="226" w:name="tài-liệu-tham-khảo--apa-7th"/>
+    <w:bookmarkStart w:id="270" w:name="tài-liệu-tham-khảo--apa-7th"/>
     <w:p>
       <w:pPr>
         <w:pStyle w:val="Heading1"/>
@@ -712,7 +712,7 @@
       </w:r>
     </w:p>
     <w:bookmarkEnd w:id="26"/>
-    <w:bookmarkStart w:id="30" w:name="X5a337ece5c5413393179767304bf5f4e51374ed"/>
+    <w:bookmarkStart w:id="31" w:name="X5a337ece5c5413393179767304bf5f4e51374ed"/>
     <w:p>
       <w:pPr>
         <w:pStyle w:val="Heading2"/>
@@ -831,6 +831,36 @@
         <w:pStyle w:val="BodyText"/>
       </w:pPr>
       <w:r>
+        <w:t xml:space="preserve">Cameron, A. C., Gelbach, J. B., &amp; Miller, D. L. (2008). Bootstrap-based improvements for inference with clustered errors.</w:t>
+      </w:r>
+      <w:r>
+        <w:t xml:space="preserve"> </w:t>
+      </w:r>
+      <w:r>
+        <w:rPr>
+          <w:iCs/>
+          <w:i/>
+        </w:rPr>
+        <w:t xml:space="preserve">Review of Economics and Statistics, 90</w:t>
+      </w:r>
+      <w:r>
+        <w:t xml:space="preserve">(3), 414–427.</w:t>
+      </w:r>
+      <w:r>
+        <w:t xml:space="preserve"> </w:t>
+      </w:r>
+      <w:hyperlink r:id="rId27">
+        <w:r>
+          <w:rPr>
+            <w:rStyle w:val="Hyperlink"/>
+          </w:rPr>
+          <w:t xml:space="preserve">https://doi.org/10.1162/rest.90.3.414</w:t>
+        </w:r>
+      </w:hyperlink>
+      <w:r>
+        <w:t xml:space="preserve"> </w:t>
+      </w:r>
+      <w:r>
         <w:t xml:space="preserve">Chen, J., &amp; Meng, Q. (2022). Institutional constraints and exporting of emerging-market firms.</w:t>
       </w:r>
       <w:r>
@@ -891,7 +921,7 @@
       <w:r>
         <w:t xml:space="preserve"> </w:t>
       </w:r>
-      <w:hyperlink r:id="rId27">
+      <w:hyperlink r:id="rId28">
         <w:r>
           <w:rPr>
             <w:rStyle w:val="Hyperlink"/>
@@ -937,7 +967,7 @@
       <w:r>
         <w:t xml:space="preserve"> </w:t>
       </w:r>
-      <w:hyperlink r:id="rId28">
+      <w:hyperlink r:id="rId29">
         <w:r>
           <w:rPr>
             <w:rStyle w:val="Hyperlink"/>
@@ -1056,7 +1086,7 @@
       <w:r>
         <w:t xml:space="preserve"> </w:t>
       </w:r>
-      <w:hyperlink r:id="rId29">
+      <w:hyperlink r:id="rId30">
         <w:r>
           <w:rPr>
             <w:rStyle w:val="Hyperlink"/>
@@ -1075,8 +1105,8 @@
         <w:t xml:space="preserve">(Mới v2.3 — 3.331 US-listed firms 82 nước; phân tách de jure exposure vs de facto enforcement.)</w:t>
       </w:r>
     </w:p>
-    <w:bookmarkEnd w:id="30"/>
-    <w:bookmarkStart w:id="33" w:name="X4dc7c720d366df8b38a71e333b66bad1e39cceb"/>
+    <w:bookmarkEnd w:id="31"/>
+    <w:bookmarkStart w:id="34" w:name="X4dc7c720d366df8b38a71e333b66bad1e39cceb"/>
     <w:p>
       <w:pPr>
         <w:pStyle w:val="Heading2"/>
@@ -1130,7 +1160,7 @@
       <w:r>
         <w:t xml:space="preserve"> </w:t>
       </w:r>
-      <w:hyperlink r:id="rId31">
+      <w:hyperlink r:id="rId32">
         <w:r>
           <w:rPr>
             <w:rStyle w:val="Hyperlink"/>
@@ -1186,7 +1216,7 @@
       <w:r>
         <w:t xml:space="preserve"> </w:t>
       </w:r>
-      <w:hyperlink r:id="rId32">
+      <w:hyperlink r:id="rId33">
         <w:r>
           <w:rPr>
             <w:rStyle w:val="Hyperlink"/>
@@ -1205,8 +1235,8 @@
         <w:t xml:space="preserve">(Mới v2.3)</w:t>
       </w:r>
     </w:p>
-    <w:bookmarkEnd w:id="33"/>
-    <w:bookmarkStart w:id="34" w:name="f-china-specific-research-cập-nhật-v22"/>
+    <w:bookmarkEnd w:id="34"/>
+    <w:bookmarkStart w:id="35" w:name="f-china-specific-research-cập-nhật-v22"/>
     <w:p>
       <w:pPr>
         <w:pStyle w:val="Heading2"/>
@@ -1362,8 +1392,8 @@
         <w:t xml:space="preserve">(2), e0262891.</w:t>
       </w:r>
     </w:p>
-    <w:bookmarkEnd w:id="34"/>
-    <w:bookmarkStart w:id="35" w:name="g-asianemne-empirical-cập-nhật-v23"/>
+    <w:bookmarkEnd w:id="35"/>
+    <w:bookmarkStart w:id="36" w:name="g-asianemne-empirical-cập-nhật-v23"/>
     <w:p>
       <w:pPr>
         <w:pStyle w:val="Heading2"/>
@@ -1600,8 +1630,8 @@
         <w:t xml:space="preserve">(Mới v2.3)</w:t>
       </w:r>
     </w:p>
-    <w:bookmarkEnd w:id="35"/>
-    <w:bookmarkStart w:id="36" w:name="h-firm-performance-đa-chiều"/>
+    <w:bookmarkEnd w:id="36"/>
+    <w:bookmarkStart w:id="37" w:name="h-firm-performance-đa-chiều"/>
     <w:p>
       <w:pPr>
         <w:pStyle w:val="Heading2"/>
@@ -1618,8 +1648,8 @@
         <w:t xml:space="preserve">(Giữ nguyên từ v2.1.)</w:t>
       </w:r>
     </w:p>
-    <w:bookmarkEnd w:id="36"/>
-    <w:bookmarkStart w:id="37" w:name="i-productivity-literature"/>
+    <w:bookmarkEnd w:id="37"/>
+    <w:bookmarkStart w:id="38" w:name="i-productivity-literature"/>
     <w:p>
       <w:pPr>
         <w:pStyle w:val="Heading2"/>
@@ -1636,8 +1666,8 @@
         <w:t xml:space="preserve">(Giữ nguyên từ v2.1 — Bloom, Sadun &amp; Van Reenen 2012; Cusolito &amp; Maloney 2018; Hsieh &amp; Klenow 2009 và 2014.)</w:t>
       </w:r>
     </w:p>
-    <w:bookmarkEnd w:id="37"/>
-    <w:bookmarkStart w:id="39" w:name="Xc0b45f0a81dbc51748d52800ac9aaca4c1459b4"/>
+    <w:bookmarkEnd w:id="38"/>
+    <w:bookmarkStart w:id="40" w:name="Xc0b45f0a81dbc51748d52800ac9aaca4c1459b4"/>
     <w:p>
       <w:pPr>
         <w:pStyle w:val="Heading2"/>
@@ -1691,7 +1721,7 @@
       <w:r>
         <w:t xml:space="preserve"> </w:t>
       </w:r>
-      <w:hyperlink r:id="rId38">
+      <w:hyperlink r:id="rId39">
         <w:r>
           <w:rPr>
             <w:rStyle w:val="Hyperlink"/>
@@ -1710,8 +1740,8 @@
         <w:t xml:space="preserve">(Mới v2.4 — 12-point data section transparency framework.)</w:t>
       </w:r>
     </w:p>
-    <w:bookmarkEnd w:id="39"/>
-    <w:bookmarkStart w:id="48" w:name="X012a16cc22d8acffd0752d6ea621445dc5bea91"/>
+    <w:bookmarkEnd w:id="40"/>
+    <w:bookmarkStart w:id="49" w:name="X012a16cc22d8acffd0752d6ea621445dc5bea91"/>
     <w:p>
       <w:pPr>
         <w:pStyle w:val="Heading2"/>
@@ -1725,7 +1755,7 @@
         <w:pStyle w:val="FirstParagraph"/>
       </w:pPr>
       <w:r>
-        <w:t xml:space="preserve">CIEM (Viện Nghiên cứu Quản lý Kinh tế Trung ương). (2023).</w:t>
+        <w:t xml:space="preserve">CIEM. (2023).</w:t>
       </w:r>
       <w:r>
         <w:t xml:space="preserve"> </w:t>
@@ -1738,7 +1768,10 @@
         <w:t xml:space="preserve">Báo cáo Năng lực cạnh tranh và hiệu quả doanh nghiệp Việt Nam 2023</w:t>
       </w:r>
       <w:r>
-        <w:t xml:space="preserve">. Nhà xuất bản Khoa học và Kỹ thuật.</w:t>
+        <w:t xml:space="preserve"> </w:t>
+      </w:r>
+      <w:r>
+        <w:t xml:space="preserve">[Central Institute for Economic Management]. Nhà xuất bản Khoa học và Kỹ thuật.</w:t>
       </w:r>
     </w:p>
     <w:p>
@@ -1785,7 +1818,7 @@
       <w:r>
         <w:t xml:space="preserve"> </w:t>
       </w:r>
-      <w:hyperlink r:id="rId40">
+      <w:hyperlink r:id="rId41">
         <w:r>
           <w:rPr>
             <w:rStyle w:val="Hyperlink"/>
@@ -1991,7 +2024,7 @@
       <w:r>
         <w:t xml:space="preserve"> </w:t>
       </w:r>
-      <w:hyperlink r:id="rId41">
+      <w:hyperlink r:id="rId42">
         <w:r>
           <w:rPr>
             <w:rStyle w:val="Hyperlink"/>
@@ -2071,7 +2104,7 @@
       <w:r>
         <w:t xml:space="preserve"> </w:t>
       </w:r>
-      <w:hyperlink r:id="rId41">
+      <w:hyperlink r:id="rId42">
         <w:r>
           <w:rPr>
             <w:rStyle w:val="Hyperlink"/>
@@ -2187,7 +2220,7 @@
       <w:r>
         <w:t xml:space="preserve"> </w:t>
       </w:r>
-      <w:hyperlink r:id="rId42">
+      <w:hyperlink r:id="rId43">
         <w:r>
           <w:rPr>
             <w:rStyle w:val="Hyperlink"/>
@@ -2453,7 +2486,7 @@
       <w:r>
         <w:t xml:space="preserve"> </w:t>
       </w:r>
-      <w:hyperlink r:id="rId43">
+      <w:hyperlink r:id="rId44">
         <w:r>
           <w:rPr>
             <w:rStyle w:val="Hyperlink"/>
@@ -2520,7 +2553,7 @@
       <w:r>
         <w:t xml:space="preserve"> </w:t>
       </w:r>
-      <w:hyperlink r:id="rId44">
+      <w:hyperlink r:id="rId45">
         <w:r>
           <w:rPr>
             <w:rStyle w:val="Hyperlink"/>
@@ -2562,7 +2595,7 @@
       <w:r>
         <w:t xml:space="preserve"> </w:t>
       </w:r>
-      <w:hyperlink r:id="rId45">
+      <w:hyperlink r:id="rId46">
         <w:r>
           <w:rPr>
             <w:rStyle w:val="Hyperlink"/>
@@ -2674,7 +2707,7 @@
       <w:r>
         <w:t xml:space="preserve"> </w:t>
       </w:r>
-      <w:hyperlink r:id="rId46">
+      <w:hyperlink r:id="rId47">
         <w:r>
           <w:rPr>
             <w:rStyle w:val="Hyperlink"/>
@@ -2851,7 +2884,7 @@
       <w:r>
         <w:t xml:space="preserve"> </w:t>
       </w:r>
-      <w:hyperlink r:id="rId47">
+      <w:hyperlink r:id="rId48">
         <w:r>
           <w:rPr>
             <w:rStyle w:val="Hyperlink"/>
@@ -3160,8 +3193,8 @@
         <w:t xml:space="preserve">. World Intellectual Property Organization.</w:t>
       </w:r>
     </w:p>
-    <w:bookmarkEnd w:id="48"/>
-    <w:bookmarkStart w:id="50" w:name="X6ffe906dc1ff8c67cfb5dc5a50c13ef10a28e5e"/>
+    <w:bookmarkEnd w:id="49"/>
+    <w:bookmarkStart w:id="51" w:name="X6ffe906dc1ff8c67cfb5dc5a50c13ef10a28e5e"/>
     <w:p>
       <w:pPr>
         <w:pStyle w:val="Heading2"/>
@@ -3283,7 +3316,7 @@
       <w:r>
         <w:t xml:space="preserve"> </w:t>
       </w:r>
-      <w:hyperlink r:id="rId49">
+      <w:hyperlink r:id="rId50">
         <w:r>
           <w:rPr>
             <w:rStyle w:val="Hyperlink"/>
@@ -3302,8 +3335,8 @@
         <w:t xml:space="preserve">(Mới v2.4)</w:t>
       </w:r>
     </w:p>
-    <w:bookmarkEnd w:id="50"/>
-    <w:bookmarkStart w:id="51" w:name="X4ee6cd8c0c36769021316519aa82da91e5c1689"/>
+    <w:bookmarkEnd w:id="51"/>
+    <w:bookmarkStart w:id="52" w:name="X4ee6cd8c0c36769021316519aa82da91e5c1689"/>
     <w:p>
       <w:pPr>
         <w:pStyle w:val="Heading2"/>
@@ -3320,8 +3353,8 @@
         <w:t xml:space="preserve">(Giữ nguyên từ v2.1 — 4 đã xuất bản 2024-2026 + 4 đang chuẩn bị P3/P4/P5/P8.)</w:t>
       </w:r>
     </w:p>
-    <w:bookmarkEnd w:id="51"/>
-    <w:bookmarkStart w:id="52" w:name="X5c99d15306103ac9f982b5abde9e4832b7b9bb6"/>
+    <w:bookmarkEnd w:id="52"/>
+    <w:bookmarkStart w:id="53" w:name="X5c99d15306103ac9f982b5abde9e4832b7b9bb6"/>
     <w:p>
       <w:pPr>
         <w:pStyle w:val="Heading2"/>
@@ -3338,8 +3371,8 @@
         <w:t xml:space="preserve">(Giữ nguyên từ v2.0 — Auty 1993, Beblawi 1987, Gerelmaa &amp; Kotani 2016, Hertog 2010, Hvidt 2013, Sachs &amp; Warner 2001, Hall &amp; Soskice 2001, Bertram 2006, Briguglio 1995. Tổng 9 entries.)</w:t>
       </w:r>
     </w:p>
-    <w:bookmarkEnd w:id="52"/>
-    <w:bookmarkStart w:id="53" w:name="X7b935591dcf18edb5dca712bd5083e2986f45de"/>
+    <w:bookmarkEnd w:id="53"/>
+    <w:bookmarkStart w:id="54" w:name="X7b935591dcf18edb5dca712bd5083e2986f45de"/>
     <w:p>
       <w:pPr>
         <w:pStyle w:val="Heading2"/>
@@ -3356,8 +3389,8 @@
         <w:t xml:space="preserve">(Giữ nguyên từ v2.0 — 7 văn bản pháp lý + 8 hiệp định FTA.)</w:t>
       </w:r>
     </w:p>
-    <w:bookmarkEnd w:id="53"/>
-    <w:bookmarkStart w:id="59" w:name="Xfdcfd95794eb92b06b0485f73971c5fa620ac84"/>
+    <w:bookmarkEnd w:id="54"/>
+    <w:bookmarkStart w:id="60" w:name="Xfdcfd95794eb92b06b0485f73971c5fa620ac84"/>
     <w:p>
       <w:pPr>
         <w:pStyle w:val="Heading2"/>
@@ -3389,7 +3422,7 @@
       <w:r>
         <w:t xml:space="preserve"> </w:t>
       </w:r>
-      <w:hyperlink r:id="rId54">
+      <w:hyperlink r:id="rId55">
         <w:r>
           <w:rPr>
             <w:rStyle w:val="Hyperlink"/>
@@ -3459,7 +3492,7 @@
       <w:r>
         <w:t xml:space="preserve"> </w:t>
       </w:r>
-      <w:hyperlink r:id="rId55">
+      <w:hyperlink r:id="rId56">
         <w:r>
           <w:rPr>
             <w:rStyle w:val="Hyperlink"/>
@@ -3501,7 +3534,7 @@
       <w:r>
         <w:t xml:space="preserve"> </w:t>
       </w:r>
-      <w:hyperlink r:id="rId56">
+      <w:hyperlink r:id="rId57">
         <w:r>
           <w:rPr>
             <w:rStyle w:val="Hyperlink"/>
@@ -3543,7 +3576,7 @@
       <w:r>
         <w:t xml:space="preserve"> </w:t>
       </w:r>
-      <w:hyperlink r:id="rId57">
+      <w:hyperlink r:id="rId58">
         <w:r>
           <w:rPr>
             <w:rStyle w:val="Hyperlink"/>
@@ -3585,7 +3618,7 @@
       <w:r>
         <w:t xml:space="preserve"> </w:t>
       </w:r>
-      <w:hyperlink r:id="rId58">
+      <w:hyperlink r:id="rId59">
         <w:r>
           <w:rPr>
             <w:rStyle w:val="Hyperlink"/>
@@ -3611,8 +3644,8 @@
         </w:pict>
       </w:r>
     </w:p>
-    <w:bookmarkEnd w:id="59"/>
-    <w:bookmarkStart w:id="107" w:name="X036c8c3a317685afaa0f5ecef76da1f245e4cfe"/>
+    <w:bookmarkEnd w:id="60"/>
+    <w:bookmarkStart w:id="112" w:name="X036c8c3a317685afaa0f5ecef76da1f245e4cfe"/>
     <w:p>
       <w:pPr>
         <w:pStyle w:val="Heading2"/>
@@ -3687,7 +3720,7 @@
       <w:r>
         <w:t xml:space="preserve"> </w:t>
       </w:r>
-      <w:hyperlink r:id="rId60">
+      <w:hyperlink r:id="rId61">
         <w:r>
           <w:rPr>
             <w:rStyle w:val="Hyperlink"/>
@@ -3719,7 +3752,7 @@
       <w:r>
         <w:t xml:space="preserve"> </w:t>
       </w:r>
-      <w:hyperlink r:id="rId61">
+      <w:hyperlink r:id="rId62">
         <w:r>
           <w:rPr>
             <w:rStyle w:val="Hyperlink"/>
@@ -3751,7 +3784,7 @@
       <w:r>
         <w:t xml:space="preserve"> </w:t>
       </w:r>
-      <w:hyperlink r:id="rId62">
+      <w:hyperlink r:id="rId63">
         <w:r>
           <w:rPr>
             <w:rStyle w:val="Hyperlink"/>
@@ -3783,7 +3816,7 @@
       <w:r>
         <w:t xml:space="preserve"> </w:t>
       </w:r>
-      <w:hyperlink r:id="rId63">
+      <w:hyperlink r:id="rId64">
         <w:r>
           <w:rPr>
             <w:rStyle w:val="Hyperlink"/>
@@ -3815,7 +3848,7 @@
       <w:r>
         <w:t xml:space="preserve"> </w:t>
       </w:r>
-      <w:hyperlink r:id="rId64">
+      <w:hyperlink r:id="rId65">
         <w:r>
           <w:rPr>
             <w:rStyle w:val="Hyperlink"/>
@@ -3868,7 +3901,7 @@
       <w:r>
         <w:t xml:space="preserve"> </w:t>
       </w:r>
-      <w:hyperlink r:id="rId65">
+      <w:hyperlink r:id="rId66">
         <w:r>
           <w:rPr>
             <w:rStyle w:val="Hyperlink"/>
@@ -3900,7 +3933,7 @@
       <w:r>
         <w:t xml:space="preserve"> </w:t>
       </w:r>
-      <w:hyperlink r:id="rId66">
+      <w:hyperlink r:id="rId67">
         <w:r>
           <w:rPr>
             <w:rStyle w:val="Hyperlink"/>
@@ -3932,7 +3965,7 @@
       <w:r>
         <w:t xml:space="preserve"> </w:t>
       </w:r>
-      <w:hyperlink r:id="rId67">
+      <w:hyperlink r:id="rId68">
         <w:r>
           <w:rPr>
             <w:rStyle w:val="Hyperlink"/>
@@ -3946,6 +3979,73 @@
         <w:pStyle w:val="BodyText"/>
       </w:pPr>
       <w:r>
+        <w:t xml:space="preserve">Combs, J. G., Crook, T. R., &amp; Shook, C. L. (2005). The dimensionality of organizational performance and its implications for strategic management research. In D. J. Ketchen &amp; D. D. Bergh (Eds.),</w:t>
+      </w:r>
+      <w:r>
+        <w:t xml:space="preserve"> </w:t>
+      </w:r>
+      <w:r>
+        <w:rPr>
+          <w:iCs/>
+          <w:i/>
+        </w:rPr>
+        <w:t xml:space="preserve">Research methodology in strategy and management</w:t>
+      </w:r>
+      <w:r>
+        <w:t xml:space="preserve"> </w:t>
+      </w:r>
+      <w:r>
+        <w:t xml:space="preserve">(Vol. 2, pp. 259–286). Emerald.</w:t>
+      </w:r>
+      <w:r>
+        <w:t xml:space="preserve"> </w:t>
+      </w:r>
+      <w:hyperlink r:id="rId69">
+        <w:r>
+          <w:rPr>
+            <w:rStyle w:val="Hyperlink"/>
+          </w:rPr>
+          <w:t xml:space="preserve">https://doi.org/10.1016/S1479-8387(05)02011-4</w:t>
+        </w:r>
+      </w:hyperlink>
+    </w:p>
+    <w:p>
+      <w:pPr>
+        <w:pStyle w:val="BodyText"/>
+      </w:pPr>
+      <w:r>
+        <w:t xml:space="preserve">Combs, J. G., Ketchen, D. J., Crook, T. R., &amp; Roth, P. L. (2011). Assessing cumulative evidence within “macro” research: Why meta-analysis should be preferred over vote counting.</w:t>
+      </w:r>
+      <w:r>
+        <w:t xml:space="preserve"> </w:t>
+      </w:r>
+      <w:r>
+        <w:rPr>
+          <w:iCs/>
+          <w:i/>
+        </w:rPr>
+        <w:t xml:space="preserve">Journal of Management Studies, 48</w:t>
+      </w:r>
+      <w:r>
+        <w:t xml:space="preserve">(1), 178–197.</w:t>
+      </w:r>
+      <w:r>
+        <w:t xml:space="preserve"> </w:t>
+      </w:r>
+      <w:hyperlink r:id="rId70">
+        <w:r>
+          <w:rPr>
+            <w:rStyle w:val="Hyperlink"/>
+          </w:rPr>
+          <w:t xml:space="preserve">https://doi.org/10.1111/j.1467-6486.2009.00899.x</w:t>
+        </w:r>
+      </w:hyperlink>
+    </w:p>
+    <w:p>
+      <w:pPr>
+        <w:pStyle w:val="BodyText"/>
+      </w:pPr>
+      <w:r>
         <w:t xml:space="preserve">Cusolito, A. P., &amp; Maloney, W. F. (2018).</w:t>
       </w:r>
       <w:r>
@@ -3964,7 +4064,7 @@
       <w:r>
         <w:t xml:space="preserve"> </w:t>
       </w:r>
-      <w:hyperlink r:id="rId68">
+      <w:hyperlink r:id="rId71">
         <w:r>
           <w:rPr>
             <w:rStyle w:val="Hyperlink"/>
@@ -3996,7 +4096,7 @@
       <w:r>
         <w:t xml:space="preserve"> </w:t>
       </w:r>
-      <w:hyperlink r:id="rId69">
+      <w:hyperlink r:id="rId72">
         <w:r>
           <w:rPr>
             <w:rStyle w:val="Hyperlink"/>
@@ -4028,7 +4128,7 @@
       <w:r>
         <w:t xml:space="preserve"> </w:t>
       </w:r>
-      <w:hyperlink r:id="rId70">
+      <w:hyperlink r:id="rId73">
         <w:r>
           <w:rPr>
             <w:rStyle w:val="Hyperlink"/>
@@ -4060,7 +4160,7 @@
       <w:r>
         <w:t xml:space="preserve"> </w:t>
       </w:r>
-      <w:hyperlink r:id="rId71">
+      <w:hyperlink r:id="rId74">
         <w:r>
           <w:rPr>
             <w:rStyle w:val="Hyperlink"/>
@@ -4092,7 +4192,7 @@
       <w:r>
         <w:t xml:space="preserve"> </w:t>
       </w:r>
-      <w:hyperlink r:id="rId72">
+      <w:hyperlink r:id="rId75">
         <w:r>
           <w:rPr>
             <w:rStyle w:val="Hyperlink"/>
@@ -4124,7 +4224,7 @@
       <w:r>
         <w:t xml:space="preserve"> </w:t>
       </w:r>
-      <w:hyperlink r:id="rId73">
+      <w:hyperlink r:id="rId76">
         <w:r>
           <w:rPr>
             <w:rStyle w:val="Hyperlink"/>
@@ -4156,7 +4256,7 @@
       <w:r>
         <w:t xml:space="preserve"> </w:t>
       </w:r>
-      <w:hyperlink r:id="rId74">
+      <w:hyperlink r:id="rId77">
         <w:r>
           <w:rPr>
             <w:rStyle w:val="Hyperlink"/>
@@ -4188,7 +4288,7 @@
       <w:r>
         <w:t xml:space="preserve"> </w:t>
       </w:r>
-      <w:hyperlink r:id="rId75">
+      <w:hyperlink r:id="rId78">
         <w:r>
           <w:rPr>
             <w:rStyle w:val="Hyperlink"/>
@@ -4220,7 +4320,7 @@
       <w:r>
         <w:t xml:space="preserve"> </w:t>
       </w:r>
-      <w:hyperlink r:id="rId76">
+      <w:hyperlink r:id="rId79">
         <w:r>
           <w:rPr>
             <w:rStyle w:val="Hyperlink"/>
@@ -4252,7 +4352,7 @@
       <w:r>
         <w:t xml:space="preserve"> </w:t>
       </w:r>
-      <w:hyperlink r:id="rId77">
+      <w:hyperlink r:id="rId80">
         <w:r>
           <w:rPr>
             <w:rStyle w:val="Hyperlink"/>
@@ -4284,7 +4384,7 @@
       <w:r>
         <w:t xml:space="preserve"> </w:t>
       </w:r>
-      <w:hyperlink r:id="rId78">
+      <w:hyperlink r:id="rId81">
         <w:r>
           <w:rPr>
             <w:rStyle w:val="Hyperlink"/>
@@ -4316,7 +4416,7 @@
       <w:r>
         <w:t xml:space="preserve"> </w:t>
       </w:r>
-      <w:hyperlink r:id="rId79">
+      <w:hyperlink r:id="rId82">
         <w:r>
           <w:rPr>
             <w:rStyle w:val="Hyperlink"/>
@@ -4348,7 +4448,7 @@
       <w:r>
         <w:t xml:space="preserve"> </w:t>
       </w:r>
-      <w:hyperlink r:id="rId80">
+      <w:hyperlink r:id="rId83">
         <w:r>
           <w:rPr>
             <w:rStyle w:val="Hyperlink"/>
@@ -4380,7 +4480,7 @@
       <w:r>
         <w:t xml:space="preserve"> </w:t>
       </w:r>
-      <w:hyperlink r:id="rId81">
+      <w:hyperlink r:id="rId84">
         <w:r>
           <w:rPr>
             <w:rStyle w:val="Hyperlink"/>
@@ -4412,7 +4512,7 @@
       <w:r>
         <w:t xml:space="preserve"> </w:t>
       </w:r>
-      <w:hyperlink r:id="rId82">
+      <w:hyperlink r:id="rId85">
         <w:r>
           <w:rPr>
             <w:rStyle w:val="Hyperlink"/>
@@ -4465,7 +4565,7 @@
       <w:r>
         <w:t xml:space="preserve"> </w:t>
       </w:r>
-      <w:hyperlink r:id="rId83">
+      <w:hyperlink r:id="rId86">
         <w:r>
           <w:rPr>
             <w:rStyle w:val="Hyperlink"/>
@@ -4497,7 +4597,7 @@
       <w:r>
         <w:t xml:space="preserve"> </w:t>
       </w:r>
-      <w:hyperlink r:id="rId84">
+      <w:hyperlink r:id="rId87">
         <w:r>
           <w:rPr>
             <w:rStyle w:val="Hyperlink"/>
@@ -4529,7 +4629,7 @@
       <w:r>
         <w:t xml:space="preserve"> </w:t>
       </w:r>
-      <w:hyperlink r:id="rId85">
+      <w:hyperlink r:id="rId88">
         <w:r>
           <w:rPr>
             <w:rStyle w:val="Hyperlink"/>
@@ -4561,7 +4661,7 @@
       <w:r>
         <w:t xml:space="preserve"> </w:t>
       </w:r>
-      <w:hyperlink r:id="rId86">
+      <w:hyperlink r:id="rId89">
         <w:r>
           <w:rPr>
             <w:rStyle w:val="Hyperlink"/>
@@ -4593,7 +4693,7 @@
       <w:r>
         <w:t xml:space="preserve"> </w:t>
       </w:r>
-      <w:hyperlink r:id="rId87">
+      <w:hyperlink r:id="rId90">
         <w:r>
           <w:rPr>
             <w:rStyle w:val="Hyperlink"/>
@@ -4625,7 +4725,7 @@
       <w:r>
         <w:t xml:space="preserve"> </w:t>
       </w:r>
-      <w:hyperlink r:id="rId88">
+      <w:hyperlink r:id="rId91">
         <w:r>
           <w:rPr>
             <w:rStyle w:val="Hyperlink"/>
@@ -4657,7 +4757,7 @@
       <w:r>
         <w:t xml:space="preserve"> </w:t>
       </w:r>
-      <w:hyperlink r:id="rId89">
+      <w:hyperlink r:id="rId92">
         <w:r>
           <w:rPr>
             <w:rStyle w:val="Hyperlink"/>
@@ -4689,7 +4789,7 @@
       <w:r>
         <w:t xml:space="preserve"> </w:t>
       </w:r>
-      <w:hyperlink r:id="rId90">
+      <w:hyperlink r:id="rId93">
         <w:r>
           <w:rPr>
             <w:rStyle w:val="Hyperlink"/>
@@ -4721,7 +4821,7 @@
       <w:r>
         <w:t xml:space="preserve"> </w:t>
       </w:r>
-      <w:hyperlink r:id="rId91">
+      <w:hyperlink r:id="rId94">
         <w:r>
           <w:rPr>
             <w:rStyle w:val="Hyperlink"/>
@@ -4735,7 +4835,7 @@
         <w:pStyle w:val="BodyText"/>
       </w:pPr>
       <w:r>
-        <w:t xml:space="preserve">Mar, T. T., Đỗ, T. H., &amp; Phan, A. T. (2026).</w:t>
+        <w:t xml:space="preserve">Mar, T. T., Do, T. H., &amp; Phan, A. T. (2026).</w:t>
       </w:r>
       <w:r>
         <w:t xml:space="preserve"> </w:t>
@@ -4772,6 +4872,36 @@
         <w:pStyle w:val="BodyText"/>
       </w:pPr>
       <w:r>
+        <w:t xml:space="preserve">MacKinnon, J. G., &amp; Webb, M. D. (2017). Wild bootstrap inference for wildly different cluster sizes.</w:t>
+      </w:r>
+      <w:r>
+        <w:t xml:space="preserve"> </w:t>
+      </w:r>
+      <w:r>
+        <w:rPr>
+          <w:iCs/>
+          <w:i/>
+        </w:rPr>
+        <w:t xml:space="preserve">Journal of Applied Econometrics, 32</w:t>
+      </w:r>
+      <w:r>
+        <w:t xml:space="preserve">(2), 233–254.</w:t>
+      </w:r>
+      <w:r>
+        <w:t xml:space="preserve"> </w:t>
+      </w:r>
+      <w:hyperlink r:id="rId95">
+        <w:r>
+          <w:rPr>
+            <w:rStyle w:val="Hyperlink"/>
+          </w:rPr>
+          <w:t xml:space="preserve">https://doi.org/10.1002/jae.2508</w:t>
+        </w:r>
+      </w:hyperlink>
+      <w:r>
+        <w:t xml:space="preserve"> </w:t>
+      </w:r>
+      <w:r>
         <w:t xml:space="preserve">Marano, V., Arregle, J.-L., Hitt, M. A., Spadafora, E., &amp; van Essen, M. (2016). Home country institutions and the internationalization–performance relationship: A meta-analytic review.</w:t>
       </w:r>
       <w:r>
@@ -4790,7 +4920,7 @@
       <w:r>
         <w:t xml:space="preserve"> </w:t>
       </w:r>
-      <w:hyperlink r:id="rId92">
+      <w:hyperlink r:id="rId96">
         <w:r>
           <w:rPr>
             <w:rStyle w:val="Hyperlink"/>
@@ -4854,7 +4984,7 @@
       <w:r>
         <w:t xml:space="preserve"> </w:t>
       </w:r>
-      <w:hyperlink r:id="rId93">
+      <w:hyperlink r:id="rId97">
         <w:r>
           <w:rPr>
             <w:rStyle w:val="Hyperlink"/>
@@ -4886,7 +5016,7 @@
       <w:r>
         <w:t xml:space="preserve"> </w:t>
       </w:r>
-      <w:hyperlink r:id="rId94">
+      <w:hyperlink r:id="rId98">
         <w:r>
           <w:rPr>
             <w:rStyle w:val="Hyperlink"/>
@@ -4918,7 +5048,7 @@
       <w:r>
         <w:t xml:space="preserve"> </w:t>
       </w:r>
-      <w:hyperlink r:id="rId95">
+      <w:hyperlink r:id="rId99">
         <w:r>
           <w:rPr>
             <w:rStyle w:val="Hyperlink"/>
@@ -4950,7 +5080,7 @@
       <w:r>
         <w:t xml:space="preserve"> </w:t>
       </w:r>
-      <w:hyperlink r:id="rId96">
+      <w:hyperlink r:id="rId100">
         <w:r>
           <w:rPr>
             <w:rStyle w:val="Hyperlink"/>
@@ -4982,7 +5112,7 @@
       <w:r>
         <w:t xml:space="preserve"> </w:t>
       </w:r>
-      <w:hyperlink r:id="rId97">
+      <w:hyperlink r:id="rId101">
         <w:r>
           <w:rPr>
             <w:rStyle w:val="Hyperlink"/>
@@ -4996,6 +5126,38 @@
         <w:pStyle w:val="BodyText"/>
       </w:pPr>
       <w:r>
+        <w:t xml:space="preserve">Richard, P. J., Devinney, T. M., Yip, G. S., &amp; Johnson, G. (2009). Measuring organizational performance: Towards methodological best practice.</w:t>
+      </w:r>
+      <w:r>
+        <w:t xml:space="preserve"> </w:t>
+      </w:r>
+      <w:r>
+        <w:rPr>
+          <w:iCs/>
+          <w:i/>
+        </w:rPr>
+        <w:t xml:space="preserve">Journal of Management, 35</w:t>
+      </w:r>
+      <w:r>
+        <w:t xml:space="preserve">(3), 718–804.</w:t>
+      </w:r>
+      <w:r>
+        <w:t xml:space="preserve"> </w:t>
+      </w:r>
+      <w:hyperlink r:id="rId102">
+        <w:r>
+          <w:rPr>
+            <w:rStyle w:val="Hyperlink"/>
+          </w:rPr>
+          <w:t xml:space="preserve">https://doi.org/10.1177/0149206308330560</w:t>
+        </w:r>
+      </w:hyperlink>
+    </w:p>
+    <w:p>
+      <w:pPr>
+        <w:pStyle w:val="BodyText"/>
+      </w:pPr>
+      <w:r>
         <w:t xml:space="preserve">Suurmond, R., van Rhee, H., &amp; Hak, T. (2017). Introduction, comparison, and validation of Meta-Essentials: A free and simple tool for meta-analysis.</w:t>
       </w:r>
       <w:r>
@@ -5014,7 +5176,7 @@
       <w:r>
         <w:t xml:space="preserve"> </w:t>
       </w:r>
-      <w:hyperlink r:id="rId98">
+      <w:hyperlink r:id="rId103">
         <w:r>
           <w:rPr>
             <w:rStyle w:val="Hyperlink"/>
@@ -5046,7 +5208,7 @@
       <w:r>
         <w:t xml:space="preserve"> </w:t>
       </w:r>
-      <w:hyperlink r:id="rId99">
+      <w:hyperlink r:id="rId104">
         <w:r>
           <w:rPr>
             <w:rStyle w:val="Hyperlink"/>
@@ -5078,7 +5240,7 @@
       <w:r>
         <w:t xml:space="preserve"> </w:t>
       </w:r>
-      <w:hyperlink r:id="rId100">
+      <w:hyperlink r:id="rId105">
         <w:r>
           <w:rPr>
             <w:rStyle w:val="Hyperlink"/>
@@ -5110,7 +5272,7 @@
       <w:r>
         <w:t xml:space="preserve"> </w:t>
       </w:r>
-      <w:hyperlink r:id="rId101">
+      <w:hyperlink r:id="rId106">
         <w:r>
           <w:rPr>
             <w:rStyle w:val="Hyperlink"/>
@@ -5142,7 +5304,7 @@
       <w:r>
         <w:t xml:space="preserve"> </w:t>
       </w:r>
-      <w:hyperlink r:id="rId102">
+      <w:hyperlink r:id="rId107">
         <w:r>
           <w:rPr>
             <w:rStyle w:val="Hyperlink"/>
@@ -5174,7 +5336,7 @@
       <w:r>
         <w:t xml:space="preserve"> </w:t>
       </w:r>
-      <w:hyperlink r:id="rId103">
+      <w:hyperlink r:id="rId108">
         <w:r>
           <w:rPr>
             <w:rStyle w:val="Hyperlink"/>
@@ -5206,7 +5368,7 @@
       <w:r>
         <w:t xml:space="preserve"> </w:t>
       </w:r>
-      <w:hyperlink r:id="rId104">
+      <w:hyperlink r:id="rId109">
         <w:r>
           <w:rPr>
             <w:rStyle w:val="Hyperlink"/>
@@ -5241,7 +5403,7 @@
       <w:r>
         <w:t xml:space="preserve"> </w:t>
       </w:r>
-      <w:hyperlink r:id="rId42">
+      <w:hyperlink r:id="rId43">
         <w:r>
           <w:rPr>
             <w:rStyle w:val="Hyperlink"/>
@@ -5273,7 +5435,7 @@
       <w:r>
         <w:t xml:space="preserve"> </w:t>
       </w:r>
-      <w:hyperlink r:id="rId105">
+      <w:hyperlink r:id="rId110">
         <w:r>
           <w:rPr>
             <w:rStyle w:val="Hyperlink"/>
@@ -5308,7 +5470,7 @@
       <w:r>
         <w:t xml:space="preserve"> </w:t>
       </w:r>
-      <w:hyperlink r:id="rId106">
+      <w:hyperlink r:id="rId111">
         <w:r>
           <w:rPr>
             <w:rStyle w:val="Hyperlink"/>
@@ -5334,8 +5496,8 @@
         </w:pict>
       </w:r>
     </w:p>
-    <w:bookmarkEnd w:id="107"/>
-    <w:bookmarkStart w:id="113" w:name="X960578797b83f6ed17603db1897217bb15499be"/>
+    <w:bookmarkEnd w:id="112"/>
+    <w:bookmarkStart w:id="118" w:name="X960578797b83f6ed17603db1897217bb15499be"/>
     <w:p>
       <w:pPr>
         <w:pStyle w:val="Heading2"/>
@@ -5370,7 +5532,7 @@
       <w:r>
         <w:t xml:space="preserve"> </w:t>
       </w:r>
-      <w:hyperlink r:id="rId108">
+      <w:hyperlink r:id="rId113">
         <w:r>
           <w:rPr>
             <w:rStyle w:val="Hyperlink"/>
@@ -5412,7 +5574,7 @@
       <w:r>
         <w:t xml:space="preserve"> </w:t>
       </w:r>
-      <w:hyperlink r:id="rId109">
+      <w:hyperlink r:id="rId114">
         <w:r>
           <w:rPr>
             <w:rStyle w:val="Hyperlink"/>
@@ -5457,7 +5619,7 @@
       <w:r>
         <w:t xml:space="preserve"> </w:t>
       </w:r>
-      <w:hyperlink r:id="rId110">
+      <w:hyperlink r:id="rId115">
         <w:r>
           <w:rPr>
             <w:rStyle w:val="Hyperlink"/>
@@ -5499,7 +5661,7 @@
       <w:r>
         <w:t xml:space="preserve"> </w:t>
       </w:r>
-      <w:hyperlink r:id="rId111">
+      <w:hyperlink r:id="rId116">
         <w:r>
           <w:rPr>
             <w:rStyle w:val="Hyperlink"/>
@@ -5541,7 +5703,7 @@
       <w:r>
         <w:t xml:space="preserve"> </w:t>
       </w:r>
-      <w:hyperlink r:id="rId112">
+      <w:hyperlink r:id="rId117">
         <w:r>
           <w:rPr>
             <w:rStyle w:val="Hyperlink"/>
@@ -5567,8 +5729,8 @@
         </w:pict>
       </w:r>
     </w:p>
-    <w:bookmarkEnd w:id="113"/>
-    <w:bookmarkStart w:id="118" w:name="Xa754a011936178a69cc055e2e5927ea93f8c9af"/>
+    <w:bookmarkEnd w:id="118"/>
+    <w:bookmarkStart w:id="129" w:name="Xa754a011936178a69cc055e2e5927ea93f8c9af"/>
     <w:p>
       <w:pPr>
         <w:pStyle w:val="Heading2"/>
@@ -5646,7 +5808,7 @@
       <w:r>
         <w:t xml:space="preserve"> </w:t>
       </w:r>
-      <w:hyperlink r:id="rId114">
+      <w:hyperlink r:id="rId119">
         <w:r>
           <w:rPr>
             <w:rStyle w:val="Hyperlink"/>
@@ -5678,7 +5840,7 @@
       <w:r>
         <w:t xml:space="preserve"> </w:t>
       </w:r>
-      <w:hyperlink r:id="rId115">
+      <w:hyperlink r:id="rId120">
         <w:r>
           <w:rPr>
             <w:rStyle w:val="Hyperlink"/>
@@ -5710,7 +5872,7 @@
       <w:r>
         <w:t xml:space="preserve"> </w:t>
       </w:r>
-      <w:hyperlink r:id="rId116">
+      <w:hyperlink r:id="rId121">
         <w:r>
           <w:rPr>
             <w:rStyle w:val="Hyperlink"/>
@@ -5742,7 +5904,7 @@
       <w:r>
         <w:t xml:space="preserve"> </w:t>
       </w:r>
-      <w:hyperlink r:id="rId117">
+      <w:hyperlink r:id="rId122">
         <w:r>
           <w:rPr>
             <w:rStyle w:val="Hyperlink"/>
@@ -5756,6 +5918,162 @@
         <w:pStyle w:val="BodyText"/>
       </w:pPr>
       <w:r>
+        <w:t xml:space="preserve">Eisenhardt, K. M., &amp; Martin, J. A. (2000). Dynamic capabilities: What are they?</w:t>
+      </w:r>
+      <w:r>
+        <w:t xml:space="preserve"> </w:t>
+      </w:r>
+      <w:r>
+        <w:rPr>
+          <w:iCs/>
+          <w:i/>
+        </w:rPr>
+        <w:t xml:space="preserve">Strategic Management Journal, 21</w:t>
+      </w:r>
+      <w:r>
+        <w:t xml:space="preserve">(10–11), 1105–1121.</w:t>
+      </w:r>
+      <w:r>
+        <w:t xml:space="preserve"> </w:t>
+      </w:r>
+      <w:hyperlink r:id="rId123">
+        <w:r>
+          <w:rPr>
+            <w:rStyle w:val="Hyperlink"/>
+          </w:rPr>
+          <w:t xml:space="preserve">https://doi.org/10.1002/smj.118</w:t>
+        </w:r>
+      </w:hyperlink>
+    </w:p>
+    <w:p>
+      <w:pPr>
+        <w:pStyle w:val="BodyText"/>
+      </w:pPr>
+      <w:r>
+        <w:t xml:space="preserve">Kirca, A. H., Roth, K., Hult, G. T. M., &amp; Cavusgil, S. T. (2012). The role of context in the multinationality–performance relationship: A meta-analytic review.</w:t>
+      </w:r>
+      <w:r>
+        <w:t xml:space="preserve"> </w:t>
+      </w:r>
+      <w:r>
+        <w:rPr>
+          <w:iCs/>
+          <w:i/>
+        </w:rPr>
+        <w:t xml:space="preserve">Global Strategy Journal, 2</w:t>
+      </w:r>
+      <w:r>
+        <w:t xml:space="preserve">(2), 108–121.</w:t>
+      </w:r>
+      <w:r>
+        <w:t xml:space="preserve"> </w:t>
+      </w:r>
+      <w:hyperlink r:id="rId124">
+        <w:r>
+          <w:rPr>
+            <w:rStyle w:val="Hyperlink"/>
+          </w:rPr>
+          <w:t xml:space="preserve">https://doi.org/10.1111/j.2042-5805.2012.01028.x</w:t>
+        </w:r>
+      </w:hyperlink>
+    </w:p>
+    <w:p>
+      <w:pPr>
+        <w:pStyle w:val="BodyText"/>
+      </w:pPr>
+      <w:r>
+        <w:t xml:space="preserve">Melitz, M. J. (2003). The impact of trade on intra-industry reallocations and aggregate industry productivity.</w:t>
+      </w:r>
+      <w:r>
+        <w:t xml:space="preserve"> </w:t>
+      </w:r>
+      <w:r>
+        <w:rPr>
+          <w:iCs/>
+          <w:i/>
+        </w:rPr>
+        <w:t xml:space="preserve">Econometrica, 71</w:t>
+      </w:r>
+      <w:r>
+        <w:t xml:space="preserve">(6), 1695–1725.</w:t>
+      </w:r>
+      <w:r>
+        <w:t xml:space="preserve"> </w:t>
+      </w:r>
+      <w:hyperlink r:id="rId125">
+        <w:r>
+          <w:rPr>
+            <w:rStyle w:val="Hyperlink"/>
+          </w:rPr>
+          <w:t xml:space="preserve">https://doi.org/10.1111/1468-0262.00467</w:t>
+        </w:r>
+      </w:hyperlink>
+    </w:p>
+    <w:p>
+      <w:pPr>
+        <w:pStyle w:val="BodyText"/>
+      </w:pPr>
+      <w:r>
+        <w:t xml:space="preserve">Nielsen, S. (2010). Top management team internationalization and firm performance: The mediating role of foreign market entry.</w:t>
+      </w:r>
+      <w:r>
+        <w:t xml:space="preserve"> </w:t>
+      </w:r>
+      <w:r>
+        <w:rPr>
+          <w:iCs/>
+          <w:i/>
+        </w:rPr>
+        <w:t xml:space="preserve">Management International Review, 50</w:t>
+      </w:r>
+      <w:r>
+        <w:t xml:space="preserve">(2), 185–206.</w:t>
+      </w:r>
+      <w:r>
+        <w:t xml:space="preserve"> </w:t>
+      </w:r>
+      <w:hyperlink r:id="rId126">
+        <w:r>
+          <w:rPr>
+            <w:rStyle w:val="Hyperlink"/>
+          </w:rPr>
+          <w:t xml:space="preserve">https://doi.org/10.1007/s11575-010-0029-0</w:t>
+        </w:r>
+      </w:hyperlink>
+      <w:r>
+        <w:t xml:space="preserve"> </w:t>
+      </w:r>
+      <w:r>
+        <w:t xml:space="preserve">Mizik, N., &amp; Jacobson, R. (2003). Trading off between value creation and value appropriation: The financial implications of shifts in strategic emphasis.</w:t>
+      </w:r>
+      <w:r>
+        <w:t xml:space="preserve"> </w:t>
+      </w:r>
+      <w:r>
+        <w:rPr>
+          <w:iCs/>
+          <w:i/>
+        </w:rPr>
+        <w:t xml:space="preserve">Journal of Marketing, 67</w:t>
+      </w:r>
+      <w:r>
+        <w:t xml:space="preserve">(1), 63–76.</w:t>
+      </w:r>
+      <w:r>
+        <w:t xml:space="preserve"> </w:t>
+      </w:r>
+      <w:hyperlink r:id="rId127">
+        <w:r>
+          <w:rPr>
+            <w:rStyle w:val="Hyperlink"/>
+          </w:rPr>
+          <w:t xml:space="preserve">https://doi.org/10.1509/jmkg.67.1.63.18595</w:t>
+        </w:r>
+      </w:hyperlink>
+      <w:r>
+        <w:t xml:space="preserve"> </w:t>
+      </w:r>
+      <w:r>
         <w:t xml:space="preserve">North, D. C. (1990).</w:t>
       </w:r>
       <w:r>
@@ -5771,6 +6089,38 @@
       <w:r>
         <w:t xml:space="preserve">. Cambridge University Press.</w:t>
       </w:r>
+    </w:p>
+    <w:p>
+      <w:pPr>
+        <w:pStyle w:val="BodyText"/>
+      </w:pPr>
+      <w:r>
+        <w:t xml:space="preserve">Shaver, J. M. (2020). Causal identification through a cumulative body of research in the study of strategy and organizations.</w:t>
+      </w:r>
+      <w:r>
+        <w:t xml:space="preserve"> </w:t>
+      </w:r>
+      <w:r>
+        <w:rPr>
+          <w:iCs/>
+          <w:i/>
+        </w:rPr>
+        <w:t xml:space="preserve">Journal of Management, 46</w:t>
+      </w:r>
+      <w:r>
+        <w:t xml:space="preserve">(7), 1244–1256.</w:t>
+      </w:r>
+      <w:r>
+        <w:t xml:space="preserve"> </w:t>
+      </w:r>
+      <w:hyperlink r:id="rId128">
+        <w:r>
+          <w:rPr>
+            <w:rStyle w:val="Hyperlink"/>
+          </w:rPr>
+          <w:t xml:space="preserve">https://doi.org/10.1177/0149206319846272</w:t>
+        </w:r>
+      </w:hyperlink>
     </w:p>
     <w:p>
       <w:r>
@@ -5779,8 +6129,8 @@
         </w:pict>
       </w:r>
     </w:p>
-    <w:bookmarkEnd w:id="118"/>
-    <w:bookmarkStart w:id="119" w:name="X5f09a039404ac10ef75f065c6bff2ae92d0d751"/>
+    <w:bookmarkEnd w:id="129"/>
+    <w:bookmarkStart w:id="130" w:name="X5f09a039404ac10ef75f065c6bff2ae92d0d751"/>
     <w:p>
       <w:pPr>
         <w:pStyle w:val="Heading2"/>
@@ -6010,8 +6360,8 @@
         </w:pict>
       </w:r>
     </w:p>
-    <w:bookmarkEnd w:id="119"/>
-    <w:bookmarkStart w:id="123" w:name="hướng-dẫn-sử-dụng-cập-nhật-v25"/>
+    <w:bookmarkEnd w:id="130"/>
+    <w:bookmarkStart w:id="134" w:name="hướng-dẫn-sử-dụng-cập-nhật-v25"/>
     <w:p>
       <w:pPr>
         <w:pStyle w:val="Heading2"/>
@@ -6020,7 +6370,7 @@
         <w:t xml:space="preserve">Hướng dẫn sử dụng (cập nhật v2.5)</w:t>
       </w:r>
     </w:p>
-    <w:bookmarkStart w:id="120" w:name="trong-bản-thảo-luận-án"/>
+    <w:bookmarkStart w:id="131" w:name="trong-bản-thảo-luận-án"/>
     <w:p>
       <w:pPr>
         <w:pStyle w:val="Heading3"/>
@@ -6078,7 +6428,7 @@
         <w:pStyle w:val="Compact"/>
       </w:pPr>
       <w:r>
-        <w:t xml:space="preserve">Trích dẫn công trình của tác giả luận án: dùng dạng "Đỗ và Phan (2026 — VEFR)", v.v.</w:t>
+        <w:t xml:space="preserve">Trích dẫn công trình của tác giả luận án: dùng suffix năm chuẩn APA 7 — "Do và Phan (2026a)", "Do và Phan (2026g)", v.v. (P1=2026a, P2=2026g, P3=2026e, P5=2026f, P6=2026c, P7=2026d, P8=2026b; P4=Mar et al., 2026).</w:t>
       </w:r>
     </w:p>
     <w:p>
@@ -6483,8 +6833,8 @@
         <w:t xml:space="preserve">phân biệt với "Mahler, Wang &amp; Weber (2026)" [Atlas chapter, Section P]</w:t>
       </w:r>
     </w:p>
-    <w:bookmarkEnd w:id="120"/>
-    <w:bookmarkStart w:id="121" w:name="khi-nộp-bản-cuối"/>
+    <w:bookmarkEnd w:id="131"/>
+    <w:bookmarkStart w:id="132" w:name="khi-nộp-bản-cuối"/>
     <w:p>
       <w:pPr>
         <w:pStyle w:val="Heading3"/>
@@ -6650,8 +7000,8 @@
         <w:t xml:space="preserve">— số đầy đủ + ngày publication trên datatopics.worldbank.org.</w:t>
       </w:r>
     </w:p>
-    <w:bookmarkEnd w:id="121"/>
-    <w:bookmarkStart w:id="122" w:name="audit-warnings-status-cập-nhật-v25"/>
+    <w:bookmarkEnd w:id="132"/>
+    <w:bookmarkStart w:id="133" w:name="audit-warnings-status-cập-nhật-v25"/>
     <w:p>
       <w:pPr>
         <w:pStyle w:val="Heading3"/>
@@ -6776,9 +7126,9 @@
         </w:pict>
       </w:r>
     </w:p>
-    <w:bookmarkEnd w:id="122"/>
-    <w:bookmarkEnd w:id="123"/>
-    <w:bookmarkStart w:id="181" w:name="X0cd7ce921ef889aa4b7b0017ef0bc0e135f6e1c"/>
+    <w:bookmarkEnd w:id="133"/>
+    <w:bookmarkEnd w:id="134"/>
+    <w:bookmarkStart w:id="192" w:name="X0cd7ce921ef889aa4b7b0017ef0bc0e135f6e1c"/>
     <w:p>
       <w:pPr>
         <w:pStyle w:val="Heading2"/>
@@ -6854,7 +7204,7 @@
       <w:r>
         <w:t xml:space="preserve"> </w:t>
       </w:r>
-      <w:hyperlink r:id="rId124">
+      <w:hyperlink r:id="rId135">
         <w:r>
           <w:rPr>
             <w:rStyle w:val="Hyperlink"/>
@@ -6886,7 +7236,7 @@
       <w:r>
         <w:t xml:space="preserve"> </w:t>
       </w:r>
-      <w:hyperlink r:id="rId125">
+      <w:hyperlink r:id="rId136">
         <w:r>
           <w:rPr>
             <w:rStyle w:val="Hyperlink"/>
@@ -6918,7 +7268,7 @@
       <w:r>
         <w:t xml:space="preserve"> </w:t>
       </w:r>
-      <w:hyperlink r:id="rId126">
+      <w:hyperlink r:id="rId137">
         <w:r>
           <w:rPr>
             <w:rStyle w:val="Hyperlink"/>
@@ -6971,7 +7321,7 @@
       <w:r>
         <w:t xml:space="preserve"> </w:t>
       </w:r>
-      <w:hyperlink r:id="rId127">
+      <w:hyperlink r:id="rId138">
         <w:r>
           <w:rPr>
             <w:rStyle w:val="Hyperlink"/>
@@ -7003,7 +7353,7 @@
       <w:r>
         <w:t xml:space="preserve"> </w:t>
       </w:r>
-      <w:hyperlink r:id="rId128">
+      <w:hyperlink r:id="rId139">
         <w:r>
           <w:rPr>
             <w:rStyle w:val="Hyperlink"/>
@@ -7035,7 +7385,7 @@
       <w:r>
         <w:t xml:space="preserve"> </w:t>
       </w:r>
-      <w:hyperlink r:id="rId129">
+      <w:hyperlink r:id="rId140">
         <w:r>
           <w:rPr>
             <w:rStyle w:val="Hyperlink"/>
@@ -7067,7 +7417,7 @@
       <w:r>
         <w:t xml:space="preserve"> </w:t>
       </w:r>
-      <w:hyperlink r:id="rId130">
+      <w:hyperlink r:id="rId141">
         <w:r>
           <w:rPr>
             <w:rStyle w:val="Hyperlink"/>
@@ -7099,7 +7449,7 @@
       <w:r>
         <w:t xml:space="preserve"> </w:t>
       </w:r>
-      <w:hyperlink r:id="rId131">
+      <w:hyperlink r:id="rId142">
         <w:r>
           <w:rPr>
             <w:rStyle w:val="Hyperlink"/>
@@ -7131,7 +7481,7 @@
       <w:r>
         <w:t xml:space="preserve"> </w:t>
       </w:r>
-      <w:hyperlink r:id="rId132">
+      <w:hyperlink r:id="rId143">
         <w:r>
           <w:rPr>
             <w:rStyle w:val="Hyperlink"/>
@@ -7163,7 +7513,7 @@
       <w:r>
         <w:t xml:space="preserve"> </w:t>
       </w:r>
-      <w:hyperlink r:id="rId133">
+      <w:hyperlink r:id="rId144">
         <w:r>
           <w:rPr>
             <w:rStyle w:val="Hyperlink"/>
@@ -7195,7 +7545,7 @@
       <w:r>
         <w:t xml:space="preserve"> </w:t>
       </w:r>
-      <w:hyperlink r:id="rId134">
+      <w:hyperlink r:id="rId145">
         <w:r>
           <w:rPr>
             <w:rStyle w:val="Hyperlink"/>
@@ -7227,7 +7577,7 @@
       <w:r>
         <w:t xml:space="preserve"> </w:t>
       </w:r>
-      <w:hyperlink r:id="rId135">
+      <w:hyperlink r:id="rId146">
         <w:r>
           <w:rPr>
             <w:rStyle w:val="Hyperlink"/>
@@ -7259,7 +7609,7 @@
       <w:r>
         <w:t xml:space="preserve"> </w:t>
       </w:r>
-      <w:hyperlink r:id="rId136">
+      <w:hyperlink r:id="rId147">
         <w:r>
           <w:rPr>
             <w:rStyle w:val="Hyperlink"/>
@@ -7291,7 +7641,7 @@
       <w:r>
         <w:t xml:space="preserve"> </w:t>
       </w:r>
-      <w:hyperlink r:id="rId137">
+      <w:hyperlink r:id="rId148">
         <w:r>
           <w:rPr>
             <w:rStyle w:val="Hyperlink"/>
@@ -7323,7 +7673,7 @@
       <w:r>
         <w:t xml:space="preserve"> </w:t>
       </w:r>
-      <w:hyperlink r:id="rId138">
+      <w:hyperlink r:id="rId149">
         <w:r>
           <w:rPr>
             <w:rStyle w:val="Hyperlink"/>
@@ -7355,7 +7705,7 @@
       <w:r>
         <w:t xml:space="preserve"> </w:t>
       </w:r>
-      <w:hyperlink r:id="rId139">
+      <w:hyperlink r:id="rId150">
         <w:r>
           <w:rPr>
             <w:rStyle w:val="Hyperlink"/>
@@ -7387,7 +7737,7 @@
       <w:r>
         <w:t xml:space="preserve"> </w:t>
       </w:r>
-      <w:hyperlink r:id="rId140">
+      <w:hyperlink r:id="rId151">
         <w:r>
           <w:rPr>
             <w:rStyle w:val="Hyperlink"/>
@@ -7419,7 +7769,7 @@
       <w:r>
         <w:t xml:space="preserve"> </w:t>
       </w:r>
-      <w:hyperlink r:id="rId141">
+      <w:hyperlink r:id="rId152">
         <w:r>
           <w:rPr>
             <w:rStyle w:val="Hyperlink"/>
@@ -7451,7 +7801,7 @@
       <w:r>
         <w:t xml:space="preserve"> </w:t>
       </w:r>
-      <w:hyperlink r:id="rId142">
+      <w:hyperlink r:id="rId153">
         <w:r>
           <w:rPr>
             <w:rStyle w:val="Hyperlink"/>
@@ -7483,7 +7833,7 @@
       <w:r>
         <w:t xml:space="preserve"> </w:t>
       </w:r>
-      <w:hyperlink r:id="rId143">
+      <w:hyperlink r:id="rId154">
         <w:r>
           <w:rPr>
             <w:rStyle w:val="Hyperlink"/>
@@ -7515,7 +7865,7 @@
       <w:r>
         <w:t xml:space="preserve"> </w:t>
       </w:r>
-      <w:hyperlink r:id="rId144">
+      <w:hyperlink r:id="rId155">
         <w:r>
           <w:rPr>
             <w:rStyle w:val="Hyperlink"/>
@@ -7547,7 +7897,7 @@
       <w:r>
         <w:t xml:space="preserve"> </w:t>
       </w:r>
-      <w:hyperlink r:id="rId145">
+      <w:hyperlink r:id="rId156">
         <w:r>
           <w:rPr>
             <w:rStyle w:val="Hyperlink"/>
@@ -7579,7 +7929,7 @@
       <w:r>
         <w:t xml:space="preserve"> </w:t>
       </w:r>
-      <w:hyperlink r:id="rId146">
+      <w:hyperlink r:id="rId157">
         <w:r>
           <w:rPr>
             <w:rStyle w:val="Hyperlink"/>
@@ -7611,7 +7961,7 @@
       <w:r>
         <w:t xml:space="preserve"> </w:t>
       </w:r>
-      <w:hyperlink r:id="rId147">
+      <w:hyperlink r:id="rId158">
         <w:r>
           <w:rPr>
             <w:rStyle w:val="Hyperlink"/>
@@ -7643,7 +7993,7 @@
       <w:r>
         <w:t xml:space="preserve"> </w:t>
       </w:r>
-      <w:hyperlink r:id="rId148">
+      <w:hyperlink r:id="rId159">
         <w:r>
           <w:rPr>
             <w:rStyle w:val="Hyperlink"/>
@@ -7675,7 +8025,7 @@
       <w:r>
         <w:t xml:space="preserve"> </w:t>
       </w:r>
-      <w:hyperlink r:id="rId149">
+      <w:hyperlink r:id="rId160">
         <w:r>
           <w:rPr>
             <w:rStyle w:val="Hyperlink"/>
@@ -7707,7 +8057,7 @@
       <w:r>
         <w:t xml:space="preserve"> </w:t>
       </w:r>
-      <w:hyperlink r:id="rId150">
+      <w:hyperlink r:id="rId161">
         <w:r>
           <w:rPr>
             <w:rStyle w:val="Hyperlink"/>
@@ -7739,7 +8089,7 @@
       <w:r>
         <w:t xml:space="preserve"> </w:t>
       </w:r>
-      <w:hyperlink r:id="rId151">
+      <w:hyperlink r:id="rId162">
         <w:r>
           <w:rPr>
             <w:rStyle w:val="Hyperlink"/>
@@ -7771,7 +8121,7 @@
       <w:r>
         <w:t xml:space="preserve"> </w:t>
       </w:r>
-      <w:hyperlink r:id="rId152">
+      <w:hyperlink r:id="rId163">
         <w:r>
           <w:rPr>
             <w:rStyle w:val="Hyperlink"/>
@@ -7803,7 +8153,7 @@
       <w:r>
         <w:t xml:space="preserve"> </w:t>
       </w:r>
-      <w:hyperlink r:id="rId153">
+      <w:hyperlink r:id="rId164">
         <w:r>
           <w:rPr>
             <w:rStyle w:val="Hyperlink"/>
@@ -7835,7 +8185,7 @@
       <w:r>
         <w:t xml:space="preserve"> </w:t>
       </w:r>
-      <w:hyperlink r:id="rId154">
+      <w:hyperlink r:id="rId165">
         <w:r>
           <w:rPr>
             <w:rStyle w:val="Hyperlink"/>
@@ -7951,7 +8301,7 @@
       <w:r>
         <w:t xml:space="preserve"> </w:t>
       </w:r>
-      <w:hyperlink r:id="rId155">
+      <w:hyperlink r:id="rId166">
         <w:r>
           <w:rPr>
             <w:rStyle w:val="Hyperlink"/>
@@ -7983,7 +8333,7 @@
       <w:r>
         <w:t xml:space="preserve"> </w:t>
       </w:r>
-      <w:hyperlink r:id="rId156">
+      <w:hyperlink r:id="rId167">
         <w:r>
           <w:rPr>
             <w:rStyle w:val="Hyperlink"/>
@@ -8015,7 +8365,7 @@
       <w:r>
         <w:t xml:space="preserve"> </w:t>
       </w:r>
-      <w:hyperlink r:id="rId157">
+      <w:hyperlink r:id="rId168">
         <w:r>
           <w:rPr>
             <w:rStyle w:val="Hyperlink"/>
@@ -8047,7 +8397,7 @@
       <w:r>
         <w:t xml:space="preserve"> </w:t>
       </w:r>
-      <w:hyperlink r:id="rId158">
+      <w:hyperlink r:id="rId169">
         <w:r>
           <w:rPr>
             <w:rStyle w:val="Hyperlink"/>
@@ -8079,7 +8429,7 @@
       <w:r>
         <w:t xml:space="preserve"> </w:t>
       </w:r>
-      <w:hyperlink r:id="rId159">
+      <w:hyperlink r:id="rId170">
         <w:r>
           <w:rPr>
             <w:rStyle w:val="Hyperlink"/>
@@ -8111,7 +8461,7 @@
       <w:r>
         <w:t xml:space="preserve"> </w:t>
       </w:r>
-      <w:hyperlink r:id="rId160">
+      <w:hyperlink r:id="rId171">
         <w:r>
           <w:rPr>
             <w:rStyle w:val="Hyperlink"/>
@@ -8143,7 +8493,7 @@
       <w:r>
         <w:t xml:space="preserve"> </w:t>
       </w:r>
-      <w:hyperlink r:id="rId161">
+      <w:hyperlink r:id="rId172">
         <w:r>
           <w:rPr>
             <w:rStyle w:val="Hyperlink"/>
@@ -8175,7 +8525,7 @@
       <w:r>
         <w:t xml:space="preserve"> </w:t>
       </w:r>
-      <w:hyperlink r:id="rId162">
+      <w:hyperlink r:id="rId173">
         <w:r>
           <w:rPr>
             <w:rStyle w:val="Hyperlink"/>
@@ -8207,7 +8557,7 @@
       <w:r>
         <w:t xml:space="preserve"> </w:t>
       </w:r>
-      <w:hyperlink r:id="rId163">
+      <w:hyperlink r:id="rId174">
         <w:r>
           <w:rPr>
             <w:rStyle w:val="Hyperlink"/>
@@ -8239,7 +8589,7 @@
       <w:r>
         <w:t xml:space="preserve"> </w:t>
       </w:r>
-      <w:hyperlink r:id="rId164">
+      <w:hyperlink r:id="rId175">
         <w:r>
           <w:rPr>
             <w:rStyle w:val="Hyperlink"/>
@@ -8271,7 +8621,7 @@
       <w:r>
         <w:t xml:space="preserve"> </w:t>
       </w:r>
-      <w:hyperlink r:id="rId165">
+      <w:hyperlink r:id="rId176">
         <w:r>
           <w:rPr>
             <w:rStyle w:val="Hyperlink"/>
@@ -8303,7 +8653,7 @@
       <w:r>
         <w:t xml:space="preserve"> </w:t>
       </w:r>
-      <w:hyperlink r:id="rId166">
+      <w:hyperlink r:id="rId177">
         <w:r>
           <w:rPr>
             <w:rStyle w:val="Hyperlink"/>
@@ -8335,7 +8685,7 @@
       <w:r>
         <w:t xml:space="preserve"> </w:t>
       </w:r>
-      <w:hyperlink r:id="rId167">
+      <w:hyperlink r:id="rId178">
         <w:r>
           <w:rPr>
             <w:rStyle w:val="Hyperlink"/>
@@ -8367,7 +8717,7 @@
       <w:r>
         <w:t xml:space="preserve"> </w:t>
       </w:r>
-      <w:hyperlink r:id="rId168">
+      <w:hyperlink r:id="rId179">
         <w:r>
           <w:rPr>
             <w:rStyle w:val="Hyperlink"/>
@@ -8399,7 +8749,7 @@
       <w:r>
         <w:t xml:space="preserve"> </w:t>
       </w:r>
-      <w:hyperlink r:id="rId169">
+      <w:hyperlink r:id="rId180">
         <w:r>
           <w:rPr>
             <w:rStyle w:val="Hyperlink"/>
@@ -8431,7 +8781,7 @@
       <w:r>
         <w:t xml:space="preserve"> </w:t>
       </w:r>
-      <w:hyperlink r:id="rId170">
+      <w:hyperlink r:id="rId181">
         <w:r>
           <w:rPr>
             <w:rStyle w:val="Hyperlink"/>
@@ -8463,7 +8813,7 @@
       <w:r>
         <w:t xml:space="preserve"> </w:t>
       </w:r>
-      <w:hyperlink r:id="rId171">
+      <w:hyperlink r:id="rId182">
         <w:r>
           <w:rPr>
             <w:rStyle w:val="Hyperlink"/>
@@ -8516,7 +8866,7 @@
       <w:r>
         <w:t xml:space="preserve"> </w:t>
       </w:r>
-      <w:hyperlink r:id="rId172">
+      <w:hyperlink r:id="rId183">
         <w:r>
           <w:rPr>
             <w:rStyle w:val="Hyperlink"/>
@@ -8548,7 +8898,7 @@
       <w:r>
         <w:t xml:space="preserve"> </w:t>
       </w:r>
-      <w:hyperlink r:id="rId173">
+      <w:hyperlink r:id="rId184">
         <w:r>
           <w:rPr>
             <w:rStyle w:val="Hyperlink"/>
@@ -8580,7 +8930,7 @@
       <w:r>
         <w:t xml:space="preserve"> </w:t>
       </w:r>
-      <w:hyperlink r:id="rId174">
+      <w:hyperlink r:id="rId185">
         <w:r>
           <w:rPr>
             <w:rStyle w:val="Hyperlink"/>
@@ -8612,7 +8962,7 @@
       <w:r>
         <w:t xml:space="preserve"> </w:t>
       </w:r>
-      <w:hyperlink r:id="rId175">
+      <w:hyperlink r:id="rId186">
         <w:r>
           <w:rPr>
             <w:rStyle w:val="Hyperlink"/>
@@ -8644,7 +8994,7 @@
       <w:r>
         <w:t xml:space="preserve"> </w:t>
       </w:r>
-      <w:hyperlink r:id="rId176">
+      <w:hyperlink r:id="rId187">
         <w:r>
           <w:rPr>
             <w:rStyle w:val="Hyperlink"/>
@@ -8676,7 +9026,7 @@
       <w:r>
         <w:t xml:space="preserve"> </w:t>
       </w:r>
-      <w:hyperlink r:id="rId177">
+      <w:hyperlink r:id="rId188">
         <w:r>
           <w:rPr>
             <w:rStyle w:val="Hyperlink"/>
@@ -8708,7 +9058,7 @@
       <w:r>
         <w:t xml:space="preserve"> </w:t>
       </w:r>
-      <w:hyperlink r:id="rId178">
+      <w:hyperlink r:id="rId189">
         <w:r>
           <w:rPr>
             <w:rStyle w:val="Hyperlink"/>
@@ -8740,7 +9090,7 @@
       <w:r>
         <w:t xml:space="preserve"> </w:t>
       </w:r>
-      <w:hyperlink r:id="rId179">
+      <w:hyperlink r:id="rId190">
         <w:r>
           <w:rPr>
             <w:rStyle w:val="Hyperlink"/>
@@ -8793,7 +9143,7 @@
       <w:r>
         <w:t xml:space="preserve"> </w:t>
       </w:r>
-      <w:hyperlink r:id="rId180">
+      <w:hyperlink r:id="rId191">
         <w:r>
           <w:rPr>
             <w:rStyle w:val="Hyperlink"/>
@@ -8802,8 +9152,8 @@
         </w:r>
       </w:hyperlink>
     </w:p>
-    <w:bookmarkEnd w:id="181"/>
-    <w:bookmarkStart w:id="222" w:name="X44d40bf00da22ae7964042ce405e689f990f923"/>
+    <w:bookmarkEnd w:id="192"/>
+    <w:bookmarkStart w:id="234" w:name="X44d40bf00da22ae7964042ce405e689f990f923"/>
     <w:p>
       <w:pPr>
         <w:pStyle w:val="Heading2"/>
@@ -8835,7 +9185,7 @@
       <w:r>
         <w:t xml:space="preserve"> </w:t>
       </w:r>
-      <w:hyperlink r:id="rId182">
+      <w:hyperlink r:id="rId193">
         <w:r>
           <w:rPr>
             <w:rStyle w:val="Hyperlink"/>
@@ -8867,7 +9217,7 @@
       <w:r>
         <w:t xml:space="preserve"> </w:t>
       </w:r>
-      <w:hyperlink r:id="rId183">
+      <w:hyperlink r:id="rId194">
         <w:r>
           <w:rPr>
             <w:rStyle w:val="Hyperlink"/>
@@ -8899,7 +9249,7 @@
       <w:r>
         <w:t xml:space="preserve"> </w:t>
       </w:r>
-      <w:hyperlink r:id="rId184">
+      <w:hyperlink r:id="rId195">
         <w:r>
           <w:rPr>
             <w:rStyle w:val="Hyperlink"/>
@@ -8931,7 +9281,7 @@
       <w:r>
         <w:t xml:space="preserve"> </w:t>
       </w:r>
-      <w:hyperlink r:id="rId185">
+      <w:hyperlink r:id="rId196">
         <w:r>
           <w:rPr>
             <w:rStyle w:val="Hyperlink"/>
@@ -8963,7 +9313,7 @@
       <w:r>
         <w:t xml:space="preserve"> </w:t>
       </w:r>
-      <w:hyperlink r:id="rId186">
+      <w:hyperlink r:id="rId197">
         <w:r>
           <w:rPr>
             <w:rStyle w:val="Hyperlink"/>
@@ -8995,7 +9345,7 @@
       <w:r>
         <w:t xml:space="preserve"> </w:t>
       </w:r>
-      <w:hyperlink r:id="rId187">
+      <w:hyperlink r:id="rId198">
         <w:r>
           <w:rPr>
             <w:rStyle w:val="Hyperlink"/>
@@ -9027,7 +9377,7 @@
       <w:r>
         <w:t xml:space="preserve"> </w:t>
       </w:r>
-      <w:hyperlink r:id="rId188">
+      <w:hyperlink r:id="rId199">
         <w:r>
           <w:rPr>
             <w:rStyle w:val="Hyperlink"/>
@@ -9059,7 +9409,7 @@
       <w:r>
         <w:t xml:space="preserve"> </w:t>
       </w:r>
-      <w:hyperlink r:id="rId189">
+      <w:hyperlink r:id="rId200">
         <w:r>
           <w:rPr>
             <w:rStyle w:val="Hyperlink"/>
@@ -9091,7 +9441,7 @@
       <w:r>
         <w:t xml:space="preserve"> </w:t>
       </w:r>
-      <w:hyperlink r:id="rId190">
+      <w:hyperlink r:id="rId201">
         <w:r>
           <w:rPr>
             <w:rStyle w:val="Hyperlink"/>
@@ -9123,7 +9473,7 @@
       <w:r>
         <w:t xml:space="preserve"> </w:t>
       </w:r>
-      <w:hyperlink r:id="rId191">
+      <w:hyperlink r:id="rId202">
         <w:r>
           <w:rPr>
             <w:rStyle w:val="Hyperlink"/>
@@ -9155,7 +9505,7 @@
       <w:r>
         <w:t xml:space="preserve"> </w:t>
       </w:r>
-      <w:hyperlink r:id="rId192">
+      <w:hyperlink r:id="rId203">
         <w:r>
           <w:rPr>
             <w:rStyle w:val="Hyperlink"/>
@@ -9187,7 +9537,7 @@
       <w:r>
         <w:t xml:space="preserve"> </w:t>
       </w:r>
-      <w:hyperlink r:id="rId193">
+      <w:hyperlink r:id="rId204">
         <w:r>
           <w:rPr>
             <w:rStyle w:val="Hyperlink"/>
@@ -9219,7 +9569,7 @@
       <w:r>
         <w:t xml:space="preserve"> </w:t>
       </w:r>
-      <w:hyperlink r:id="rId194">
+      <w:hyperlink r:id="rId205">
         <w:r>
           <w:rPr>
             <w:rStyle w:val="Hyperlink"/>
@@ -9251,7 +9601,7 @@
       <w:r>
         <w:t xml:space="preserve"> </w:t>
       </w:r>
-      <w:hyperlink r:id="rId195">
+      <w:hyperlink r:id="rId206">
         <w:r>
           <w:rPr>
             <w:rStyle w:val="Hyperlink"/>
@@ -9283,7 +9633,7 @@
       <w:r>
         <w:t xml:space="preserve"> </w:t>
       </w:r>
-      <w:hyperlink r:id="rId196">
+      <w:hyperlink r:id="rId207">
         <w:r>
           <w:rPr>
             <w:rStyle w:val="Hyperlink"/>
@@ -9315,7 +9665,7 @@
       <w:r>
         <w:t xml:space="preserve"> </w:t>
       </w:r>
-      <w:hyperlink r:id="rId197">
+      <w:hyperlink r:id="rId208">
         <w:r>
           <w:rPr>
             <w:rStyle w:val="Hyperlink"/>
@@ -9347,7 +9697,7 @@
       <w:r>
         <w:t xml:space="preserve"> </w:t>
       </w:r>
-      <w:hyperlink r:id="rId198">
+      <w:hyperlink r:id="rId209">
         <w:r>
           <w:rPr>
             <w:rStyle w:val="Hyperlink"/>
@@ -9379,7 +9729,7 @@
       <w:r>
         <w:t xml:space="preserve"> </w:t>
       </w:r>
-      <w:hyperlink r:id="rId199">
+      <w:hyperlink r:id="rId210">
         <w:r>
           <w:rPr>
             <w:rStyle w:val="Hyperlink"/>
@@ -9411,7 +9761,7 @@
       <w:r>
         <w:t xml:space="preserve"> </w:t>
       </w:r>
-      <w:hyperlink r:id="rId200">
+      <w:hyperlink r:id="rId211">
         <w:r>
           <w:rPr>
             <w:rStyle w:val="Hyperlink"/>
@@ -9443,7 +9793,7 @@
       <w:r>
         <w:t xml:space="preserve"> </w:t>
       </w:r>
-      <w:hyperlink r:id="rId201">
+      <w:hyperlink r:id="rId212">
         <w:r>
           <w:rPr>
             <w:rStyle w:val="Hyperlink"/>
@@ -9475,7 +9825,7 @@
       <w:r>
         <w:t xml:space="preserve"> </w:t>
       </w:r>
-      <w:hyperlink r:id="rId202">
+      <w:hyperlink r:id="rId213">
         <w:r>
           <w:rPr>
             <w:rStyle w:val="Hyperlink"/>
@@ -9507,7 +9857,7 @@
       <w:r>
         <w:t xml:space="preserve"> </w:t>
       </w:r>
-      <w:hyperlink r:id="rId203">
+      <w:hyperlink r:id="rId214">
         <w:r>
           <w:rPr>
             <w:rStyle w:val="Hyperlink"/>
@@ -9521,6 +9871,55 @@
         <w:pStyle w:val="BodyText"/>
       </w:pPr>
       <w:r>
+        <w:t xml:space="preserve">Phan, A. T., Nguyen, V. S., Dinh, V. T., Thai, V. H., Nguyen, C. T., Dao, Q. T., Nguyen, V. L., &amp; Do, T. H. (2021). The moderating effects of the manager's characteristics and financial obstacles on internationalization and firm performance in Poland.</w:t>
+      </w:r>
+      <w:r>
+        <w:t xml:space="preserve"> </w:t>
+      </w:r>
+      <w:r>
+        <w:rPr>
+          <w:iCs/>
+          <w:i/>
+        </w:rPr>
+        <w:t xml:space="preserve">PalArch's Journal of Archaeology of Egypt/Egyptology, 18</w:t>
+      </w:r>
+      <w:r>
+        <w:t xml:space="preserve">(4), 4063–4081.</w:t>
+      </w:r>
+      <w:r>
+        <w:t xml:space="preserve"> </w:t>
+      </w:r>
+      <w:r>
+        <w:t xml:space="preserve">Phan, A. T., Do, T. H., &amp; Phan, M. T. (2020). The moderating effects of managers' experience and gender on internationalization and firm performance of manufacturing enterprises in Turkey.</w:t>
+      </w:r>
+      <w:r>
+        <w:t xml:space="preserve"> </w:t>
+      </w:r>
+      <w:r>
+        <w:rPr>
+          <w:iCs/>
+          <w:i/>
+        </w:rPr>
+        <w:t xml:space="preserve">Accounting, 6</w:t>
+      </w:r>
+      <w:r>
+        <w:t xml:space="preserve">(7), 1209–1216.</w:t>
+      </w:r>
+      <w:r>
+        <w:t xml:space="preserve"> </w:t>
+      </w:r>
+      <w:hyperlink r:id="rId215">
+        <w:r>
+          <w:rPr>
+            <w:rStyle w:val="Hyperlink"/>
+          </w:rPr>
+          <w:t xml:space="preserve">https://doi.org/10.5267/j.ac.2020.9.006</w:t>
+        </w:r>
+      </w:hyperlink>
+      <w:r>
+        <w:t xml:space="preserve"> </w:t>
+      </w:r>
+      <w:r>
         <w:t xml:space="preserve">Phan, A. T., Tran, T. M., &amp; Lu, T. M. (2020). The existence of W-shaped relationship between internationalization and firm performance: An empirical study of enterprises in Cameroon.</w:t>
       </w:r>
       <w:r>
@@ -9539,7 +9938,7 @@
       <w:r>
         <w:t xml:space="preserve"> </w:t>
       </w:r>
-      <w:hyperlink r:id="rId204">
+      <w:hyperlink r:id="rId216">
         <w:r>
           <w:rPr>
             <w:rStyle w:val="Hyperlink"/>
@@ -9571,7 +9970,7 @@
       <w:r>
         <w:t xml:space="preserve"> </w:t>
       </w:r>
-      <w:hyperlink r:id="rId205">
+      <w:hyperlink r:id="rId217">
         <w:r>
           <w:rPr>
             <w:rStyle w:val="Hyperlink"/>
@@ -9603,7 +10002,7 @@
       <w:r>
         <w:t xml:space="preserve"> </w:t>
       </w:r>
-      <w:hyperlink r:id="rId206">
+      <w:hyperlink r:id="rId218">
         <w:r>
           <w:rPr>
             <w:rStyle w:val="Hyperlink"/>
@@ -9635,7 +10034,7 @@
       <w:r>
         <w:t xml:space="preserve"> </w:t>
       </w:r>
-      <w:hyperlink r:id="rId207">
+      <w:hyperlink r:id="rId219">
         <w:r>
           <w:rPr>
             <w:rStyle w:val="Hyperlink"/>
@@ -9667,7 +10066,7 @@
       <w:r>
         <w:t xml:space="preserve"> </w:t>
       </w:r>
-      <w:hyperlink r:id="rId208">
+      <w:hyperlink r:id="rId220">
         <w:r>
           <w:rPr>
             <w:rStyle w:val="Hyperlink"/>
@@ -9699,7 +10098,7 @@
       <w:r>
         <w:t xml:space="preserve"> </w:t>
       </w:r>
-      <w:hyperlink r:id="rId209">
+      <w:hyperlink r:id="rId221">
         <w:r>
           <w:rPr>
             <w:rStyle w:val="Hyperlink"/>
@@ -9731,7 +10130,7 @@
       <w:r>
         <w:t xml:space="preserve"> </w:t>
       </w:r>
-      <w:hyperlink r:id="rId210">
+      <w:hyperlink r:id="rId222">
         <w:r>
           <w:rPr>
             <w:rStyle w:val="Hyperlink"/>
@@ -9763,7 +10162,7 @@
       <w:r>
         <w:t xml:space="preserve"> </w:t>
       </w:r>
-      <w:hyperlink r:id="rId211">
+      <w:hyperlink r:id="rId223">
         <w:r>
           <w:rPr>
             <w:rStyle w:val="Hyperlink"/>
@@ -9795,7 +10194,7 @@
       <w:r>
         <w:t xml:space="preserve"> </w:t>
       </w:r>
-      <w:hyperlink r:id="rId212">
+      <w:hyperlink r:id="rId224">
         <w:r>
           <w:rPr>
             <w:rStyle w:val="Hyperlink"/>
@@ -9827,7 +10226,7 @@
       <w:r>
         <w:t xml:space="preserve"> </w:t>
       </w:r>
-      <w:hyperlink r:id="rId213">
+      <w:hyperlink r:id="rId225">
         <w:r>
           <w:rPr>
             <w:rStyle w:val="Hyperlink"/>
@@ -9859,7 +10258,7 @@
       <w:r>
         <w:t xml:space="preserve"> </w:t>
       </w:r>
-      <w:hyperlink r:id="rId214">
+      <w:hyperlink r:id="rId226">
         <w:r>
           <w:rPr>
             <w:rStyle w:val="Hyperlink"/>
@@ -9891,7 +10290,7 @@
       <w:r>
         <w:t xml:space="preserve"> </w:t>
       </w:r>
-      <w:hyperlink r:id="rId215">
+      <w:hyperlink r:id="rId227">
         <w:r>
           <w:rPr>
             <w:rStyle w:val="Hyperlink"/>
@@ -9923,7 +10322,7 @@
       <w:r>
         <w:t xml:space="preserve"> </w:t>
       </w:r>
-      <w:hyperlink r:id="rId216">
+      <w:hyperlink r:id="rId228">
         <w:r>
           <w:rPr>
             <w:rStyle w:val="Hyperlink"/>
@@ -9955,7 +10354,7 @@
       <w:r>
         <w:t xml:space="preserve"> </w:t>
       </w:r>
-      <w:hyperlink r:id="rId217">
+      <w:hyperlink r:id="rId229">
         <w:r>
           <w:rPr>
             <w:rStyle w:val="Hyperlink"/>
@@ -9987,7 +10386,7 @@
       <w:r>
         <w:t xml:space="preserve"> </w:t>
       </w:r>
-      <w:hyperlink r:id="rId218">
+      <w:hyperlink r:id="rId230">
         <w:r>
           <w:rPr>
             <w:rStyle w:val="Hyperlink"/>
@@ -10019,7 +10418,7 @@
       <w:r>
         <w:t xml:space="preserve"> </w:t>
       </w:r>
-      <w:hyperlink r:id="rId219">
+      <w:hyperlink r:id="rId231">
         <w:r>
           <w:rPr>
             <w:rStyle w:val="Hyperlink"/>
@@ -10051,7 +10450,7 @@
       <w:r>
         <w:t xml:space="preserve"> </w:t>
       </w:r>
-      <w:hyperlink r:id="rId220">
+      <w:hyperlink r:id="rId232">
         <w:r>
           <w:rPr>
             <w:rStyle w:val="Hyperlink"/>
@@ -10104,7 +10503,7 @@
       <w:r>
         <w:t xml:space="preserve"> </w:t>
       </w:r>
-      <w:hyperlink r:id="rId221">
+      <w:hyperlink r:id="rId233">
         <w:r>
           <w:rPr>
             <w:rStyle w:val="Hyperlink"/>
@@ -10113,8 +10512,8 @@
         </w:r>
       </w:hyperlink>
     </w:p>
-    <w:bookmarkEnd w:id="222"/>
-    <w:bookmarkStart w:id="225" w:name="X13ca3423c1f2d995bab900015dad5abfa63892f"/>
+    <w:bookmarkEnd w:id="234"/>
+    <w:bookmarkStart w:id="237" w:name="X13ca3423c1f2d995bab900015dad5abfa63892f"/>
     <w:p>
       <w:pPr>
         <w:pStyle w:val="Heading2"/>
@@ -10169,7 +10568,7 @@
       <w:r>
         <w:t xml:space="preserve"> </w:t>
       </w:r>
-      <w:hyperlink r:id="rId223">
+      <w:hyperlink r:id="rId235">
         <w:r>
           <w:rPr>
             <w:rStyle w:val="Hyperlink"/>
@@ -10201,7 +10600,7 @@
       <w:r>
         <w:t xml:space="preserve"> </w:t>
       </w:r>
-      <w:hyperlink r:id="rId224">
+      <w:hyperlink r:id="rId236">
         <w:r>
           <w:rPr>
             <w:rStyle w:val="Hyperlink"/>
@@ -10210,12 +10609,1231 @@
         </w:r>
       </w:hyperlink>
     </w:p>
-    <w:bookmarkEnd w:id="225"/>
-    <w:bookmarkEnd w:id="226"/>
-    <w:sectPr>
-      <w:pgSz w:h="16838" w:w="11906"/>
-      <w:pgMar w:bottom="1417" w:left="1417" w:right="1417" w:top="1417"/>
-    </w:sectPr>
+    <w:bookmarkEnd w:id="237"/>
+    <w:bookmarkStart w:id="256" w:name="X1f677b404f97ba22f87d8bdb5cc7004e34b04e3"/>
+    <w:p>
+      <w:pPr>
+        <w:pStyle w:val="Heading2"/>
+      </w:pPr>
+      <w:r>
+        <w:t xml:space="preserve">U. P6 Meta-Analysis + Supplementary References v3.0 (17/05/2026)</w:t>
+      </w:r>
+    </w:p>
+    <w:p>
+      <w:pPr>
+        <w:pStyle w:val="BlockText"/>
+      </w:pPr>
+      <w:r>
+        <w:t xml:space="preserve">Các entries dưới đây được xác định qua APA7 audit toàn diện cho P6 manuscript, CD1, và CD2. Chỉ gồm entries CHƯA có dạng formatted đầy đủ trong các phần trên.</w:t>
+      </w:r>
+    </w:p>
+    <w:p>
+      <w:pPr>
+        <w:pStyle w:val="FirstParagraph"/>
+      </w:pPr>
+      <w:r>
+        <w:t xml:space="preserve">Aguinis, H., Dalton, D. R., Bosco, F. A., Pierce, C. A., &amp; Dalton, C. M. (2011). Meta-analytic choices and judgment calls: Implications for theory and research.</w:t>
+      </w:r>
+      <w:r>
+        <w:t xml:space="preserve"> </w:t>
+      </w:r>
+      <w:r>
+        <w:rPr>
+          <w:iCs/>
+          <w:i/>
+        </w:rPr>
+        <w:t xml:space="preserve">Journal of Management, 37</w:t>
+      </w:r>
+      <w:r>
+        <w:t xml:space="preserve">(1), 5–38.</w:t>
+      </w:r>
+      <w:r>
+        <w:t xml:space="preserve"> </w:t>
+      </w:r>
+      <w:hyperlink r:id="rId238">
+        <w:r>
+          <w:rPr>
+            <w:rStyle w:val="Hyperlink"/>
+          </w:rPr>
+          <w:t xml:space="preserve">https://doi.org/10.1177/0149206310370708</w:t>
+        </w:r>
+      </w:hyperlink>
+    </w:p>
+    <w:p>
+      <w:pPr>
+        <w:pStyle w:val="BodyText"/>
+      </w:pPr>
+      <w:r>
+        <w:t xml:space="preserve">Beblawi, H. (1987). The rentier state in the Arab world. In H. Beblawi &amp; G. Luciani (Eds.),</w:t>
+      </w:r>
+      <w:r>
+        <w:t xml:space="preserve"> </w:t>
+      </w:r>
+      <w:r>
+        <w:rPr>
+          <w:iCs/>
+          <w:i/>
+        </w:rPr>
+        <w:t xml:space="preserve">The rentier state</w:t>
+      </w:r>
+      <w:r>
+        <w:t xml:space="preserve"> </w:t>
+      </w:r>
+      <w:r>
+        <w:t xml:space="preserve">(pp. 49–62). Croom Helm.</w:t>
+      </w:r>
+    </w:p>
+    <w:p>
+      <w:pPr>
+        <w:pStyle w:val="BodyText"/>
+      </w:pPr>
+      <w:r>
+        <w:t xml:space="preserve">Borenstein, M., Hedges, L. V., Higgins, J. P. T., &amp; Rothstein, H. R. (2021).</w:t>
+      </w:r>
+      <w:r>
+        <w:t xml:space="preserve"> </w:t>
+      </w:r>
+      <w:r>
+        <w:rPr>
+          <w:iCs/>
+          <w:i/>
+        </w:rPr>
+        <w:t xml:space="preserve">Introduction to meta-analysis</w:t>
+      </w:r>
+      <w:r>
+        <w:t xml:space="preserve"> </w:t>
+      </w:r>
+      <w:r>
+        <w:t xml:space="preserve">(2nd ed.). Wiley.</w:t>
+      </w:r>
+    </w:p>
+    <w:p>
+      <w:pPr>
+        <w:pStyle w:val="BodyText"/>
+      </w:pPr>
+      <w:r>
+        <w:t xml:space="preserve">Briguglio, L. (1995). Small island developing states and their economic vulnerabilities.</w:t>
+      </w:r>
+      <w:r>
+        <w:t xml:space="preserve"> </w:t>
+      </w:r>
+      <w:r>
+        <w:rPr>
+          <w:iCs/>
+          <w:i/>
+        </w:rPr>
+        <w:t xml:space="preserve">World Development, 23</w:t>
+      </w:r>
+      <w:r>
+        <w:t xml:space="preserve">(9), 1615–1632.</w:t>
+      </w:r>
+      <w:r>
+        <w:t xml:space="preserve"> </w:t>
+      </w:r>
+      <w:hyperlink r:id="rId239">
+        <w:r>
+          <w:rPr>
+            <w:rStyle w:val="Hyperlink"/>
+          </w:rPr>
+          <w:t xml:space="preserve">https://doi.org/10.1016/0305-750X(95)00065-K</w:t>
+        </w:r>
+      </w:hyperlink>
+    </w:p>
+    <w:p>
+      <w:pPr>
+        <w:pStyle w:val="BodyText"/>
+      </w:pPr>
+      <w:r>
+        <w:t xml:space="preserve">Cameron, A. C., &amp; Miller, D. L. (2015). A practitioner's guide to cluster-robust inference.</w:t>
+      </w:r>
+      <w:r>
+        <w:t xml:space="preserve"> </w:t>
+      </w:r>
+      <w:r>
+        <w:rPr>
+          <w:iCs/>
+          <w:i/>
+        </w:rPr>
+        <w:t xml:space="preserve">Journal of Human Resources, 50</w:t>
+      </w:r>
+      <w:r>
+        <w:t xml:space="preserve">(2), 317–372.</w:t>
+      </w:r>
+      <w:r>
+        <w:t xml:space="preserve"> </w:t>
+      </w:r>
+      <w:hyperlink r:id="rId240">
+        <w:r>
+          <w:rPr>
+            <w:rStyle w:val="Hyperlink"/>
+          </w:rPr>
+          <w:t xml:space="preserve">https://doi.org/10.3368/jhr.50.2.317</w:t>
+        </w:r>
+      </w:hyperlink>
+    </w:p>
+    <w:p>
+      <w:pPr>
+        <w:pStyle w:val="BodyText"/>
+      </w:pPr>
+      <w:r>
+        <w:t xml:space="preserve">Chodorow-Reich, G., Gopinath, G., Mishra, P., &amp; Narayanan, A. (2020). Cash and the economy: Evidence from India's demonetization.</w:t>
+      </w:r>
+      <w:r>
+        <w:t xml:space="preserve"> </w:t>
+      </w:r>
+      <w:r>
+        <w:rPr>
+          <w:iCs/>
+          <w:i/>
+        </w:rPr>
+        <w:t xml:space="preserve">Quarterly Journal of Economics, 135</w:t>
+      </w:r>
+      <w:r>
+        <w:t xml:space="preserve">(1), 57–103.</w:t>
+      </w:r>
+      <w:r>
+        <w:t xml:space="preserve"> </w:t>
+      </w:r>
+      <w:hyperlink r:id="rId241">
+        <w:r>
+          <w:rPr>
+            <w:rStyle w:val="Hyperlink"/>
+          </w:rPr>
+          <w:t xml:space="preserve">https://doi.org/10.1093/qje/qjz027</w:t>
+        </w:r>
+      </w:hyperlink>
+      <w:r>
+        <w:t xml:space="preserve"> </w:t>
+      </w:r>
+      <w:r>
+        <w:t xml:space="preserve">Cohen, J. (1988).</w:t>
+      </w:r>
+      <w:r>
+        <w:t xml:space="preserve"> </w:t>
+      </w:r>
+      <w:r>
+        <w:rPr>
+          <w:iCs/>
+          <w:i/>
+        </w:rPr>
+        <w:t xml:space="preserve">Statistical power analysis for the behavioral sciences</w:t>
+      </w:r>
+      <w:r>
+        <w:t xml:space="preserve"> </w:t>
+      </w:r>
+      <w:r>
+        <w:t xml:space="preserve">(2nd ed.). Lawrence Erlbaum.</w:t>
+      </w:r>
+    </w:p>
+    <w:p>
+      <w:pPr>
+        <w:pStyle w:val="BodyText"/>
+      </w:pPr>
+      <w:r>
+        <w:t xml:space="preserve">Contractor, F. J. (2012). Why do multinational firms exist? A theory note about the effect of multinational expansion on performance and recent methodological critiques.</w:t>
+      </w:r>
+      <w:r>
+        <w:t xml:space="preserve"> </w:t>
+      </w:r>
+      <w:r>
+        <w:rPr>
+          <w:iCs/>
+          <w:i/>
+        </w:rPr>
+        <w:t xml:space="preserve">Global Strategy Journal, 2</w:t>
+      </w:r>
+      <w:r>
+        <w:t xml:space="preserve">(4), 318–331.</w:t>
+      </w:r>
+      <w:r>
+        <w:t xml:space="preserve"> </w:t>
+      </w:r>
+      <w:hyperlink r:id="rId242">
+        <w:r>
+          <w:rPr>
+            <w:rStyle w:val="Hyperlink"/>
+          </w:rPr>
+          <w:t xml:space="preserve">https://doi.org/10.1111/j.2042-5805.2012.01043.x</w:t>
+        </w:r>
+      </w:hyperlink>
+    </w:p>
+    <w:p>
+      <w:pPr>
+        <w:pStyle w:val="BodyText"/>
+      </w:pPr>
+      <w:r>
+        <w:t xml:space="preserve">Cooper, H. (2010).</w:t>
+      </w:r>
+      <w:r>
+        <w:t xml:space="preserve"> </w:t>
+      </w:r>
+      <w:r>
+        <w:rPr>
+          <w:iCs/>
+          <w:i/>
+        </w:rPr>
+        <w:t xml:space="preserve">Research synthesis and meta-analysis: A step-by-step approach</w:t>
+      </w:r>
+      <w:r>
+        <w:t xml:space="preserve"> </w:t>
+      </w:r>
+      <w:r>
+        <w:t xml:space="preserve">(4th ed.). Sage.</w:t>
+      </w:r>
+    </w:p>
+    <w:p>
+      <w:pPr>
+        <w:pStyle w:val="BodyText"/>
+      </w:pPr>
+      <w:r>
+        <w:t xml:space="preserve">Hambrick, D. C. (2007). Upper echelons theory: An update.</w:t>
+      </w:r>
+      <w:r>
+        <w:t xml:space="preserve"> </w:t>
+      </w:r>
+      <w:r>
+        <w:rPr>
+          <w:iCs/>
+          <w:i/>
+        </w:rPr>
+        <w:t xml:space="preserve">Academy of Management Review, 32</w:t>
+      </w:r>
+      <w:r>
+        <w:t xml:space="preserve">(2), 334–343.</w:t>
+      </w:r>
+      <w:r>
+        <w:t xml:space="preserve"> </w:t>
+      </w:r>
+      <w:hyperlink r:id="rId243">
+        <w:r>
+          <w:rPr>
+            <w:rStyle w:val="Hyperlink"/>
+          </w:rPr>
+          <w:t xml:space="preserve">https://doi.org/10.5465/amr.2007.24345254</w:t>
+        </w:r>
+      </w:hyperlink>
+    </w:p>
+    <w:p>
+      <w:pPr>
+        <w:pStyle w:val="BodyText"/>
+      </w:pPr>
+      <w:r>
+        <w:t xml:space="preserve">Hambrick, D. C., &amp; Mason, P. A. (1984). Upper echelons: The organization as a reflection of its top managers.</w:t>
+      </w:r>
+      <w:r>
+        <w:t xml:space="preserve"> </w:t>
+      </w:r>
+      <w:r>
+        <w:rPr>
+          <w:iCs/>
+          <w:i/>
+        </w:rPr>
+        <w:t xml:space="preserve">Academy of Management Review, 9</w:t>
+      </w:r>
+      <w:r>
+        <w:t xml:space="preserve">(2), 193–206.</w:t>
+      </w:r>
+      <w:r>
+        <w:t xml:space="preserve"> </w:t>
+      </w:r>
+      <w:hyperlink r:id="rId244">
+        <w:r>
+          <w:rPr>
+            <w:rStyle w:val="Hyperlink"/>
+          </w:rPr>
+          <w:t xml:space="preserve">https://doi.org/10.5465/amr.1984.4277628</w:t>
+        </w:r>
+      </w:hyperlink>
+    </w:p>
+    <w:p>
+      <w:pPr>
+        <w:pStyle w:val="BodyText"/>
+      </w:pPr>
+      <w:r>
+        <w:t xml:space="preserve">Hedges, L. V., &amp; Olkin, I. (1985).</w:t>
+      </w:r>
+      <w:r>
+        <w:t xml:space="preserve"> </w:t>
+      </w:r>
+      <w:r>
+        <w:rPr>
+          <w:iCs/>
+          <w:i/>
+        </w:rPr>
+        <w:t xml:space="preserve">Statistical methods for meta-analysis</w:t>
+      </w:r>
+      <w:r>
+        <w:t xml:space="preserve">. Academic Press.</w:t>
+      </w:r>
+    </w:p>
+    <w:p>
+      <w:pPr>
+        <w:pStyle w:val="BodyText"/>
+      </w:pPr>
+      <w:r>
+        <w:t xml:space="preserve">Helpman, E., Melitz, M. J., &amp; Yeaple, S. R. (2004). Export versus FDI with heterogeneous firms.</w:t>
+      </w:r>
+      <w:r>
+        <w:t xml:space="preserve"> </w:t>
+      </w:r>
+      <w:r>
+        <w:rPr>
+          <w:iCs/>
+          <w:i/>
+        </w:rPr>
+        <w:t xml:space="preserve">American Economic Review, 94</w:t>
+      </w:r>
+      <w:r>
+        <w:t xml:space="preserve">(1), 300–316.</w:t>
+      </w:r>
+      <w:r>
+        <w:t xml:space="preserve"> </w:t>
+      </w:r>
+      <w:hyperlink r:id="rId245">
+        <w:r>
+          <w:rPr>
+            <w:rStyle w:val="Hyperlink"/>
+          </w:rPr>
+          <w:t xml:space="preserve">https://doi.org/10.1257/000282804322970814</w:t>
+        </w:r>
+      </w:hyperlink>
+    </w:p>
+    <w:p>
+      <w:pPr>
+        <w:pStyle w:val="BodyText"/>
+      </w:pPr>
+      <w:r>
+        <w:t xml:space="preserve">Jacquemin, A. P., &amp; Berry, C. H. (1979). Entropy measure of diversification and corporate growth.</w:t>
+      </w:r>
+      <w:r>
+        <w:t xml:space="preserve"> </w:t>
+      </w:r>
+      <w:r>
+        <w:rPr>
+          <w:iCs/>
+          <w:i/>
+        </w:rPr>
+        <w:t xml:space="preserve">Journal of Industrial Economics, 27</w:t>
+      </w:r>
+      <w:r>
+        <w:t xml:space="preserve">(4), 359–369.</w:t>
+      </w:r>
+      <w:r>
+        <w:t xml:space="preserve"> </w:t>
+      </w:r>
+      <w:hyperlink r:id="rId246">
+        <w:r>
+          <w:rPr>
+            <w:rStyle w:val="Hyperlink"/>
+          </w:rPr>
+          <w:t xml:space="preserve">https://doi.org/10.2307/2097958</w:t>
+        </w:r>
+      </w:hyperlink>
+    </w:p>
+    <w:p>
+      <w:pPr>
+        <w:pStyle w:val="BodyText"/>
+      </w:pPr>
+      <w:r>
+        <w:t xml:space="preserve">Katz, R., &amp; Callorda, F. (2018).</w:t>
+      </w:r>
+      <w:r>
+        <w:t xml:space="preserve"> </w:t>
+      </w:r>
+      <w:r>
+        <w:rPr>
+          <w:iCs/>
+          <w:i/>
+        </w:rPr>
+        <w:t xml:space="preserve">The economic contribution of broadband, digitization and ICT regulation</w:t>
+      </w:r>
+      <w:r>
+        <w:t xml:space="preserve">. ITU Telecommunication Development Sector.</w:t>
+      </w:r>
+    </w:p>
+    <w:p>
+      <w:pPr>
+        <w:pStyle w:val="BodyText"/>
+      </w:pPr>
+      <w:r>
+        <w:t xml:space="preserve">Kraus, S., Breier, M., Lim, W. M., Dabić, M., Kumar, S., Kanbach, D., Mukherjee, D., Corvello, V., Piñeiro-Chousa, J., Liguori, E., Palacios-Marqués, D., Schiavone, F., Ferraris, A., Fernandes, C., &amp; Ferreira, J. J. (2022). Literature reviews as independent studies: Guidelines for academic practice.</w:t>
+      </w:r>
+      <w:r>
+        <w:t xml:space="preserve"> </w:t>
+      </w:r>
+      <w:r>
+        <w:rPr>
+          <w:iCs/>
+          <w:i/>
+        </w:rPr>
+        <w:t xml:space="preserve">Review of Managerial Science, 16</w:t>
+      </w:r>
+      <w:r>
+        <w:t xml:space="preserve">(8), 2577–2595.</w:t>
+      </w:r>
+      <w:r>
+        <w:t xml:space="preserve"> </w:t>
+      </w:r>
+      <w:hyperlink r:id="rId247">
+        <w:r>
+          <w:rPr>
+            <w:rStyle w:val="Hyperlink"/>
+          </w:rPr>
+          <w:t xml:space="preserve">https://doi.org/10.1007/s11846-022-00588-8</w:t>
+        </w:r>
+      </w:hyperlink>
+    </w:p>
+    <w:p>
+      <w:pPr>
+        <w:pStyle w:val="BodyText"/>
+      </w:pPr>
+      <w:r>
+        <w:t xml:space="preserve">Landis, J. R., &amp; Koch, G. G. (1977). The measurement of observer agreement for categorical data.</w:t>
+      </w:r>
+      <w:r>
+        <w:t xml:space="preserve"> </w:t>
+      </w:r>
+      <w:r>
+        <w:rPr>
+          <w:iCs/>
+          <w:i/>
+        </w:rPr>
+        <w:t xml:space="preserve">Biometrics, 33</w:t>
+      </w:r>
+      <w:r>
+        <w:t xml:space="preserve">(1), 159–174.</w:t>
+      </w:r>
+      <w:r>
+        <w:t xml:space="preserve"> </w:t>
+      </w:r>
+      <w:hyperlink r:id="rId248">
+        <w:r>
+          <w:rPr>
+            <w:rStyle w:val="Hyperlink"/>
+          </w:rPr>
+          <w:t xml:space="preserve">https://doi.org/10.2307/2529310</w:t>
+        </w:r>
+      </w:hyperlink>
+    </w:p>
+    <w:p>
+      <w:pPr>
+        <w:pStyle w:val="BodyText"/>
+      </w:pPr>
+      <w:r>
+        <w:t xml:space="preserve">Peng, M. W., Wang, D. Y. L., &amp; Jiang, Y. (2008). An institution-based view of international business strategy: A focus on emerging economies.</w:t>
+      </w:r>
+      <w:r>
+        <w:t xml:space="preserve"> </w:t>
+      </w:r>
+      <w:r>
+        <w:rPr>
+          <w:iCs/>
+          <w:i/>
+        </w:rPr>
+        <w:t xml:space="preserve">Journal of International Business Studies, 39</w:t>
+      </w:r>
+      <w:r>
+        <w:t xml:space="preserve">(5), 920–936.</w:t>
+      </w:r>
+      <w:r>
+        <w:t xml:space="preserve"> </w:t>
+      </w:r>
+      <w:hyperlink r:id="rId249">
+        <w:r>
+          <w:rPr>
+            <w:rStyle w:val="Hyperlink"/>
+          </w:rPr>
+          <w:t xml:space="preserve">https://doi.org/10.1057/palgrave.jibs.8400377</w:t>
+        </w:r>
+      </w:hyperlink>
+    </w:p>
+    <w:p>
+      <w:pPr>
+        <w:pStyle w:val="BodyText"/>
+      </w:pPr>
+      <w:r>
+        <w:t xml:space="preserve">Peterson, R. A., &amp; Brown, S. P. (2005). On the use of beta coefficients in meta-analysis.</w:t>
+      </w:r>
+      <w:r>
+        <w:t xml:space="preserve"> </w:t>
+      </w:r>
+      <w:r>
+        <w:rPr>
+          <w:iCs/>
+          <w:i/>
+        </w:rPr>
+        <w:t xml:space="preserve">Journal of Applied Psychology, 90</w:t>
+      </w:r>
+      <w:r>
+        <w:t xml:space="preserve">(1), 175–181.</w:t>
+      </w:r>
+      <w:r>
+        <w:t xml:space="preserve"> </w:t>
+      </w:r>
+      <w:hyperlink r:id="rId250">
+        <w:r>
+          <w:rPr>
+            <w:rStyle w:val="Hyperlink"/>
+          </w:rPr>
+          <w:t xml:space="preserve">https://doi.org/10.1037/0021-9010.90.1.175</w:t>
+        </w:r>
+      </w:hyperlink>
+    </w:p>
+    <w:p>
+      <w:pPr>
+        <w:pStyle w:val="BodyText"/>
+      </w:pPr>
+      <w:r>
+        <w:t xml:space="preserve">Raudenbush, S. W., &amp; Bryk, A. S. (2002).</w:t>
+      </w:r>
+      <w:r>
+        <w:t xml:space="preserve"> </w:t>
+      </w:r>
+      <w:r>
+        <w:rPr>
+          <w:iCs/>
+          <w:i/>
+        </w:rPr>
+        <w:t xml:space="preserve">Hierarchical linear models: Applications and data analysis methods</w:t>
+      </w:r>
+      <w:r>
+        <w:t xml:space="preserve"> </w:t>
+      </w:r>
+      <w:r>
+        <w:t xml:space="preserve">(2nd ed.). Sage.</w:t>
+      </w:r>
+    </w:p>
+    <w:p>
+      <w:pPr>
+        <w:pStyle w:val="BodyText"/>
+      </w:pPr>
+      <w:r>
+        <w:t xml:space="preserve">Rosenthal, R. (1991).</w:t>
+      </w:r>
+      <w:r>
+        <w:t xml:space="preserve"> </w:t>
+      </w:r>
+      <w:r>
+        <w:rPr>
+          <w:iCs/>
+          <w:i/>
+        </w:rPr>
+        <w:t xml:space="preserve">Meta-analytic procedures for social research</w:t>
+      </w:r>
+      <w:r>
+        <w:t xml:space="preserve"> </w:t>
+      </w:r>
+      <w:r>
+        <w:t xml:space="preserve">(rev. ed.). Sage.</w:t>
+      </w:r>
+    </w:p>
+    <w:p>
+      <w:pPr>
+        <w:pStyle w:val="BodyText"/>
+      </w:pPr>
+      <w:r>
+        <w:t xml:space="preserve">Rosenthal, R. (1994). Parametric measures of effect size. In H. Cooper &amp; L. V. Hedges (Eds.),</w:t>
+      </w:r>
+      <w:r>
+        <w:t xml:space="preserve"> </w:t>
+      </w:r>
+      <w:r>
+        <w:rPr>
+          <w:iCs/>
+          <w:i/>
+        </w:rPr>
+        <w:t xml:space="preserve">The handbook of research synthesis</w:t>
+      </w:r>
+      <w:r>
+        <w:t xml:space="preserve"> </w:t>
+      </w:r>
+      <w:r>
+        <w:t xml:space="preserve">(pp. 231–244). Sage.</w:t>
+      </w:r>
+    </w:p>
+    <w:p>
+      <w:pPr>
+        <w:pStyle w:val="BodyText"/>
+      </w:pPr>
+      <w:r>
+        <w:t xml:space="preserve">Sachs, J. D., &amp; Warner, A. M. (2001). The curse of natural resources.</w:t>
+      </w:r>
+      <w:r>
+        <w:t xml:space="preserve"> </w:t>
+      </w:r>
+      <w:r>
+        <w:rPr>
+          <w:iCs/>
+          <w:i/>
+        </w:rPr>
+        <w:t xml:space="preserve">European Economic Review, 45</w:t>
+      </w:r>
+      <w:r>
+        <w:t xml:space="preserve">(4–6), 827–838.</w:t>
+      </w:r>
+      <w:r>
+        <w:t xml:space="preserve"> </w:t>
+      </w:r>
+      <w:hyperlink r:id="rId251">
+        <w:r>
+          <w:rPr>
+            <w:rStyle w:val="Hyperlink"/>
+          </w:rPr>
+          <w:t xml:space="preserve">https://doi.org/10.1016/S0014-2921(01)00125-8</w:t>
+        </w:r>
+      </w:hyperlink>
+    </w:p>
+    <w:p>
+      <w:pPr>
+        <w:pStyle w:val="BodyText"/>
+      </w:pPr>
+      <w:r>
+        <w:t xml:space="preserve">Sahay, R., von Allmen, U. E., Lahreche, A., Khera, P., Ogawa, S., Bazarbash, M., &amp; Beaton, K. (2020).</w:t>
+      </w:r>
+      <w:r>
+        <w:t xml:space="preserve"> </w:t>
+      </w:r>
+      <w:r>
+        <w:rPr>
+          <w:iCs/>
+          <w:i/>
+        </w:rPr>
+        <w:t xml:space="preserve">The promise of fintech: Financial inclusion in the post COVID-19 era</w:t>
+      </w:r>
+      <w:r>
+        <w:t xml:space="preserve"> </w:t>
+      </w:r>
+      <w:r>
+        <w:t xml:space="preserve">(IMF Departmental Paper No. DP/2020/09). International Monetary Fund.</w:t>
+      </w:r>
+    </w:p>
+    <w:p>
+      <w:pPr>
+        <w:pStyle w:val="BodyText"/>
+      </w:pPr>
+      <w:r>
+        <w:t xml:space="preserve">Solon, G., Haider, S. J., &amp; Wooldridge, J. M. (2015). What are we weighting for?</w:t>
+      </w:r>
+      <w:r>
+        <w:t xml:space="preserve"> </w:t>
+      </w:r>
+      <w:r>
+        <w:rPr>
+          <w:iCs/>
+          <w:i/>
+        </w:rPr>
+        <w:t xml:space="preserve">Journal of Human Resources, 50</w:t>
+      </w:r>
+      <w:r>
+        <w:t xml:space="preserve">(2), 301–316.</w:t>
+      </w:r>
+      <w:r>
+        <w:t xml:space="preserve"> </w:t>
+      </w:r>
+      <w:hyperlink r:id="rId252">
+        <w:r>
+          <w:rPr>
+            <w:rStyle w:val="Hyperlink"/>
+          </w:rPr>
+          <w:t xml:space="preserve">https://doi.org/10.3368/jhr.50.2.301</w:t>
+        </w:r>
+      </w:hyperlink>
+    </w:p>
+    <w:p>
+      <w:pPr>
+        <w:pStyle w:val="BodyText"/>
+      </w:pPr>
+      <w:r>
+        <w:t xml:space="preserve">Stanley, T. D., &amp; Doucouliagos, H. (2014). Meta-regression approximations to reduce publication selection bias.</w:t>
+      </w:r>
+      <w:r>
+        <w:t xml:space="preserve"> </w:t>
+      </w:r>
+      <w:r>
+        <w:rPr>
+          <w:iCs/>
+          <w:i/>
+        </w:rPr>
+        <w:t xml:space="preserve">Research Synthesis Methods, 5</w:t>
+      </w:r>
+      <w:r>
+        <w:t xml:space="preserve">(1), 60–78.</w:t>
+      </w:r>
+      <w:r>
+        <w:t xml:space="preserve"> </w:t>
+      </w:r>
+      <w:hyperlink r:id="rId253">
+        <w:r>
+          <w:rPr>
+            <w:rStyle w:val="Hyperlink"/>
+          </w:rPr>
+          <w:t xml:space="preserve">https://doi.org/10.1002/jrsm.1095</w:t>
+        </w:r>
+      </w:hyperlink>
+    </w:p>
+    <w:p>
+      <w:pPr>
+        <w:pStyle w:val="BodyText"/>
+      </w:pPr>
+      <w:r>
+        <w:t xml:space="preserve">Sutton, A. J., &amp; Higgins, J. P. T. (2008). Recent developments in meta-analysis.</w:t>
+      </w:r>
+      <w:r>
+        <w:t xml:space="preserve"> </w:t>
+      </w:r>
+      <w:r>
+        <w:rPr>
+          <w:iCs/>
+          <w:i/>
+        </w:rPr>
+        <w:t xml:space="preserve">Statistics in Medicine, 27</w:t>
+      </w:r>
+      <w:r>
+        <w:t xml:space="preserve">(5), 625–650.</w:t>
+      </w:r>
+      <w:r>
+        <w:t xml:space="preserve"> </w:t>
+      </w:r>
+      <w:hyperlink r:id="rId254">
+        <w:r>
+          <w:rPr>
+            <w:rStyle w:val="Hyperlink"/>
+          </w:rPr>
+          <w:t xml:space="preserve">https://doi.org/10.1002/sim.2982</w:t>
+        </w:r>
+      </w:hyperlink>
+    </w:p>
+    <w:p>
+      <w:pPr>
+        <w:pStyle w:val="BodyText"/>
+      </w:pPr>
+      <w:r>
+        <w:t xml:space="preserve">Viechtbauer, W. (2010). Conducting meta-analyses in R with the metafor package.</w:t>
+      </w:r>
+      <w:r>
+        <w:t xml:space="preserve"> </w:t>
+      </w:r>
+      <w:r>
+        <w:rPr>
+          <w:iCs/>
+          <w:i/>
+        </w:rPr>
+        <w:t xml:space="preserve">Journal of Statistical Software, 36</w:t>
+      </w:r>
+      <w:r>
+        <w:t xml:space="preserve">(3), 1–48.</w:t>
+      </w:r>
+      <w:r>
+        <w:t xml:space="preserve"> </w:t>
+      </w:r>
+      <w:hyperlink r:id="rId255">
+        <w:r>
+          <w:rPr>
+            <w:rStyle w:val="Hyperlink"/>
+          </w:rPr>
+          <w:t xml:space="preserve">https://doi.org/10.18637/jss.v036.i03</w:t>
+        </w:r>
+      </w:hyperlink>
+    </w:p>
+    <w:p>
+      <w:pPr>
+        <w:pStyle w:val="BodyText"/>
+      </w:pPr>
+      <w:r>
+        <w:t xml:space="preserve">Williamson, O. E. (1985).</w:t>
+      </w:r>
+      <w:r>
+        <w:t xml:space="preserve"> </w:t>
+      </w:r>
+      <w:r>
+        <w:rPr>
+          <w:iCs/>
+          <w:i/>
+        </w:rPr>
+        <w:t xml:space="preserve">The economic institutions of capitalism</w:t>
+      </w:r>
+      <w:r>
+        <w:t xml:space="preserve">. Free Press.</w:t>
+      </w:r>
+    </w:p>
+    <w:p>
+      <w:r>
+        <w:pict>
+          <v:rect style="width:0;height:1.5pt" o:hralign="center" o:hrstd="t" o:hr="t"/>
+        </w:pict>
+      </w:r>
+    </w:p>
+    <w:bookmarkEnd w:id="256"/>
+    <w:bookmarkStart w:id="269" w:name="X7c8d18040c2fcd1baa33c583d9b424af88cbcf9"/>
+    <w:p>
+      <w:pPr>
+        <w:pStyle w:val="Heading2"/>
+      </w:pPr>
+      <w:r>
+        <w:t xml:space="preserve">V. Citation Audit v3.1 (20/05/2026) — Entries chưa có trong refs</w:t>
+      </w:r>
+    </w:p>
+    <w:p>
+      <w:pPr>
+        <w:pStyle w:val="BlockText"/>
+      </w:pPr>
+      <w:r>
+        <w:t xml:space="preserve">Các entries dưới đây được thêm từ audit format-apa7 toàn bộ 5 chương luận án (20/05/2026). Gồm: 3 self-citations mới (P6 IBR, P7 JIBS, P8 World Dev), 8 entries từ "Giữ nguyên" blocks chưa được expand, và 2 auxiliary entries.</w:t>
+      </w:r>
+    </w:p>
+    <w:bookmarkStart w:id="257" w:name="X1aa55a8a90c58d2a8a44337f0e05096c11b314c"/>
+    <w:p>
+      <w:pPr>
+        <w:pStyle w:val="Heading3"/>
+      </w:pPr>
+      <w:r>
+        <w:t xml:space="preserve">Công trình của tác giả luận án — Cập nhật Section M</w:t>
+      </w:r>
+    </w:p>
+    <w:bookmarkEnd w:id="257"/>
+    <w:bookmarkStart w:id="264" w:name="Xdf63a4f8728db7927f83d32fc20da6aa00b18f3"/>
+    <w:p>
+      <w:pPr>
+        <w:pStyle w:val="Heading3"/>
+      </w:pPr>
+      <w:r>
+        <w:t xml:space="preserve">Phương pháp kinh tế lượng + Meta-analysis (Section J mở rộng)</w:t>
+      </w:r>
+    </w:p>
+    <w:p>
+      <w:pPr>
+        <w:pStyle w:val="FirstParagraph"/>
+      </w:pPr>
+      <w:r>
+        <w:t xml:space="preserve">Arte, L., &amp; Larimo, J. (2022). Moderating influence of psychic distance on the international diversification–performance relationship: Insights from a meta-analysis.</w:t>
+      </w:r>
+      <w:r>
+        <w:t xml:space="preserve"> </w:t>
+      </w:r>
+      <w:r>
+        <w:rPr>
+          <w:iCs/>
+          <w:i/>
+        </w:rPr>
+        <w:t xml:space="preserve">Journal of Business Research, 139</w:t>
+      </w:r>
+      <w:r>
+        <w:t xml:space="preserve">, 230–245.</w:t>
+      </w:r>
+      <w:r>
+        <w:t xml:space="preserve"> </w:t>
+      </w:r>
+      <w:hyperlink r:id="rId258">
+        <w:r>
+          <w:rPr>
+            <w:rStyle w:val="Hyperlink"/>
+          </w:rPr>
+          <w:t xml:space="preserve">https://doi.org/10.1016/j.jbusres.2021.09.060</w:t>
+        </w:r>
+      </w:hyperlink>
+    </w:p>
+    <w:p>
+      <w:pPr>
+        <w:pStyle w:val="BodyText"/>
+      </w:pPr>
+      <w:r>
+        <w:t xml:space="preserve">Aterido, R., Hallward-Driemeier, M., &amp; Pagés, C. (2011). Big constraints to small firms' growth? Business environment and employment growth across firms.</w:t>
+      </w:r>
+      <w:r>
+        <w:t xml:space="preserve"> </w:t>
+      </w:r>
+      <w:r>
+        <w:rPr>
+          <w:iCs/>
+          <w:i/>
+        </w:rPr>
+        <w:t xml:space="preserve">Economic Development and Cultural Change, 59</w:t>
+      </w:r>
+      <w:r>
+        <w:t xml:space="preserve">(3), 609–647.</w:t>
+      </w:r>
+      <w:r>
+        <w:t xml:space="preserve"> </w:t>
+      </w:r>
+      <w:hyperlink r:id="rId259">
+        <w:r>
+          <w:rPr>
+            <w:rStyle w:val="Hyperlink"/>
+          </w:rPr>
+          <w:t xml:space="preserve">https://doi.org/10.1086/658349</w:t>
+        </w:r>
+      </w:hyperlink>
+    </w:p>
+    <w:p>
+      <w:pPr>
+        <w:pStyle w:val="BodyText"/>
+      </w:pPr>
+      <w:r>
+        <w:t xml:space="preserve">Borenstein, M., Hedges, L. V., Higgins, J. P. T., &amp; Rothstein, H. R. (2009).</w:t>
+      </w:r>
+      <w:r>
+        <w:t xml:space="preserve"> </w:t>
+      </w:r>
+      <w:r>
+        <w:rPr>
+          <w:iCs/>
+          <w:i/>
+        </w:rPr>
+        <w:t xml:space="preserve">Introduction to meta-analysis</w:t>
+      </w:r>
+      <w:r>
+        <w:t xml:space="preserve">. Wiley.</w:t>
+      </w:r>
+      <w:r>
+        <w:t xml:space="preserve"> </w:t>
+      </w:r>
+      <w:hyperlink r:id="rId260">
+        <w:r>
+          <w:rPr>
+            <w:rStyle w:val="Hyperlink"/>
+          </w:rPr>
+          <w:t xml:space="preserve">https://doi.org/10.1002/9780470743386</w:t>
+        </w:r>
+      </w:hyperlink>
+      <w:r>
+        <w:t xml:space="preserve"> </w:t>
+      </w:r>
+      <w:r>
+        <w:rPr>
+          <w:iCs/>
+          <w:i/>
+        </w:rPr>
+        <w:t xml:space="preserve">(Lần xuất bản đầu — khác với Borenstein et al. 2021 [2nd ed.].)</w:t>
+      </w:r>
+    </w:p>
+    <w:p>
+      <w:pPr>
+        <w:pStyle w:val="BodyText"/>
+      </w:pPr>
+      <w:r>
+        <w:t xml:space="preserve">Breusch, T. S., &amp; Pagan, A. R. (1979). A simple test for heteroscedasticity and random coefficient variation.</w:t>
+      </w:r>
+      <w:r>
+        <w:t xml:space="preserve"> </w:t>
+      </w:r>
+      <w:r>
+        <w:rPr>
+          <w:iCs/>
+          <w:i/>
+        </w:rPr>
+        <w:t xml:space="preserve">Econometrica, 47</w:t>
+      </w:r>
+      <w:r>
+        <w:t xml:space="preserve">(5), 1287–1294.</w:t>
+      </w:r>
+      <w:r>
+        <w:t xml:space="preserve"> </w:t>
+      </w:r>
+      <w:hyperlink r:id="rId261">
+        <w:r>
+          <w:rPr>
+            <w:rStyle w:val="Hyperlink"/>
+          </w:rPr>
+          <w:t xml:space="preserve">https://doi.org/10.2307/1911963</w:t>
+        </w:r>
+      </w:hyperlink>
+    </w:p>
+    <w:p>
+      <w:pPr>
+        <w:pStyle w:val="BodyText"/>
+      </w:pPr>
+      <w:r>
+        <w:t xml:space="preserve">Hair, J. F., Black, W. C., Babin, B. J., &amp; Anderson, R. E. (2019).</w:t>
+      </w:r>
+      <w:r>
+        <w:t xml:space="preserve"> </w:t>
+      </w:r>
+      <w:r>
+        <w:rPr>
+          <w:iCs/>
+          <w:i/>
+        </w:rPr>
+        <w:t xml:space="preserve">Multivariate data analysis</w:t>
+      </w:r>
+      <w:r>
+        <w:t xml:space="preserve"> </w:t>
+      </w:r>
+      <w:r>
+        <w:t xml:space="preserve">(8th ed.). Cengage.</w:t>
+      </w:r>
+    </w:p>
+    <w:p>
+      <w:pPr>
+        <w:pStyle w:val="BodyText"/>
+      </w:pPr>
+      <w:r>
+        <w:t xml:space="preserve">Higgins, J. P. T., Thompson, S. G., Deeks, J. J., &amp; Altman, D. G. (2003). Measuring inconsistency in meta-analyses.</w:t>
+      </w:r>
+      <w:r>
+        <w:t xml:space="preserve"> </w:t>
+      </w:r>
+      <w:r>
+        <w:rPr>
+          <w:iCs/>
+          <w:i/>
+        </w:rPr>
+        <w:t xml:space="preserve">BMJ, 327</w:t>
+      </w:r>
+      <w:r>
+        <w:t xml:space="preserve">(7414), 557–560.</w:t>
+      </w:r>
+      <w:r>
+        <w:t xml:space="preserve"> </w:t>
+      </w:r>
+      <w:hyperlink r:id="rId262">
+        <w:r>
+          <w:rPr>
+            <w:rStyle w:val="Hyperlink"/>
+          </w:rPr>
+          <w:t xml:space="preserve">https://doi.org/10.1136/bmj.327.7414.557</w:t>
+        </w:r>
+      </w:hyperlink>
+    </w:p>
+    <w:p>
+      <w:pPr>
+        <w:pStyle w:val="BodyText"/>
+      </w:pPr>
+      <w:r>
+        <w:t xml:space="preserve">Kaufmann, D., Kraay, A., &amp; Mastruzzi, M. (2011). The Worldwide Governance Indicators: Methodology and analytical issues.</w:t>
+      </w:r>
+      <w:r>
+        <w:t xml:space="preserve"> </w:t>
+      </w:r>
+      <w:r>
+        <w:rPr>
+          <w:iCs/>
+          <w:i/>
+        </w:rPr>
+        <w:t xml:space="preserve">Hague Journal on the Rule of Law, 3</w:t>
+      </w:r>
+      <w:r>
+        <w:t xml:space="preserve">(2), 220–246.</w:t>
+      </w:r>
+      <w:r>
+        <w:t xml:space="preserve"> </w:t>
+      </w:r>
+      <w:hyperlink r:id="rId263">
+        <w:r>
+          <w:rPr>
+            <w:rStyle w:val="Hyperlink"/>
+          </w:rPr>
+          <w:t xml:space="preserve">https://doi.org/10.1017/S1876404511200046</w:t>
+        </w:r>
+      </w:hyperlink>
+    </w:p>
+    <w:bookmarkEnd w:id="264"/>
+    <w:bookmarkStart w:id="268" w:name="lý-thuyết--bổ-sung-section-ac-mở-rộng"/>
+    <w:p>
+      <w:pPr>
+        <w:pStyle w:val="Heading3"/>
+      </w:pPr>
+      <w:r>
+        <w:t xml:space="preserve">Lý thuyết — bổ sung (Section A/C mở rộng)</w:t>
+      </w:r>
+    </w:p>
+    <w:p>
+      <w:pPr>
+        <w:pStyle w:val="FirstParagraph"/>
+      </w:pPr>
+      <w:r>
+        <w:t xml:space="preserve">Peng, M. W. (2003). Institutional transitions and strategic choices.</w:t>
+      </w:r>
+      <w:r>
+        <w:t xml:space="preserve"> </w:t>
+      </w:r>
+      <w:r>
+        <w:rPr>
+          <w:iCs/>
+          <w:i/>
+        </w:rPr>
+        <w:t xml:space="preserve">Academy of Management Review, 28</w:t>
+      </w:r>
+      <w:r>
+        <w:t xml:space="preserve">(2), 275–296.</w:t>
+      </w:r>
+      <w:r>
+        <w:t xml:space="preserve"> </w:t>
+      </w:r>
+      <w:hyperlink r:id="rId265">
+        <w:r>
+          <w:rPr>
+            <w:rStyle w:val="Hyperlink"/>
+          </w:rPr>
+          <w:t xml:space="preserve">https://doi.org/10.5465/amr.2003.9416341</w:t>
+        </w:r>
+      </w:hyperlink>
+    </w:p>
+    <w:p>
+      <w:pPr>
+        <w:pStyle w:val="BodyText"/>
+      </w:pPr>
+      <w:r>
+        <w:t xml:space="preserve">Teece, D. J. (1986). Profiting from technological innovation: Implications for integration, collaboration, licensing and public policy.</w:t>
+      </w:r>
+      <w:r>
+        <w:t xml:space="preserve"> </w:t>
+      </w:r>
+      <w:r>
+        <w:rPr>
+          <w:iCs/>
+          <w:i/>
+        </w:rPr>
+        <w:t xml:space="preserve">Research Policy, 15</w:t>
+      </w:r>
+      <w:r>
+        <w:t xml:space="preserve">(6), 285–305.</w:t>
+      </w:r>
+      <w:r>
+        <w:t xml:space="preserve"> </w:t>
+      </w:r>
+      <w:hyperlink r:id="rId266">
+        <w:r>
+          <w:rPr>
+            <w:rStyle w:val="Hyperlink"/>
+          </w:rPr>
+          <w:t xml:space="preserve">https://doi.org/10.1016/0048-7333(86)90027-2</w:t>
+        </w:r>
+      </w:hyperlink>
+      <w:r>
+        <w:t xml:space="preserve"> </w:t>
+      </w:r>
+      <w:r>
+        <w:t xml:space="preserve">Do, T. H., &amp; Phan, A. T. (2025). Internationalization and firm performance of firms in India: The role of top management. In M. Bartekova (Ed.),</w:t>
+      </w:r>
+      <w:r>
+        <w:t xml:space="preserve"> </w:t>
+      </w:r>
+      <w:r>
+        <w:rPr>
+          <w:iCs/>
+          <w:i/>
+        </w:rPr>
+        <w:t xml:space="preserve">International business research: Traditional and creative approaches</w:t>
+      </w:r>
+      <w:r>
+        <w:t xml:space="preserve">. IntechOpen.</w:t>
+      </w:r>
+      <w:r>
+        <w:t xml:space="preserve"> </w:t>
+      </w:r>
+      <w:hyperlink r:id="rId267">
+        <w:r>
+          <w:rPr>
+            <w:rStyle w:val="Hyperlink"/>
+          </w:rPr>
+          <w:t xml:space="preserve">https://doi.org/10.5772/intechopen.1011012</w:t>
+        </w:r>
+      </w:hyperlink>
+    </w:p>
+    <w:bookmarkEnd w:id="268"/>
+    <w:bookmarkEnd w:id="269"/>
+    <w:bookmarkEnd w:id="270"/>
+    <w:sectPr/>
   </w:body>
 </w:document>
 </file>
@@ -10439,59 +12057,29 @@
   <w:style w:default="1" w:styleId="Normal" w:type="paragraph">
     <w:name w:val="Normal"/>
     <w:qFormat/>
-    <w:pPr>
-      <w:spacing w:line="276" w:lineRule="auto"/>
-      <w:jc w:val="both"/>
-    </w:pPr>
-    <w:rPr>
-      <w:rFonts w:ascii="Times New Roman" w:eastAsia="Times New Roman" w:hAnsi="Times New Roman"/>
-      <w:color w:val="000000"/>
-      <w:sz w:val="24"/>
-    </w:rPr>
   </w:style>
   <w:style w:styleId="BodyText" w:type="paragraph">
     <w:name w:val="Body Text"/>
     <w:basedOn w:val="Normal"/>
     <w:link w:val="BodyTextChar"/>
     <w:pPr>
-      <w:spacing w:after="180" w:before="180" w:line="276" w:lineRule="auto"/>
-      <w:jc w:val="both"/>
+      <w:spacing w:after="180" w:before="180"/>
     </w:pPr>
     <w:qFormat/>
-    <w:rPr>
-      <w:rFonts w:ascii="Times New Roman" w:eastAsia="Times New Roman" w:hAnsi="Times New Roman"/>
-      <w:color w:val="000000"/>
-      <w:sz w:val="24"/>
-    </w:rPr>
   </w:style>
   <w:style w:customStyle="1" w:styleId="FirstParagraph" w:type="paragraph">
     <w:name w:val="First Paragraph"/>
     <w:basedOn w:val="BodyText"/>
     <w:next w:val="BodyText"/>
     <w:qFormat/>
-    <w:pPr>
-      <w:spacing w:line="276" w:lineRule="auto"/>
-      <w:jc w:val="both"/>
-    </w:pPr>
-    <w:rPr>
-      <w:rFonts w:ascii="Times New Roman" w:eastAsia="Times New Roman" w:hAnsi="Times New Roman"/>
-      <w:color w:val="000000"/>
-      <w:sz w:val="24"/>
-    </w:rPr>
   </w:style>
   <w:style w:customStyle="1" w:styleId="Compact" w:type="paragraph">
     <w:name w:val="Compact"/>
     <w:basedOn w:val="BodyText"/>
     <w:qFormat/>
     <w:pPr>
-      <w:spacing w:after="36" w:before="36" w:line="276" w:lineRule="auto"/>
-      <w:jc w:val="both"/>
+      <w:spacing w:after="36" w:before="36"/>
     </w:pPr>
-    <w:rPr>
-      <w:rFonts w:ascii="Times New Roman" w:eastAsia="Times New Roman" w:hAnsi="Times New Roman"/>
-      <w:color w:val="000000"/>
-      <w:sz w:val="24"/>
-    </w:rPr>
   </w:style>
   <w:style w:styleId="Title" w:type="paragraph">
     <w:name w:val="Title"/>
@@ -10501,15 +12089,15 @@
     <w:pPr>
       <w:keepNext/>
       <w:keepLines/>
-      <w:spacing w:after="240" w:before="480" w:line="276" w:lineRule="auto"/>
-      <w:jc w:val="both"/>
+      <w:spacing w:after="240" w:before="480"/>
+      <w:jc w:val="center"/>
     </w:pPr>
     <w:rPr>
-      <w:rFonts w:ascii="Times New Roman" w:asciiTheme="majorHAnsi" w:cstheme="majorBidi" w:eastAsia="Times New Roman" w:eastAsiaTheme="majorEastAsia" w:hAnsi="Times New Roman" w:hAnsiTheme="majorHAnsi"/>
+      <w:rFonts w:asciiTheme="majorHAnsi" w:cstheme="majorBidi" w:eastAsiaTheme="majorEastAsia" w:hAnsiTheme="majorHAnsi"/>
       <w:b/>
       <w:bCs/>
-      <w:color w:val="000000"/>
-      <w:sz w:val="24"/>
+      <w:color w:themeColor="accent1" w:themeShade="B5" w:val="345A8A"/>
+      <w:sz w:val="36"/>
       <w:szCs w:val="36"/>
     </w:rPr>
   </w:style>
@@ -10521,13 +12109,11 @@
     <w:pPr>
       <w:keepNext/>
       <w:keepLines/>
-      <w:spacing w:after="240" w:before="240" w:line="276" w:lineRule="auto"/>
-      <w:jc w:val="both"/>
+      <w:spacing w:after="240" w:before="240"/>
+      <w:jc w:val="center"/>
     </w:pPr>
     <w:rPr>
-      <w:rFonts w:ascii="Times New Roman" w:eastAsia="Times New Roman" w:hAnsi="Times New Roman"/>
-      <w:color w:val="000000"/>
-      <w:sz w:val="24"/>
+      <w:sz w:val="30"/>
       <w:szCs w:val="30"/>
     </w:rPr>
   </w:style>
@@ -10538,14 +12124,8 @@
     <w:pPr>
       <w:keepNext/>
       <w:keepLines/>
-      <w:spacing w:line="276" w:lineRule="auto"/>
-      <w:jc w:val="both"/>
+      <w:jc w:val="center"/>
     </w:pPr>
-    <w:rPr>
-      <w:rFonts w:ascii="Times New Roman" w:eastAsia="Times New Roman" w:hAnsi="Times New Roman"/>
-      <w:color w:val="000000"/>
-      <w:sz w:val="24"/>
-    </w:rPr>
   </w:style>
   <w:style w:styleId="Date" w:type="paragraph">
     <w:name w:val="Date"/>
@@ -10554,14 +12134,8 @@
     <w:pPr>
       <w:keepNext/>
       <w:keepLines/>
-      <w:spacing w:line="276" w:lineRule="auto"/>
-      <w:jc w:val="both"/>
+      <w:jc w:val="center"/>
     </w:pPr>
-    <w:rPr>
-      <w:rFonts w:ascii="Times New Roman" w:eastAsia="Times New Roman" w:hAnsi="Times New Roman"/>
-      <w:color w:val="000000"/>
-      <w:sz w:val="24"/>
-    </w:rPr>
   </w:style>
   <w:style w:customStyle="1" w:styleId="AbstractTitle" w:type="paragraph">
     <w:name w:val="Abstract Title"/>
@@ -10571,15 +12145,15 @@
     <w:pPr>
       <w:keepNext/>
       <w:keepLines/>
-      <w:jc w:val="both"/>
-      <w:spacing w:after="0" w:before="300" w:line="276" w:lineRule="auto"/>
+      <w:jc w:val="center"/>
+      <w:spacing w:after="0" w:before="300"/>
     </w:pPr>
     <w:rPr>
-      <w:color w:val="000000"/>
-      <w:sz w:val="24"/>
+      <w:sz w:val="20"/>
       <w:szCs w:val="20"/>
-      <w:rFonts w:ascii="Times New Roman" w:eastAsia="Times New Roman" w:hAnsi="Times New Roman"/>
       <w:b/>
+      <w:color w:val="345A8A"/>
+      &gt;
     </w:rPr>
   </w:style>
   <w:style w:customStyle="1" w:styleId="Abstract" w:type="paragraph">
@@ -10590,13 +12164,10 @@
     <w:pPr>
       <w:keepNext/>
       <w:keepLines/>
-      <w:spacing w:after="300" w:before="100" w:line="276" w:lineRule="auto"/>
-      <w:jc w:val="both"/>
+      <w:spacing w:after="300" w:before="100"/>
     </w:pPr>
     <w:rPr>
-      <w:rFonts w:ascii="Times New Roman" w:eastAsia="Times New Roman" w:hAnsi="Times New Roman"/>
-      <w:color w:val="000000"/>
-      <w:sz w:val="24"/>
+      <w:sz w:val="20"/>
       <w:szCs w:val="20"/>
     </w:rPr>
   </w:style>
@@ -10605,15 +12176,8 @@
     <w:basedOn w:val="Normal"/>
     <w:next w:val="Bibliography"/>
     <w:qFormat/>
-    <w:pPr>
-      <w:spacing w:line="276" w:lineRule="auto"/>
-      <w:jc w:val="both"/>
-    </w:pPr>
-    <w:rPr>
-      <w:rFonts w:ascii="Times New Roman" w:eastAsia="Times New Roman" w:hAnsi="Times New Roman"/>
-      <w:color w:val="000000"/>
-      <w:sz w:val="24"/>
-    </w:rPr>
+    <w:pPr/>
+    <w:rPr/>
   </w:style>
   <w:style w:styleId="Heading1" w:type="paragraph">
     <w:name w:val="Heading 1"/>
@@ -10624,16 +12188,15 @@
     <w:pPr>
       <w:keepNext/>
       <w:keepLines/>
-      <w:spacing w:after="0" w:before="480" w:line="276" w:lineRule="auto"/>
-      <w:jc w:val="both"/>
+      <w:spacing w:after="0" w:before="480"/>
       <w:outlineLvl w:val="0"/>
     </w:pPr>
     <w:rPr>
-      <w:rFonts w:ascii="Times New Roman" w:asciiTheme="majorHAnsi" w:cstheme="majorBidi" w:eastAsia="Times New Roman" w:eastAsiaTheme="majorEastAsia" w:hAnsi="Times New Roman" w:hAnsiTheme="majorHAnsi"/>
+      <w:rFonts w:asciiTheme="majorHAnsi" w:cstheme="majorBidi" w:eastAsiaTheme="majorEastAsia" w:hAnsiTheme="majorHAnsi"/>
       <w:b/>
       <w:bCs/>
-      <w:color w:val="000000"/>
-      <w:sz w:val="24"/>
+      <w:color w:themeColor="accent1" w:val="4F81BD"/>
+      <w:sz w:val="32"/>
       <w:szCs w:val="32"/>
     </w:rPr>
   </w:style>
@@ -10647,16 +12210,15 @@
     <w:pPr>
       <w:keepNext/>
       <w:keepLines/>
-      <w:spacing w:after="0" w:before="200" w:line="276" w:lineRule="auto"/>
-      <w:jc w:val="both"/>
+      <w:spacing w:after="0" w:before="200"/>
       <w:outlineLvl w:val="1"/>
     </w:pPr>
     <w:rPr>
-      <w:rFonts w:ascii="Times New Roman" w:asciiTheme="majorHAnsi" w:cstheme="majorBidi" w:eastAsia="Times New Roman" w:eastAsiaTheme="majorEastAsia" w:hAnsi="Times New Roman" w:hAnsiTheme="majorHAnsi"/>
+      <w:rFonts w:asciiTheme="majorHAnsi" w:cstheme="majorBidi" w:eastAsiaTheme="majorEastAsia" w:hAnsiTheme="majorHAnsi"/>
       <w:b/>
       <w:bCs/>
-      <w:color w:val="000000"/>
-      <w:sz w:val="24"/>
+      <w:color w:themeColor="accent1" w:val="4F81BD"/>
+      <w:sz w:val="28"/>
       <w:szCs w:val="28"/>
     </w:rPr>
   </w:style>
@@ -10670,15 +12232,14 @@
     <w:pPr>
       <w:keepNext/>
       <w:keepLines/>
-      <w:spacing w:after="0" w:before="200" w:line="276" w:lineRule="auto"/>
-      <w:jc w:val="both"/>
+      <w:spacing w:after="0" w:before="200"/>
       <w:outlineLvl w:val="2"/>
     </w:pPr>
     <w:rPr>
-      <w:rFonts w:ascii="Times New Roman" w:asciiTheme="majorHAnsi" w:cstheme="majorBidi" w:eastAsia="Times New Roman" w:eastAsiaTheme="majorEastAsia" w:hAnsi="Times New Roman" w:hAnsiTheme="majorHAnsi"/>
+      <w:rFonts w:asciiTheme="majorHAnsi" w:cstheme="majorBidi" w:eastAsiaTheme="majorEastAsia" w:hAnsiTheme="majorHAnsi"/>
       <w:b/>
       <w:bCs/>
-      <w:color w:val="000000"/>
+      <w:color w:themeColor="accent1" w:val="4F81BD"/>
       <w:sz w:val="24"/>
       <w:szCs w:val="24"/>
     </w:rPr>
@@ -10693,15 +12254,14 @@
     <w:pPr>
       <w:keepNext/>
       <w:keepLines/>
-      <w:spacing w:after="0" w:before="200" w:line="276" w:lineRule="auto"/>
-      <w:jc w:val="both"/>
+      <w:spacing w:after="0" w:before="200"/>
       <w:outlineLvl w:val="3"/>
     </w:pPr>
     <w:rPr>
-      <w:rFonts w:ascii="Times New Roman" w:asciiTheme="majorHAnsi" w:cstheme="majorBidi" w:eastAsia="Times New Roman" w:eastAsiaTheme="majorEastAsia" w:hAnsi="Times New Roman" w:hAnsiTheme="majorHAnsi"/>
+      <w:rFonts w:asciiTheme="majorHAnsi" w:cstheme="majorBidi" w:eastAsiaTheme="majorEastAsia" w:hAnsiTheme="majorHAnsi"/>
       <w:i/>
       <w:bCs/>
-      <w:color w:val="000000"/>
+      <w:color w:themeColor="accent1" w:val="4F81BD"/>
       <w:sz w:val="24"/>
       <w:szCs w:val="24"/>
     </w:rPr>
@@ -10716,14 +12276,13 @@
     <w:pPr>
       <w:keepNext/>
       <w:keepLines/>
-      <w:spacing w:after="0" w:before="200" w:line="276" w:lineRule="auto"/>
-      <w:jc w:val="both"/>
+      <w:spacing w:after="0" w:before="200"/>
       <w:outlineLvl w:val="4"/>
     </w:pPr>
     <w:rPr>
-      <w:rFonts w:ascii="Times New Roman" w:asciiTheme="majorHAnsi" w:cstheme="majorBidi" w:eastAsia="Times New Roman" w:eastAsiaTheme="majorEastAsia" w:hAnsi="Times New Roman" w:hAnsiTheme="majorHAnsi"/>
+      <w:rFonts w:asciiTheme="majorHAnsi" w:cstheme="majorBidi" w:eastAsiaTheme="majorEastAsia" w:hAnsiTheme="majorHAnsi"/>
       <w:iCs/>
-      <w:color w:val="000000"/>
+      <w:color w:themeColor="accent1" w:val="4F81BD"/>
       <w:sz w:val="24"/>
       <w:szCs w:val="24"/>
     </w:rPr>
@@ -10738,13 +12297,12 @@
     <w:pPr>
       <w:keepNext/>
       <w:keepLines/>
-      <w:spacing w:after="0" w:before="200" w:line="276" w:lineRule="auto"/>
-      <w:jc w:val="both"/>
+      <w:spacing w:after="0" w:before="200"/>
       <w:outlineLvl w:val="5"/>
     </w:pPr>
     <w:rPr>
-      <w:rFonts w:ascii="Times New Roman" w:asciiTheme="majorHAnsi" w:cstheme="majorBidi" w:eastAsia="Times New Roman" w:eastAsiaTheme="majorEastAsia" w:hAnsi="Times New Roman" w:hAnsiTheme="majorHAnsi"/>
-      <w:color w:val="000000"/>
+      <w:rFonts w:asciiTheme="majorHAnsi" w:cstheme="majorBidi" w:eastAsiaTheme="majorEastAsia" w:hAnsiTheme="majorHAnsi"/>
+      <w:color w:themeColor="accent1" w:val="4F81BD"/>
       <w:sz w:val="24"/>
       <w:szCs w:val="24"/>
     </w:rPr>
@@ -10759,13 +12317,12 @@
     <w:pPr>
       <w:keepNext/>
       <w:keepLines/>
-      <w:spacing w:after="0" w:before="200" w:line="276" w:lineRule="auto"/>
-      <w:jc w:val="both"/>
+      <w:spacing w:after="0" w:before="200"/>
       <w:outlineLvl w:val="6"/>
     </w:pPr>
     <w:rPr>
-      <w:rFonts w:ascii="Times New Roman" w:asciiTheme="majorHAnsi" w:cstheme="majorBidi" w:eastAsia="Times New Roman" w:eastAsiaTheme="majorEastAsia" w:hAnsi="Times New Roman" w:hAnsiTheme="majorHAnsi"/>
-      <w:color w:val="000000"/>
+      <w:rFonts w:asciiTheme="majorHAnsi" w:cstheme="majorBidi" w:eastAsiaTheme="majorEastAsia" w:hAnsiTheme="majorHAnsi"/>
+      <w:color w:themeColor="accent1" w:val="4F81BD"/>
       <w:sz w:val="24"/>
       <w:szCs w:val="24"/>
     </w:rPr>
@@ -10780,13 +12337,12 @@
     <w:pPr>
       <w:keepNext/>
       <w:keepLines/>
-      <w:spacing w:after="0" w:before="200" w:line="276" w:lineRule="auto"/>
-      <w:jc w:val="both"/>
+      <w:spacing w:after="0" w:before="200"/>
       <w:outlineLvl w:val="7"/>
     </w:pPr>
     <w:rPr>
-      <w:rFonts w:ascii="Times New Roman" w:asciiTheme="majorHAnsi" w:cstheme="majorBidi" w:eastAsia="Times New Roman" w:eastAsiaTheme="majorEastAsia" w:hAnsi="Times New Roman" w:hAnsiTheme="majorHAnsi"/>
-      <w:color w:val="000000"/>
+      <w:rFonts w:asciiTheme="majorHAnsi" w:cstheme="majorBidi" w:eastAsiaTheme="majorEastAsia" w:hAnsiTheme="majorHAnsi"/>
+      <w:color w:themeColor="accent1" w:val="4F81BD"/>
       <w:sz w:val="24"/>
       <w:szCs w:val="24"/>
     </w:rPr>
@@ -10801,13 +12357,12 @@
     <w:pPr>
       <w:keepNext/>
       <w:keepLines/>
-      <w:spacing w:after="0" w:before="200" w:line="276" w:lineRule="auto"/>
-      <w:jc w:val="both"/>
+      <w:spacing w:after="0" w:before="200"/>
       <w:outlineLvl w:val="8"/>
     </w:pPr>
     <w:rPr>
-      <w:rFonts w:ascii="Times New Roman" w:asciiTheme="majorHAnsi" w:cstheme="majorBidi" w:eastAsia="Times New Roman" w:eastAsiaTheme="majorEastAsia" w:hAnsi="Times New Roman" w:hAnsiTheme="majorHAnsi"/>
-      <w:color w:val="000000"/>
+      <w:rFonts w:asciiTheme="majorHAnsi" w:cstheme="majorBidi" w:eastAsiaTheme="majorEastAsia" w:hAnsiTheme="majorHAnsi"/>
+      <w:color w:themeColor="accent1" w:val="4F81BD"/>
       <w:sz w:val="24"/>
       <w:szCs w:val="24"/>
     </w:rPr>
@@ -10820,15 +12375,9 @@
     <w:unhideWhenUsed/>
     <w:qFormat/>
     <w:pPr>
-      <w:spacing w:after="100" w:before="100" w:line="276" w:lineRule="auto"/>
+      <w:spacing w:after="100" w:before="100"/>
       <w:ind w:firstLine="0" w:left="480" w:right="480"/>
-      <w:jc w:val="both"/>
     </w:pPr>
-    <w:rPr>
-      <w:rFonts w:ascii="Times New Roman" w:eastAsia="Times New Roman" w:hAnsi="Times New Roman"/>
-      <w:color w:val="000000"/>
-      <w:sz w:val="24"/>
-    </w:rPr>
   </w:style>
   <w:style w:styleId="FootnoteText" w:type="paragraph">
     <w:name w:val="Footnote Text"/>
@@ -10837,25 +12386,11 @@
     <w:uiPriority w:val="9"/>
     <w:unhideWhenUsed/>
     <w:qFormat/>
-    <w:pPr>
-      <w:spacing w:line="276" w:lineRule="auto"/>
-      <w:jc w:val="both"/>
-    </w:pPr>
-    <w:rPr>
-      <w:rFonts w:ascii="Times New Roman" w:eastAsia="Times New Roman" w:hAnsi="Times New Roman"/>
-      <w:color w:val="000000"/>
-      <w:sz w:val="24"/>
-    </w:rPr>
   </w:style>
   <w:style w:default="1" w:styleId="DefaultParagraphFont" w:type="character">
     <w:name w:val="Default Paragraph Font"/>
     <w:semiHidden/>
     <w:unhideWhenUsed/>
-    <w:rPr>
-      <w:rFonts w:ascii="Times New Roman" w:eastAsia="Times New Roman" w:hAnsi="Times New Roman"/>
-      <w:color w:val="000000"/>
-      <w:sz w:val="24"/>
-    </w:rPr>
   </w:style>
   <w:style w:default="1" w:styleId="Table" w:type="table">
     <w:name w:val="Table"/>
@@ -10863,15 +12398,6 @@
     <w:semiHidden/>
     <w:unhideWhenUsed/>
     <w:qFormat/>
-    <w:pPr>
-      <w:spacing w:line="276" w:lineRule="auto"/>
-      <w:jc w:val="both"/>
-    </w:pPr>
-    <w:rPr>
-      <w:rFonts w:ascii="Times New Roman" w:eastAsia="Times New Roman" w:hAnsi="Times New Roman"/>
-      <w:color w:val="000000"/>
-      <w:sz w:val="24"/>
-    </w:rPr>
     <w:tblPr>
       <w:tblInd w:type="dxa" w:w="0"/>
       <w:tblCellMar>
@@ -10904,42 +12430,25 @@
     <w:pPr>
       <w:keepNext/>
       <w:keepLines/>
-      <w:spacing w:after="0" w:line="276" w:lineRule="auto"/>
-      <w:jc w:val="both"/>
+      <w:spacing w:after="0"/>
     </w:pPr>
     <w:rPr>
-      <w:rFonts w:ascii="Times New Roman" w:eastAsia="Times New Roman" w:hAnsi="Times New Roman"/>
       <w:b/>
-      <w:color w:val="000000"/>
-      <w:sz w:val="24"/>
     </w:rPr>
   </w:style>
   <w:style w:customStyle="1" w:styleId="Definition" w:type="paragraph">
     <w:name w:val="Definition"/>
     <w:basedOn w:val="Normal"/>
-    <w:pPr>
-      <w:spacing w:line="276" w:lineRule="auto"/>
-      <w:jc w:val="both"/>
-    </w:pPr>
-    <w:rPr>
-      <w:rFonts w:ascii="Times New Roman" w:eastAsia="Times New Roman" w:hAnsi="Times New Roman"/>
-      <w:color w:val="000000"/>
-      <w:sz w:val="24"/>
-    </w:rPr>
   </w:style>
   <w:style w:styleId="Caption" w:type="paragraph">
     <w:name w:val="Caption"/>
     <w:basedOn w:val="Normal"/>
     <w:link w:val="BodyTextChar"/>
     <w:pPr>
-      <w:spacing w:after="120" w:before="0" w:line="276" w:lineRule="auto"/>
-      <w:jc w:val="both"/>
+      <w:spacing w:after="120" w:before="0"/>
     </w:pPr>
     <w:rPr>
-      <w:rFonts w:ascii="Times New Roman" w:eastAsia="Times New Roman" w:hAnsi="Times New Roman"/>
       <w:i/>
-      <w:color w:val="000000"/>
-      <w:sz w:val="24"/>
     </w:rPr>
   </w:style>
   <w:style w:customStyle="1" w:styleId="TableCaption" w:type="paragraph">
@@ -10947,90 +12456,44 @@
     <w:basedOn w:val="Caption"/>
     <w:pPr>
       <w:keepNext/>
-      <w:spacing w:line="276" w:lineRule="auto"/>
-      <w:jc w:val="both"/>
     </w:pPr>
-    <w:rPr>
-      <w:rFonts w:ascii="Times New Roman" w:eastAsia="Times New Roman" w:hAnsi="Times New Roman"/>
-      <w:color w:val="000000"/>
-      <w:sz w:val="24"/>
-    </w:rPr>
   </w:style>
   <w:style w:customStyle="1" w:styleId="ImageCaption" w:type="paragraph">
     <w:name w:val="Image Caption"/>
     <w:basedOn w:val="Caption"/>
-    <w:pPr>
-      <w:spacing w:line="276" w:lineRule="auto"/>
-      <w:jc w:val="both"/>
-    </w:pPr>
-    <w:rPr>
-      <w:rFonts w:ascii="Times New Roman" w:eastAsia="Times New Roman" w:hAnsi="Times New Roman"/>
-      <w:color w:val="000000"/>
-      <w:sz w:val="24"/>
-    </w:rPr>
   </w:style>
   <w:style w:customStyle="1" w:styleId="Figure" w:type="paragraph">
     <w:name w:val="Figure"/>
     <w:basedOn w:val="Normal"/>
-    <w:pPr>
-      <w:spacing w:line="276" w:lineRule="auto"/>
-      <w:jc w:val="both"/>
-    </w:pPr>
-    <w:rPr>
-      <w:rFonts w:ascii="Times New Roman" w:eastAsia="Times New Roman" w:hAnsi="Times New Roman"/>
-      <w:color w:val="000000"/>
-      <w:sz w:val="24"/>
-    </w:rPr>
   </w:style>
   <w:style w:customStyle="1" w:styleId="CaptionedFigure" w:type="paragraph">
     <w:name w:val="Captioned Figure"/>
     <w:basedOn w:val="Figure"/>
     <w:pPr>
       <w:keepNext/>
-      <w:spacing w:line="276" w:lineRule="auto"/>
-      <w:jc w:val="both"/>
     </w:pPr>
-    <w:rPr>
-      <w:rFonts w:ascii="Times New Roman" w:eastAsia="Times New Roman" w:hAnsi="Times New Roman"/>
-      <w:color w:val="000000"/>
-      <w:sz w:val="24"/>
-    </w:rPr>
   </w:style>
   <w:style w:customStyle="1" w:styleId="BodyTextChar" w:type="character">
     <w:name w:val="Body Text Char"/>
     <w:basedOn w:val="DefaultParagraphFont"/>
     <w:link w:val="BodyText"/>
-    <w:rPr>
-      <w:rFonts w:ascii="Times New Roman" w:eastAsia="Times New Roman" w:hAnsi="Times New Roman"/>
-      <w:color w:val="000000"/>
-      <w:sz w:val="24"/>
-    </w:rPr>
   </w:style>
   <w:style w:customStyle="1" w:styleId="VerbatimChar" w:type="character">
     <w:name w:val="Verbatim Char"/>
     <w:basedOn w:val="BodyTextChar"/>
     <w:rPr>
-      <w:rFonts w:ascii="Times New Roman" w:eastAsia="Times New Roman" w:hAnsi="Times New Roman"/>
-      <w:color w:val="000000"/>
-      <w:sz w:val="24"/>
+      <w:rFonts w:ascii="Consolas" w:hAnsi="Consolas"/>
+      <w:sz w:val="22"/>
     </w:rPr>
   </w:style>
   <w:style w:customStyle="1" w:styleId="SectionNumber" w:type="character">
     <w:name w:val="Section Number"/>
     <w:basedOn w:val="BodyTextChar"/>
-    <w:rPr>
-      <w:rFonts w:ascii="Times New Roman" w:eastAsia="Times New Roman" w:hAnsi="Times New Roman"/>
-      <w:color w:val="000000"/>
-      <w:sz w:val="24"/>
-    </w:rPr>
   </w:style>
   <w:style w:styleId="FootnoteReference" w:type="character">
     <w:name w:val="Footnote Reference"/>
     <w:basedOn w:val="BodyTextChar"/>
     <w:rPr>
-      <w:rFonts w:ascii="Times New Roman" w:eastAsia="Times New Roman" w:hAnsi="Times New Roman"/>
-      <w:color w:val="000000"/>
-      <w:sz w:val="24"/>
       <w:vertAlign w:val="superscript"/>
     </w:rPr>
   </w:style>
@@ -11038,9 +12501,7 @@
     <w:name w:val="Hyperlink"/>
     <w:basedOn w:val="BodyTextChar"/>
     <w:rPr>
-      <w:rFonts w:ascii="Times New Roman" w:eastAsia="Times New Roman" w:hAnsi="Times New Roman"/>
-      <w:color w:val="000000"/>
-      <w:sz w:val="24"/>
+      <w:color w:themeColor="accent1" w:val="4F81BD"/>
     </w:rPr>
   </w:style>
   <w:style w:styleId="TOCHeading" w:type="paragraph">
@@ -11051,16 +12512,14 @@
     <w:unhideWhenUsed/>
     <w:qFormat/>
     <w:pPr>
-      <w:spacing w:before="240" w:line="276" w:lineRule="auto"/>
-      <w:jc w:val="both"/>
+      <w:spacing w:before="240" w:line="259" w:lineRule="auto"/>
       <w:outlineLvl w:val="9"/>
     </w:pPr>
     <w:rPr>
-      <w:rFonts w:ascii="Times New Roman" w:asciiTheme="majorHAnsi" w:cstheme="majorBidi" w:eastAsia="Times New Roman" w:eastAsiaTheme="majorEastAsia" w:hAnsi="Times New Roman" w:hAnsiTheme="majorHAnsi"/>
+      <w:rFonts w:asciiTheme="majorHAnsi" w:cstheme="majorBidi" w:eastAsiaTheme="majorEastAsia" w:hAnsiTheme="majorHAnsi"/>
       <w:b w:val="0"/>
       <w:bCs w:val="0"/>
-      <w:color w:val="000000"/>
-      <w:sz w:val="24"/>
+      <w:color w:themeColor="accent1" w:themeShade="BF" w:val="365F91"/>
     </w:rPr>
   </w:style>
   <w:style w:type="paragraph" w:customStyle="1" w:styleId="SourceCode">

</xml_diff>

<commit_message>
feat(P9): finalize MIR package — propagate empirical results into metadata, copy figures; drop orphan blinded ref from dissertation
</commit_message>
<xml_diff>
--- a/dist/luan_an/04_references_apa7.docx
+++ b/dist/luan_an/04_references_apa7.docx
@@ -3664,37 +3664,6 @@
           <w:i/>
         </w:rPr>
         <w:t xml:space="preserve">Các entry dưới đây được thêm để giải quyết 85 warnings từ format-apa7.py. DOIs đã verify từ bản thảo gốc.</w:t>
-      </w:r>
-    </w:p>
-    <w:p>
-      <w:pPr>
-        <w:pStyle w:val="BodyText"/>
-      </w:pPr>
-      <w:r>
-        <w:t xml:space="preserve">Author, C., &amp; Author, C. B. (2026). Self-citation blinded for anonymous peer review.</w:t>
-      </w:r>
-      <w:r>
-        <w:t xml:space="preserve"> </w:t>
-      </w:r>
-      <w:r>
-        <w:rPr>
-          <w:iCs/>
-          <w:i/>
-        </w:rPr>
-        <w:t xml:space="preserve">Management International Review, under review</w:t>
-      </w:r>
-      <w:r>
-        <w:t xml:space="preserve">.</w:t>
-      </w:r>
-      <w:r>
-        <w:t xml:space="preserve"> </w:t>
-      </w:r>
-      <w:r>
-        <w:rPr>
-          <w:iCs/>
-          <w:i/>
-        </w:rPr>
-        <w:t xml:space="preserve">(Placeholder — replace with real P4 Singapore citation after review decision.)</w:t>
       </w:r>
     </w:p>
     <w:p>

</xml_diff>